<commit_message>
Avance en puntos de funcion Mayo 19 (Incompleto)
</commit_message>
<xml_diff>
--- a/Proyecto Final (Version Final).docx
+++ b/Proyecto Final (Version Final).docx
@@ -1008,7 +1008,7 @@
         <mc:AlternateContent>
           <mc:Choice Requires="wps">
             <w:drawing>
-              <wp:anchor distT="0" distB="0" distL="114300" distR="114300" simplePos="0" relativeHeight="251658261" behindDoc="1" locked="0" layoutInCell="1" allowOverlap="1" wp14:anchorId="3EC9A2B3" wp14:editId="34E6F85A">
+              <wp:anchor distT="0" distB="0" distL="114300" distR="114300" simplePos="0" relativeHeight="251658260" behindDoc="1" locked="0" layoutInCell="1" allowOverlap="1" wp14:anchorId="3EC9A2B3" wp14:editId="34E6F85A">
                 <wp:simplePos x="0" y="0"/>
                 <wp:positionH relativeFrom="column">
                   <wp:posOffset>-238887</wp:posOffset>
@@ -1135,14 +1135,12 @@
             <w:rPr>
               <w:rFonts w:eastAsiaTheme="minorEastAsia"/>
               <w:b w:val="0"/>
-              <w:bCs w:val="0"/>
               <w:caps w:val="0"/>
-              <w:noProof/>
               <w:kern w:val="2"/>
               <w:sz w:val="24"/>
               <w:szCs w:val="24"/>
               <w:u w:val="none"/>
-              <w:lang w:val="en-MX"/>
+              <w:lang/>
             </w:rPr>
           </w:pPr>
           <w:r>
@@ -1230,13 +1228,11 @@
             <w:rPr>
               <w:rFonts w:eastAsiaTheme="minorEastAsia"/>
               <w:b w:val="0"/>
-              <w:bCs w:val="0"/>
               <w:smallCaps w:val="0"/>
-              <w:noProof/>
               <w:kern w:val="2"/>
               <w:sz w:val="24"/>
               <w:szCs w:val="24"/>
-              <w:lang w:val="en-MX"/>
+              <w:lang/>
             </w:rPr>
           </w:pPr>
           <w:hyperlink w:anchor="_Toc229638652" w:history="1">
@@ -1306,13 +1302,11 @@
             <w:rPr>
               <w:rFonts w:eastAsiaTheme="minorEastAsia"/>
               <w:b w:val="0"/>
-              <w:bCs w:val="0"/>
               <w:smallCaps w:val="0"/>
-              <w:noProof/>
               <w:kern w:val="2"/>
               <w:sz w:val="24"/>
               <w:szCs w:val="24"/>
-              <w:lang w:val="en-MX"/>
+              <w:lang/>
             </w:rPr>
           </w:pPr>
           <w:hyperlink w:anchor="_Toc229638653" w:history="1">
@@ -1382,13 +1376,11 @@
             <w:rPr>
               <w:rFonts w:eastAsiaTheme="minorEastAsia"/>
               <w:b w:val="0"/>
-              <w:bCs w:val="0"/>
               <w:smallCaps w:val="0"/>
-              <w:noProof/>
               <w:kern w:val="2"/>
               <w:sz w:val="24"/>
               <w:szCs w:val="24"/>
-              <w:lang w:val="en-MX"/>
+              <w:lang/>
             </w:rPr>
           </w:pPr>
           <w:hyperlink w:anchor="_Toc229638654" w:history="1">
@@ -1458,13 +1450,11 @@
             <w:rPr>
               <w:rFonts w:eastAsiaTheme="minorEastAsia"/>
               <w:b w:val="0"/>
-              <w:bCs w:val="0"/>
               <w:smallCaps w:val="0"/>
-              <w:noProof/>
               <w:kern w:val="2"/>
               <w:sz w:val="24"/>
               <w:szCs w:val="24"/>
-              <w:lang w:val="en-MX"/>
+              <w:lang/>
             </w:rPr>
           </w:pPr>
           <w:hyperlink w:anchor="_Toc229638655" w:history="1">
@@ -1534,14 +1524,12 @@
             <w:rPr>
               <w:rFonts w:eastAsiaTheme="minorEastAsia"/>
               <w:b w:val="0"/>
-              <w:bCs w:val="0"/>
               <w:caps w:val="0"/>
-              <w:noProof/>
               <w:kern w:val="2"/>
               <w:sz w:val="24"/>
               <w:szCs w:val="24"/>
               <w:u w:val="none"/>
-              <w:lang w:val="en-MX"/>
+              <w:lang/>
             </w:rPr>
           </w:pPr>
           <w:hyperlink w:anchor="_Toc229638656" w:history="1">
@@ -1611,13 +1599,11 @@
             <w:rPr>
               <w:rFonts w:eastAsiaTheme="minorEastAsia"/>
               <w:b w:val="0"/>
-              <w:bCs w:val="0"/>
               <w:smallCaps w:val="0"/>
-              <w:noProof/>
               <w:kern w:val="2"/>
               <w:sz w:val="24"/>
               <w:szCs w:val="24"/>
-              <w:lang w:val="en-MX"/>
+              <w:lang/>
             </w:rPr>
           </w:pPr>
           <w:hyperlink w:anchor="_Toc229638657" w:history="1">
@@ -1687,13 +1673,11 @@
             <w:rPr>
               <w:rFonts w:eastAsiaTheme="minorEastAsia"/>
               <w:b w:val="0"/>
-              <w:bCs w:val="0"/>
               <w:smallCaps w:val="0"/>
-              <w:noProof/>
               <w:kern w:val="2"/>
               <w:sz w:val="24"/>
               <w:szCs w:val="24"/>
-              <w:lang w:val="en-MX"/>
+              <w:lang/>
             </w:rPr>
           </w:pPr>
           <w:hyperlink w:anchor="_Toc229638658" w:history="1">
@@ -1763,13 +1747,11 @@
             <w:rPr>
               <w:rFonts w:eastAsiaTheme="minorEastAsia"/>
               <w:b w:val="0"/>
-              <w:bCs w:val="0"/>
               <w:smallCaps w:val="0"/>
-              <w:noProof/>
               <w:kern w:val="2"/>
               <w:sz w:val="24"/>
               <w:szCs w:val="24"/>
-              <w:lang w:val="en-MX"/>
+              <w:lang/>
             </w:rPr>
           </w:pPr>
           <w:hyperlink w:anchor="_Toc229638659" w:history="1">
@@ -1839,13 +1821,11 @@
             <w:rPr>
               <w:rFonts w:eastAsiaTheme="minorEastAsia"/>
               <w:b w:val="0"/>
-              <w:bCs w:val="0"/>
               <w:smallCaps w:val="0"/>
-              <w:noProof/>
               <w:kern w:val="2"/>
               <w:sz w:val="24"/>
               <w:szCs w:val="24"/>
-              <w:lang w:val="en-MX"/>
+              <w:lang/>
             </w:rPr>
           </w:pPr>
           <w:hyperlink w:anchor="_Toc229638660" w:history="1">
@@ -1915,14 +1895,12 @@
             <w:rPr>
               <w:rFonts w:eastAsiaTheme="minorEastAsia"/>
               <w:b w:val="0"/>
-              <w:bCs w:val="0"/>
               <w:caps w:val="0"/>
-              <w:noProof/>
               <w:kern w:val="2"/>
               <w:sz w:val="24"/>
               <w:szCs w:val="24"/>
               <w:u w:val="none"/>
-              <w:lang w:val="en-MX"/>
+              <w:lang/>
             </w:rPr>
           </w:pPr>
           <w:hyperlink w:anchor="_Toc229638661" w:history="1">
@@ -1992,13 +1970,11 @@
             <w:rPr>
               <w:rFonts w:eastAsiaTheme="minorEastAsia"/>
               <w:b w:val="0"/>
-              <w:bCs w:val="0"/>
               <w:smallCaps w:val="0"/>
-              <w:noProof/>
               <w:kern w:val="2"/>
               <w:sz w:val="24"/>
               <w:szCs w:val="24"/>
-              <w:lang w:val="en-MX"/>
+              <w:lang/>
             </w:rPr>
           </w:pPr>
           <w:hyperlink w:anchor="_Toc229638662" w:history="1">
@@ -2068,13 +2044,11 @@
             <w:rPr>
               <w:rFonts w:eastAsiaTheme="minorEastAsia"/>
               <w:b w:val="0"/>
-              <w:bCs w:val="0"/>
               <w:smallCaps w:val="0"/>
-              <w:noProof/>
               <w:kern w:val="2"/>
               <w:sz w:val="24"/>
               <w:szCs w:val="24"/>
-              <w:lang w:val="en-MX"/>
+              <w:lang/>
             </w:rPr>
           </w:pPr>
           <w:hyperlink w:anchor="_Toc229638663" w:history="1">
@@ -2144,13 +2118,11 @@
             <w:rPr>
               <w:rFonts w:eastAsiaTheme="minorEastAsia"/>
               <w:b w:val="0"/>
-              <w:bCs w:val="0"/>
               <w:smallCaps w:val="0"/>
-              <w:noProof/>
               <w:kern w:val="2"/>
               <w:sz w:val="24"/>
               <w:szCs w:val="24"/>
-              <w:lang w:val="en-MX"/>
+              <w:lang/>
             </w:rPr>
           </w:pPr>
           <w:hyperlink w:anchor="_Toc229638664" w:history="1">
@@ -2220,14 +2192,12 @@
             <w:rPr>
               <w:rFonts w:eastAsiaTheme="minorEastAsia"/>
               <w:b w:val="0"/>
-              <w:bCs w:val="0"/>
               <w:caps w:val="0"/>
-              <w:noProof/>
               <w:kern w:val="2"/>
               <w:sz w:val="24"/>
               <w:szCs w:val="24"/>
               <w:u w:val="none"/>
-              <w:lang w:val="en-MX"/>
+              <w:lang/>
             </w:rPr>
           </w:pPr>
           <w:hyperlink w:anchor="_Toc229638665" w:history="1">
@@ -2297,13 +2267,11 @@
             <w:rPr>
               <w:rFonts w:eastAsiaTheme="minorEastAsia"/>
               <w:b w:val="0"/>
-              <w:bCs w:val="0"/>
               <w:smallCaps w:val="0"/>
-              <w:noProof/>
               <w:kern w:val="2"/>
               <w:sz w:val="24"/>
               <w:szCs w:val="24"/>
-              <w:lang w:val="en-MX"/>
+              <w:lang/>
             </w:rPr>
           </w:pPr>
           <w:hyperlink w:anchor="_Toc229638666" w:history="1">
@@ -2373,13 +2341,11 @@
             <w:rPr>
               <w:rFonts w:eastAsiaTheme="minorEastAsia"/>
               <w:b w:val="0"/>
-              <w:bCs w:val="0"/>
               <w:smallCaps w:val="0"/>
-              <w:noProof/>
               <w:kern w:val="2"/>
               <w:sz w:val="24"/>
               <w:szCs w:val="24"/>
-              <w:lang w:val="en-MX"/>
+              <w:lang/>
             </w:rPr>
           </w:pPr>
           <w:hyperlink w:anchor="_Toc229638667" w:history="1">
@@ -2449,13 +2415,11 @@
             <w:rPr>
               <w:rFonts w:eastAsiaTheme="minorEastAsia"/>
               <w:b w:val="0"/>
-              <w:bCs w:val="0"/>
               <w:smallCaps w:val="0"/>
-              <w:noProof/>
               <w:kern w:val="2"/>
               <w:sz w:val="24"/>
               <w:szCs w:val="24"/>
-              <w:lang w:val="en-MX"/>
+              <w:lang/>
             </w:rPr>
           </w:pPr>
           <w:hyperlink w:anchor="_Toc229638668" w:history="1">
@@ -2525,14 +2489,12 @@
             <w:rPr>
               <w:rFonts w:eastAsiaTheme="minorEastAsia"/>
               <w:b w:val="0"/>
-              <w:bCs w:val="0"/>
               <w:caps w:val="0"/>
-              <w:noProof/>
               <w:kern w:val="2"/>
               <w:sz w:val="24"/>
               <w:szCs w:val="24"/>
               <w:u w:val="none"/>
-              <w:lang w:val="en-MX"/>
+              <w:lang/>
             </w:rPr>
           </w:pPr>
           <w:hyperlink w:anchor="_Toc229638669" w:history="1">
@@ -2602,13 +2564,11 @@
             <w:rPr>
               <w:rFonts w:eastAsiaTheme="minorEastAsia"/>
               <w:b w:val="0"/>
-              <w:bCs w:val="0"/>
               <w:smallCaps w:val="0"/>
-              <w:noProof/>
               <w:kern w:val="2"/>
               <w:sz w:val="24"/>
               <w:szCs w:val="24"/>
-              <w:lang w:val="en-MX"/>
+              <w:lang/>
             </w:rPr>
           </w:pPr>
           <w:hyperlink w:anchor="_Toc229638670" w:history="1">
@@ -2678,14 +2638,12 @@
             <w:rPr>
               <w:rFonts w:eastAsiaTheme="minorEastAsia"/>
               <w:b w:val="0"/>
-              <w:bCs w:val="0"/>
               <w:caps w:val="0"/>
-              <w:noProof/>
               <w:kern w:val="2"/>
               <w:sz w:val="24"/>
               <w:szCs w:val="24"/>
               <w:u w:val="none"/>
-              <w:lang w:val="en-MX"/>
+              <w:lang/>
             </w:rPr>
           </w:pPr>
           <w:hyperlink w:anchor="_Toc229638671" w:history="1">
@@ -2755,13 +2713,11 @@
             <w:rPr>
               <w:rFonts w:eastAsiaTheme="minorEastAsia"/>
               <w:b w:val="0"/>
-              <w:bCs w:val="0"/>
               <w:smallCaps w:val="0"/>
-              <w:noProof/>
               <w:kern w:val="2"/>
               <w:sz w:val="24"/>
               <w:szCs w:val="24"/>
-              <w:lang w:val="en-MX"/>
+              <w:lang/>
             </w:rPr>
           </w:pPr>
           <w:hyperlink w:anchor="_Toc229638672" w:history="1">
@@ -2831,13 +2787,11 @@
             <w:rPr>
               <w:rFonts w:eastAsiaTheme="minorEastAsia"/>
               <w:b w:val="0"/>
-              <w:bCs w:val="0"/>
               <w:smallCaps w:val="0"/>
-              <w:noProof/>
               <w:kern w:val="2"/>
               <w:sz w:val="24"/>
               <w:szCs w:val="24"/>
-              <w:lang w:val="en-MX"/>
+              <w:lang/>
             </w:rPr>
           </w:pPr>
           <w:hyperlink w:anchor="_Toc229638673" w:history="1">
@@ -2907,13 +2861,11 @@
             <w:rPr>
               <w:rFonts w:eastAsiaTheme="minorEastAsia"/>
               <w:b w:val="0"/>
-              <w:bCs w:val="0"/>
               <w:smallCaps w:val="0"/>
-              <w:noProof/>
               <w:kern w:val="2"/>
               <w:sz w:val="24"/>
               <w:szCs w:val="24"/>
-              <w:lang w:val="en-MX"/>
+              <w:lang/>
             </w:rPr>
           </w:pPr>
           <w:hyperlink w:anchor="_Toc229638674" w:history="1">
@@ -2983,14 +2935,12 @@
             <w:rPr>
               <w:rFonts w:eastAsiaTheme="minorEastAsia"/>
               <w:b w:val="0"/>
-              <w:bCs w:val="0"/>
               <w:caps w:val="0"/>
-              <w:noProof/>
               <w:kern w:val="2"/>
               <w:sz w:val="24"/>
               <w:szCs w:val="24"/>
               <w:u w:val="none"/>
-              <w:lang w:val="en-MX"/>
+              <w:lang/>
             </w:rPr>
           </w:pPr>
           <w:hyperlink w:anchor="_Toc229638675" w:history="1">
@@ -3099,7 +3049,7 @@
         <mc:AlternateContent>
           <mc:Choice Requires="wps">
             <w:drawing>
-              <wp:anchor distT="0" distB="0" distL="114300" distR="114300" simplePos="0" relativeHeight="251658249" behindDoc="0" locked="0" layoutInCell="1" allowOverlap="1" wp14:anchorId="10882B87" wp14:editId="62A4553F">
+              <wp:anchor distT="0" distB="0" distL="114300" distR="114300" simplePos="0" relativeHeight="251658248" behindDoc="0" locked="0" layoutInCell="1" allowOverlap="1" wp14:anchorId="10882B87" wp14:editId="62A4553F">
                 <wp:simplePos x="0" y="0"/>
                 <wp:positionH relativeFrom="column">
                   <wp:posOffset>-1066800</wp:posOffset>
@@ -3187,7 +3137,7 @@
         <mc:AlternateContent>
           <mc:Choice Requires="wps">
             <w:drawing>
-              <wp:anchor distT="0" distB="0" distL="114300" distR="114300" simplePos="0" relativeHeight="251658250" behindDoc="0" locked="0" layoutInCell="1" allowOverlap="1" wp14:anchorId="21261F5C" wp14:editId="567038D5">
+              <wp:anchor distT="0" distB="0" distL="114300" distR="114300" simplePos="0" relativeHeight="251658249" behindDoc="0" locked="0" layoutInCell="1" allowOverlap="1" wp14:anchorId="21261F5C" wp14:editId="567038D5">
                 <wp:simplePos x="0" y="0"/>
                 <wp:positionH relativeFrom="column">
                   <wp:posOffset>-1070610</wp:posOffset>
@@ -3292,7 +3242,7 @@
         <mc:AlternateContent>
           <mc:Choice Requires="wps">
             <w:drawing>
-              <wp:anchor distT="0" distB="0" distL="114300" distR="114300" simplePos="0" relativeHeight="251658258" behindDoc="0" locked="0" layoutInCell="1" allowOverlap="1" wp14:anchorId="7AFF7B6F" wp14:editId="27C89F2F">
+              <wp:anchor distT="0" distB="0" distL="114300" distR="114300" simplePos="0" relativeHeight="251658257" behindDoc="0" locked="0" layoutInCell="1" allowOverlap="1" wp14:anchorId="7AFF7B6F" wp14:editId="27C89F2F">
                 <wp:simplePos x="0" y="0"/>
                 <wp:positionH relativeFrom="column">
                   <wp:posOffset>-849630</wp:posOffset>
@@ -3633,7 +3583,7 @@
         <mc:AlternateContent>
           <mc:Choice Requires="wps">
             <w:drawing>
-              <wp:anchor distT="0" distB="0" distL="114300" distR="114300" simplePos="0" relativeHeight="251658257" behindDoc="0" locked="0" layoutInCell="1" allowOverlap="1" wp14:anchorId="0A3D5C2E" wp14:editId="0B3C3546">
+              <wp:anchor distT="0" distB="0" distL="114300" distR="114300" simplePos="0" relativeHeight="251658256" behindDoc="0" locked="0" layoutInCell="1" allowOverlap="1" wp14:anchorId="0A3D5C2E" wp14:editId="0B3C3546">
                 <wp:simplePos x="0" y="0"/>
                 <wp:positionH relativeFrom="column">
                   <wp:posOffset>-849746</wp:posOffset>
@@ -3943,7 +3893,7 @@
         <mc:AlternateContent>
           <mc:Choice Requires="wps">
             <w:drawing>
-              <wp:anchor distT="0" distB="0" distL="114300" distR="114300" simplePos="0" relativeHeight="251658256" behindDoc="0" locked="0" layoutInCell="1" allowOverlap="1" wp14:anchorId="212F2398" wp14:editId="658A3B40">
+              <wp:anchor distT="0" distB="0" distL="114300" distR="114300" simplePos="0" relativeHeight="251658255" behindDoc="0" locked="0" layoutInCell="1" allowOverlap="1" wp14:anchorId="212F2398" wp14:editId="658A3B40">
                 <wp:simplePos x="0" y="0"/>
                 <wp:positionH relativeFrom="column">
                   <wp:posOffset>-839932</wp:posOffset>
@@ -4097,7 +4047,7 @@
         <mc:AlternateContent>
           <mc:Choice Requires="wps">
             <w:drawing>
-              <wp:anchor distT="0" distB="0" distL="114300" distR="114300" simplePos="0" relativeHeight="251658255" behindDoc="0" locked="0" layoutInCell="1" allowOverlap="1" wp14:anchorId="71CF1FAF" wp14:editId="2CA034C1">
+              <wp:anchor distT="0" distB="0" distL="114300" distR="114300" simplePos="0" relativeHeight="251658254" behindDoc="0" locked="0" layoutInCell="1" allowOverlap="1" wp14:anchorId="71CF1FAF" wp14:editId="2CA034C1">
                 <wp:simplePos x="0" y="0"/>
                 <wp:positionH relativeFrom="column">
                   <wp:posOffset>-840510</wp:posOffset>
@@ -4296,7 +4246,7 @@
         <mc:AlternateContent>
           <mc:Choice Requires="wps">
             <w:drawing>
-              <wp:anchor distT="0" distB="0" distL="114300" distR="114300" simplePos="0" relativeHeight="251658252" behindDoc="0" locked="0" layoutInCell="1" allowOverlap="1" wp14:anchorId="5BF98184" wp14:editId="5C2D86E8">
+              <wp:anchor distT="0" distB="0" distL="114300" distR="114300" simplePos="0" relativeHeight="251658251" behindDoc="0" locked="0" layoutInCell="1" allowOverlap="1" wp14:anchorId="5BF98184" wp14:editId="5C2D86E8">
                 <wp:simplePos x="0" y="0"/>
                 <wp:positionH relativeFrom="column">
                   <wp:posOffset>-1094740</wp:posOffset>
@@ -4395,7 +4345,7 @@
         <mc:AlternateContent>
           <mc:Choice Requires="wps">
             <w:drawing>
-              <wp:anchor distT="0" distB="0" distL="114300" distR="114300" simplePos="0" relativeHeight="251658251" behindDoc="0" locked="0" layoutInCell="1" allowOverlap="1" wp14:anchorId="3DA5F688" wp14:editId="37C22CDD">
+              <wp:anchor distT="0" distB="0" distL="114300" distR="114300" simplePos="0" relativeHeight="251658250" behindDoc="0" locked="0" layoutInCell="1" allowOverlap="1" wp14:anchorId="3DA5F688" wp14:editId="37C22CDD">
                 <wp:simplePos x="0" y="0"/>
                 <wp:positionH relativeFrom="column">
                   <wp:posOffset>-1090930</wp:posOffset>
@@ -4510,7 +4460,7 @@
         <mc:AlternateContent>
           <mc:Choice Requires="wps">
             <w:drawing>
-              <wp:anchor distT="0" distB="0" distL="114300" distR="114300" simplePos="0" relativeHeight="251658253" behindDoc="0" locked="0" layoutInCell="1" allowOverlap="1" wp14:anchorId="74367544" wp14:editId="5BFD54D9">
+              <wp:anchor distT="0" distB="0" distL="114300" distR="114300" simplePos="0" relativeHeight="251658252" behindDoc="0" locked="0" layoutInCell="1" allowOverlap="1" wp14:anchorId="74367544" wp14:editId="5BFD54D9">
                 <wp:simplePos x="0" y="0"/>
                 <wp:positionH relativeFrom="column">
                   <wp:posOffset>-838373</wp:posOffset>
@@ -4641,7 +4591,7 @@
         <mc:AlternateContent>
           <mc:Choice Requires="wps">
             <w:drawing>
-              <wp:anchor distT="0" distB="0" distL="114300" distR="114300" simplePos="0" relativeHeight="251658254" behindDoc="0" locked="0" layoutInCell="1" allowOverlap="1" wp14:anchorId="4907C116" wp14:editId="1594FD72">
+              <wp:anchor distT="0" distB="0" distL="114300" distR="114300" simplePos="0" relativeHeight="251658253" behindDoc="0" locked="0" layoutInCell="1" allowOverlap="1" wp14:anchorId="4907C116" wp14:editId="1594FD72">
                 <wp:simplePos x="0" y="0"/>
                 <wp:positionH relativeFrom="column">
                   <wp:posOffset>-840510</wp:posOffset>
@@ -5062,7 +5012,7 @@
         <mc:AlternateContent>
           <mc:Choice Requires="wps">
             <w:drawing>
-              <wp:anchor distT="0" distB="0" distL="114300" distR="114300" simplePos="0" relativeHeight="251658259" behindDoc="0" locked="0" layoutInCell="1" allowOverlap="1" wp14:anchorId="24DD8B3C" wp14:editId="4E563FEE">
+              <wp:anchor distT="0" distB="0" distL="114300" distR="114300" simplePos="0" relativeHeight="251658258" behindDoc="0" locked="0" layoutInCell="1" allowOverlap="1" wp14:anchorId="24DD8B3C" wp14:editId="4E563FEE">
                 <wp:simplePos x="0" y="0"/>
                 <wp:positionH relativeFrom="column">
                   <wp:posOffset>-867679</wp:posOffset>
@@ -5250,7 +5200,7 @@
         <mc:AlternateContent>
           <mc:Choice Requires="wps">
             <w:drawing>
-              <wp:anchor distT="0" distB="0" distL="114300" distR="114300" simplePos="0" relativeHeight="251658260" behindDoc="0" locked="0" layoutInCell="1" allowOverlap="1" wp14:anchorId="7A2D47E7" wp14:editId="1050982A">
+              <wp:anchor distT="0" distB="0" distL="114300" distR="114300" simplePos="0" relativeHeight="251658259" behindDoc="0" locked="0" layoutInCell="1" allowOverlap="1" wp14:anchorId="7A2D47E7" wp14:editId="1050982A">
                 <wp:simplePos x="0" y="0"/>
                 <wp:positionH relativeFrom="column">
                   <wp:posOffset>-820957</wp:posOffset>
@@ -5482,7 +5432,7 @@
         <mc:AlternateContent>
           <mc:Choice Requires="wps">
             <w:drawing>
-              <wp:anchor distT="0" distB="0" distL="114300" distR="114300" simplePos="0" relativeHeight="251658263" behindDoc="0" locked="0" layoutInCell="1" allowOverlap="1" wp14:anchorId="506657D6" wp14:editId="014487DC">
+              <wp:anchor distT="0" distB="0" distL="114300" distR="114300" simplePos="0" relativeHeight="251658262" behindDoc="0" locked="0" layoutInCell="1" allowOverlap="1" wp14:anchorId="506657D6" wp14:editId="014487DC">
                 <wp:simplePos x="0" y="0"/>
                 <wp:positionH relativeFrom="column">
                   <wp:posOffset>-1094740</wp:posOffset>
@@ -5581,7 +5531,7 @@
         <mc:AlternateContent>
           <mc:Choice Requires="wps">
             <w:drawing>
-              <wp:anchor distT="0" distB="0" distL="114300" distR="114300" simplePos="0" relativeHeight="251658262" behindDoc="0" locked="0" layoutInCell="1" allowOverlap="1" wp14:anchorId="3D1CB19A" wp14:editId="10D64102">
+              <wp:anchor distT="0" distB="0" distL="114300" distR="114300" simplePos="0" relativeHeight="251658261" behindDoc="0" locked="0" layoutInCell="1" allowOverlap="1" wp14:anchorId="3D1CB19A" wp14:editId="10D64102">
                 <wp:simplePos x="0" y="0"/>
                 <wp:positionH relativeFrom="column">
                   <wp:posOffset>-1090930</wp:posOffset>
@@ -5699,7 +5649,7 @@
         <mc:AlternateContent>
           <mc:Choice Requires="wps">
             <w:drawing>
-              <wp:anchor distT="0" distB="0" distL="114300" distR="114300" simplePos="0" relativeHeight="251658264" behindDoc="0" locked="0" layoutInCell="1" allowOverlap="1" wp14:anchorId="6E3B3E82" wp14:editId="71D9E33B">
+              <wp:anchor distT="0" distB="0" distL="114300" distR="114300" simplePos="0" relativeHeight="251658263" behindDoc="0" locked="0" layoutInCell="1" allowOverlap="1" wp14:anchorId="6E3B3E82" wp14:editId="71D9E33B">
                 <wp:simplePos x="0" y="0"/>
                 <wp:positionH relativeFrom="column">
                   <wp:posOffset>-840510</wp:posOffset>
@@ -5804,15 +5754,15 @@
           <w:rFonts w:ascii="Baskerville" w:hAnsi="Baskerville"/>
           <w:sz w:val="24"/>
           <w:szCs w:val="24"/>
-          <w:lang w:val="en-MX"/>
-        </w:rPr>
-      </w:pPr>
-      <w:r>
-        <w:rPr>
-          <w:rFonts w:ascii="Baskerville" w:hAnsi="Baskerville"/>
-          <w:sz w:val="24"/>
-          <w:szCs w:val="24"/>
-          <w:lang w:val="en-MX"/>
+          <w:lang/>
+        </w:rPr>
+      </w:pPr>
+      <w:r>
+        <w:rPr>
+          <w:rFonts w:ascii="Baskerville" w:hAnsi="Baskerville"/>
+          <w:sz w:val="24"/>
+          <w:szCs w:val="24"/>
+          <w:lang/>
         </w:rPr>
         <w:t>El mercado de la logística de eventos en Norteamérica, y específicamente en el corredor tecnológico de Utah (Silicon Slopes), está experimentando una transformación acelerada hacia la digitalización. Se estima que el mercado global de software para gestión de eventos alcanzará los 34.7 billones de USD para el año 2029, con una tasa de crecimiento anual compuesta (CAGR) del 17.4%.</w:t>
       </w:r>
@@ -5824,15 +5774,15 @@
           <w:rFonts w:ascii="Baskerville" w:hAnsi="Baskerville"/>
           <w:sz w:val="24"/>
           <w:szCs w:val="24"/>
-          <w:lang w:val="en-MX"/>
-        </w:rPr>
-      </w:pPr>
-      <w:r>
-        <w:rPr>
-          <w:rFonts w:ascii="Baskerville" w:hAnsi="Baskerville"/>
-          <w:sz w:val="24"/>
-          <w:szCs w:val="24"/>
-          <w:lang w:val="en-MX"/>
+          <w:lang/>
+        </w:rPr>
+      </w:pPr>
+      <w:r>
+        <w:rPr>
+          <w:rFonts w:ascii="Baskerville" w:hAnsi="Baskerville"/>
+          <w:sz w:val="24"/>
+          <w:szCs w:val="24"/>
+          <w:lang/>
         </w:rPr>
         <w:t>Tendencias Clave:</w:t>
       </w:r>
@@ -5848,17 +5798,16 @@
           <w:rFonts w:ascii="Baskerville" w:hAnsi="Baskerville"/>
           <w:sz w:val="24"/>
           <w:szCs w:val="24"/>
-          <w:lang w:val="en-MX"/>
+          <w:lang/>
         </w:rPr>
       </w:pPr>
       <w:r>
         <w:rPr>
           <w:rFonts w:ascii="Baskerville" w:hAnsi="Baskerville"/>
           <w:i/>
-          <w:iCs/>
-          <w:sz w:val="24"/>
-          <w:szCs w:val="24"/>
-          <w:lang w:val="en-MX"/>
+          <w:sz w:val="24"/>
+          <w:szCs w:val="24"/>
+          <w:lang/>
         </w:rPr>
         <w:t>Sostenibilidad Operativa</w:t>
       </w:r>
@@ -5867,7 +5816,7 @@
           <w:rFonts w:ascii="Baskerville" w:hAnsi="Baskerville"/>
           <w:sz w:val="24"/>
           <w:szCs w:val="24"/>
-          <w:lang w:val="en-MX"/>
+          <w:lang/>
         </w:rPr>
         <w:t>: Existe una presión creciente por reducir la huella de carbono. La eliminación del papel no solo ahorra costos directos, sino que alinea a Diamond Event &amp; Tent con las políticas de "Logística Verde" que demandan los grandes clientes corporativos en Salt Lake City y Park City.</w:t>
       </w:r>
@@ -5883,17 +5832,16 @@
           <w:rFonts w:ascii="Baskerville" w:hAnsi="Baskerville"/>
           <w:sz w:val="24"/>
           <w:szCs w:val="24"/>
-          <w:lang w:val="en-MX"/>
+          <w:lang/>
         </w:rPr>
       </w:pPr>
       <w:r>
         <w:rPr>
           <w:rFonts w:ascii="Baskerville" w:hAnsi="Baskerville"/>
           <w:i/>
-          <w:iCs/>
-          <w:sz w:val="24"/>
-          <w:szCs w:val="24"/>
-          <w:lang w:val="en-MX"/>
+          <w:sz w:val="24"/>
+          <w:szCs w:val="24"/>
+          <w:lang/>
         </w:rPr>
         <w:t>Visibilidad en Tiempo Real</w:t>
       </w:r>
@@ -5902,7 +5850,7 @@
           <w:rFonts w:ascii="Baskerville" w:hAnsi="Baskerville"/>
           <w:sz w:val="24"/>
           <w:szCs w:val="24"/>
-          <w:lang w:val="en-MX"/>
+          <w:lang/>
         </w:rPr>
         <w:t>: La demanda de los clientes ya no se limita a la entrega; ahora exigen confirmaciones instantáneas y trazabilidad. En Utah, el volumen de eventos corporativos y bodas de destino ha crecido un 1</w:t>
       </w:r>
@@ -5911,7 +5859,7 @@
           <w:rFonts w:ascii="Baskerville" w:hAnsi="Baskerville"/>
           <w:sz w:val="24"/>
           <w:szCs w:val="24"/>
-          <w:lang w:val="en-MX"/>
+          <w:lang/>
         </w:rPr>
         <w:t>5</w:t>
       </w:r>
@@ -5920,7 +5868,7 @@
           <w:rFonts w:ascii="Baskerville" w:hAnsi="Baskerville"/>
           <w:sz w:val="24"/>
           <w:szCs w:val="24"/>
-          <w:lang w:val="en-MX"/>
+          <w:lang/>
         </w:rPr>
         <w:t>% post-pandemia, saturando las capacidades de las empresas que aún operan manualmente.</w:t>
       </w:r>
@@ -5936,17 +5884,16 @@
           <w:rFonts w:ascii="Baskerville" w:hAnsi="Baskerville"/>
           <w:sz w:val="24"/>
           <w:szCs w:val="24"/>
-          <w:lang w:val="en-MX"/>
+          <w:lang/>
         </w:rPr>
       </w:pPr>
       <w:r>
         <w:rPr>
           <w:rFonts w:ascii="Baskerville" w:hAnsi="Baskerville"/>
           <w:i/>
-          <w:iCs/>
-          <w:sz w:val="24"/>
-          <w:szCs w:val="24"/>
-          <w:lang w:val="en-MX"/>
+          <w:sz w:val="24"/>
+          <w:szCs w:val="24"/>
+          <w:lang/>
         </w:rPr>
         <w:t xml:space="preserve">Reducción de la Brecha Digital: </w:t>
       </w:r>
@@ -5955,7 +5902,7 @@
           <w:rFonts w:ascii="Baskerville" w:hAnsi="Baskerville"/>
           <w:sz w:val="24"/>
           <w:szCs w:val="24"/>
-          <w:lang w:val="en-MX"/>
+          <w:lang/>
         </w:rPr>
         <w:t>Actualmente, el 45.5% de las empresas logísticas siguen dependiendo del papel para procesos críticos. Aquellas que adoptan soluciones móviles logran reducir los errores de entrada de datos en un 80% y los tiempos de procesamiento en un $50%.</w:t>
       </w:r>
@@ -5967,20 +5914,19 @@
           <w:rFonts w:ascii="Baskerville" w:hAnsi="Baskerville"/>
           <w:sz w:val="24"/>
           <w:szCs w:val="24"/>
-          <w:lang w:val="en-MX"/>
-        </w:rPr>
-      </w:pPr>
-      <w:r>
-        <w:rPr>
-          <w:rFonts w:ascii="Baskerville" w:hAnsi="Baskerville"/>
-          <w:noProof/>
-          <w:sz w:val="24"/>
-          <w:szCs w:val="24"/>
-          <w:lang w:val="en-MX"/>
+          <w:lang/>
+        </w:rPr>
+      </w:pPr>
+      <w:r>
+        <w:rPr>
+          <w:rFonts w:ascii="Baskerville" w:hAnsi="Baskerville"/>
+          <w:sz w:val="24"/>
+          <w:szCs w:val="24"/>
+          <w:lang/>
         </w:rPr>
         <w:lastRenderedPageBreak/>
         <w:drawing>
-          <wp:anchor distT="0" distB="0" distL="114300" distR="114300" simplePos="0" relativeHeight="251659308" behindDoc="0" locked="0" layoutInCell="1" allowOverlap="1" wp14:anchorId="71FAF70C" wp14:editId="027DB5E4">
+          <wp:anchor distT="0" distB="0" distL="114300" distR="114300" simplePos="0" relativeHeight="251658283" behindDoc="0" locked="0" layoutInCell="1" allowOverlap="1" wp14:anchorId="71FAF70C" wp14:editId="027DB5E4">
             <wp:simplePos x="0" y="0"/>
             <wp:positionH relativeFrom="column">
               <wp:posOffset>515853</wp:posOffset>
@@ -6057,7 +6003,7 @@
         <mc:AlternateContent>
           <mc:Choice Requires="wps">
             <w:drawing>
-              <wp:anchor distT="0" distB="0" distL="114300" distR="114300" simplePos="0" relativeHeight="251658265" behindDoc="0" locked="0" layoutInCell="1" allowOverlap="1" wp14:anchorId="4D095D01" wp14:editId="7B41D962">
+              <wp:anchor distT="0" distB="0" distL="114300" distR="114300" simplePos="0" relativeHeight="251658264" behindDoc="0" locked="0" layoutInCell="1" allowOverlap="1" wp14:anchorId="4D095D01" wp14:editId="7B41D962">
                 <wp:simplePos x="0" y="0"/>
                 <wp:positionH relativeFrom="column">
                   <wp:posOffset>-840510</wp:posOffset>
@@ -6162,15 +6108,15 @@
           <w:rFonts w:ascii="Baskerville" w:hAnsi="Baskerville"/>
           <w:sz w:val="24"/>
           <w:szCs w:val="24"/>
-          <w:lang w:val="en-MX"/>
-        </w:rPr>
-      </w:pPr>
-      <w:r>
-        <w:rPr>
-          <w:rFonts w:ascii="Baskerville" w:hAnsi="Baskerville"/>
-          <w:sz w:val="24"/>
-          <w:szCs w:val="24"/>
-          <w:lang w:val="en-MX"/>
+          <w:lang/>
+        </w:rPr>
+      </w:pPr>
+      <w:r>
+        <w:rPr>
+          <w:rFonts w:ascii="Baskerville" w:hAnsi="Baskerville"/>
+          <w:sz w:val="24"/>
+          <w:szCs w:val="24"/>
+          <w:lang/>
         </w:rPr>
         <w:t>La competencia de Diamond Event &amp; Tent en el estado de Utah se puede clasificar en tres categorías principales, frente a las cuales nuestra solución personalizada presenta ventajas competitivas claras:</w:t>
       </w:r>
@@ -6185,20 +6131,18 @@
         <w:rPr>
           <w:rFonts w:ascii="Baskerville" w:hAnsi="Baskerville"/>
           <w:i/>
-          <w:iCs/>
-          <w:sz w:val="24"/>
-          <w:szCs w:val="24"/>
-          <w:lang w:val="en-MX"/>
+          <w:sz w:val="24"/>
+          <w:szCs w:val="24"/>
+          <w:lang/>
         </w:rPr>
       </w:pPr>
       <w:r>
         <w:rPr>
           <w:rFonts w:ascii="Baskerville" w:hAnsi="Baskerville"/>
           <w:i/>
-          <w:iCs/>
-          <w:sz w:val="24"/>
-          <w:szCs w:val="24"/>
-          <w:lang w:val="en-MX"/>
+          <w:sz w:val="24"/>
+          <w:szCs w:val="24"/>
+          <w:lang/>
         </w:rPr>
         <w:t>Sistemas TMS Genéricos (Transport Management Systems):</w:t>
       </w:r>
@@ -6214,15 +6158,15 @@
           <w:rFonts w:ascii="Baskerville" w:hAnsi="Baskerville"/>
           <w:sz w:val="24"/>
           <w:szCs w:val="24"/>
-          <w:lang w:val="en-MX"/>
-        </w:rPr>
-      </w:pPr>
-      <w:r>
-        <w:rPr>
-          <w:rFonts w:ascii="Baskerville" w:hAnsi="Baskerville"/>
-          <w:sz w:val="24"/>
-          <w:szCs w:val="24"/>
-          <w:lang w:val="en-MX"/>
+          <w:lang/>
+        </w:rPr>
+      </w:pPr>
+      <w:r>
+        <w:rPr>
+          <w:rFonts w:ascii="Baskerville" w:hAnsi="Baskerville"/>
+          <w:sz w:val="24"/>
+          <w:szCs w:val="24"/>
+          <w:lang/>
         </w:rPr>
         <w:t>Ejemplos: Soluciones como Samsara o Fleetio.</w:t>
       </w:r>
@@ -6238,15 +6182,15 @@
           <w:rFonts w:ascii="Baskerville" w:hAnsi="Baskerville"/>
           <w:sz w:val="24"/>
           <w:szCs w:val="24"/>
-          <w:lang w:val="en-MX"/>
-        </w:rPr>
-      </w:pPr>
-      <w:r>
-        <w:rPr>
-          <w:rFonts w:ascii="Baskerville" w:hAnsi="Baskerville"/>
-          <w:sz w:val="24"/>
-          <w:szCs w:val="24"/>
-          <w:lang w:val="en-MX"/>
+          <w:lang/>
+        </w:rPr>
+      </w:pPr>
+      <w:r>
+        <w:rPr>
+          <w:rFonts w:ascii="Baskerville" w:hAnsi="Baskerville"/>
+          <w:sz w:val="24"/>
+          <w:szCs w:val="24"/>
+          <w:lang/>
         </w:rPr>
         <w:t>Limitaciones: Están diseñados para logística de "punto A a punto B". Carecen de la lógica de "retorno de activos" (Pick-up) que es vital para el inventario de Diamond. No permiten segmentar fácilmente entre materiales de "Events" (estructuras pesadas) y "Party" (detalles delicados).</w:t>
       </w:r>
@@ -6262,15 +6206,15 @@
           <w:rFonts w:ascii="Baskerville" w:hAnsi="Baskerville"/>
           <w:sz w:val="24"/>
           <w:szCs w:val="24"/>
-          <w:lang w:val="en-MX"/>
-        </w:rPr>
-      </w:pPr>
-      <w:r>
-        <w:rPr>
-          <w:rFonts w:ascii="Baskerville" w:hAnsi="Baskerville"/>
-          <w:sz w:val="24"/>
-          <w:szCs w:val="24"/>
-          <w:lang w:val="en-MX"/>
+          <w:lang/>
+        </w:rPr>
+      </w:pPr>
+      <w:r>
+        <w:rPr>
+          <w:rFonts w:ascii="Baskerville" w:hAnsi="Baskerville"/>
+          <w:sz w:val="24"/>
+          <w:szCs w:val="24"/>
+          <w:lang/>
         </w:rPr>
         <w:t>Nuestra Ventaja: Flujo de trabajo bidireccional específico (Delivery + Pick-up) integrado en una sola orden.</w:t>
       </w:r>
@@ -6285,20 +6229,18 @@
         <w:rPr>
           <w:rFonts w:ascii="Baskerville" w:hAnsi="Baskerville"/>
           <w:i/>
-          <w:iCs/>
-          <w:sz w:val="24"/>
-          <w:szCs w:val="24"/>
-          <w:lang w:val="en-MX"/>
+          <w:sz w:val="24"/>
+          <w:szCs w:val="24"/>
+          <w:lang/>
         </w:rPr>
       </w:pPr>
       <w:r>
         <w:rPr>
           <w:rFonts w:ascii="Baskerville" w:hAnsi="Baskerville"/>
           <w:i/>
-          <w:iCs/>
-          <w:sz w:val="24"/>
-          <w:szCs w:val="24"/>
-          <w:lang w:val="en-MX"/>
+          <w:sz w:val="24"/>
+          <w:szCs w:val="24"/>
+          <w:lang/>
         </w:rPr>
         <w:t>Software Comercial de Alquiler (SaaS):</w:t>
       </w:r>
@@ -6314,15 +6256,15 @@
           <w:rFonts w:ascii="Baskerville" w:hAnsi="Baskerville"/>
           <w:sz w:val="24"/>
           <w:szCs w:val="24"/>
-          <w:lang w:val="en-MX"/>
-        </w:rPr>
-      </w:pPr>
-      <w:r>
-        <w:rPr>
-          <w:rFonts w:ascii="Baskerville" w:hAnsi="Baskerville"/>
-          <w:sz w:val="24"/>
-          <w:szCs w:val="24"/>
-          <w:lang w:val="en-MX"/>
+          <w:lang/>
+        </w:rPr>
+      </w:pPr>
+      <w:r>
+        <w:rPr>
+          <w:rFonts w:ascii="Baskerville" w:hAnsi="Baskerville"/>
+          <w:sz w:val="24"/>
+          <w:szCs w:val="24"/>
+          <w:lang/>
         </w:rPr>
         <w:t>Ejemplos: Point of Rental, Goodshuffle Pro.</w:t>
       </w:r>
@@ -6338,15 +6280,15 @@
           <w:rFonts w:ascii="Baskerville" w:hAnsi="Baskerville"/>
           <w:sz w:val="24"/>
           <w:szCs w:val="24"/>
-          <w:lang w:val="en-MX"/>
-        </w:rPr>
-      </w:pPr>
-      <w:r>
-        <w:rPr>
-          <w:rFonts w:ascii="Baskerville" w:hAnsi="Baskerville"/>
-          <w:sz w:val="24"/>
-          <w:szCs w:val="24"/>
-          <w:lang w:val="en-MX"/>
+          <w:lang/>
+        </w:rPr>
+      </w:pPr>
+      <w:r>
+        <w:rPr>
+          <w:rFonts w:ascii="Baskerville" w:hAnsi="Baskerville"/>
+          <w:sz w:val="24"/>
+          <w:szCs w:val="24"/>
+          <w:lang/>
         </w:rPr>
         <w:t>Limitaciones: Aunque son potentes, suelen ser costosos ($US$ 200-500 mensuales por usuario) y presentan una "rigidez de proceso". Obligan a la empresa a adaptar su forma de trabajar al software, y no al revés. Además, la curva de aprendizaje para los repartidores (drivers) suele ser elevada debido a interfaces sobrecargadas de funciones innecesarias.</w:t>
       </w:r>
@@ -6362,15 +6304,15 @@
           <w:rFonts w:ascii="Baskerville" w:hAnsi="Baskerville"/>
           <w:sz w:val="24"/>
           <w:szCs w:val="24"/>
-          <w:lang w:val="en-MX"/>
-        </w:rPr>
-      </w:pPr>
-      <w:r>
-        <w:rPr>
-          <w:rFonts w:ascii="Baskerville" w:hAnsi="Baskerville"/>
-          <w:sz w:val="24"/>
-          <w:szCs w:val="24"/>
-          <w:lang w:val="en-MX"/>
+          <w:lang/>
+        </w:rPr>
+      </w:pPr>
+      <w:r>
+        <w:rPr>
+          <w:rFonts w:ascii="Baskerville" w:hAnsi="Baskerville"/>
+          <w:sz w:val="24"/>
+          <w:szCs w:val="24"/>
+          <w:lang/>
         </w:rPr>
         <w:t>Nuestra Ventaja: Interfaz simplificada y optimizada para móviles ("Mobile-First") que atiende únicamente los requerimientos detectados en Diamond, eliminando el ruido visual y mejorando la adopción tecnológica.</w:t>
       </w:r>
@@ -6385,20 +6327,18 @@
         <w:rPr>
           <w:rFonts w:ascii="Baskerville" w:hAnsi="Baskerville"/>
           <w:i/>
-          <w:iCs/>
-          <w:sz w:val="24"/>
-          <w:szCs w:val="24"/>
-          <w:lang w:val="en-MX"/>
+          <w:sz w:val="24"/>
+          <w:szCs w:val="24"/>
+          <w:lang/>
         </w:rPr>
       </w:pPr>
       <w:r>
         <w:rPr>
           <w:rFonts w:ascii="Baskerville" w:hAnsi="Baskerville"/>
           <w:i/>
-          <w:iCs/>
-          <w:sz w:val="24"/>
-          <w:szCs w:val="24"/>
-          <w:lang w:val="en-MX"/>
+          <w:sz w:val="24"/>
+          <w:szCs w:val="24"/>
+          <w:lang/>
         </w:rPr>
         <w:lastRenderedPageBreak/>
         <w:t>Competidores Locales con Procesos Manuales:</w:t>
@@ -6415,15 +6355,15 @@
           <w:rFonts w:ascii="Baskerville" w:hAnsi="Baskerville"/>
           <w:sz w:val="24"/>
           <w:szCs w:val="24"/>
-          <w:lang w:val="en-MX"/>
-        </w:rPr>
-      </w:pPr>
-      <w:r>
-        <w:rPr>
-          <w:rFonts w:ascii="Baskerville" w:hAnsi="Baskerville"/>
-          <w:sz w:val="24"/>
-          <w:szCs w:val="24"/>
-          <w:lang w:val="en-MX"/>
+          <w:lang/>
+        </w:rPr>
+      </w:pPr>
+      <w:r>
+        <w:rPr>
+          <w:rFonts w:ascii="Baskerville" w:hAnsi="Baskerville"/>
+          <w:sz w:val="24"/>
+          <w:szCs w:val="24"/>
+          <w:lang/>
         </w:rPr>
         <w:t>Contexto</w:t>
       </w:r>
@@ -6431,10 +6371,9 @@
         <w:rPr>
           <w:rFonts w:ascii="Baskerville" w:hAnsi="Baskerville"/>
           <w:b/>
-          <w:bCs/>
-          <w:sz w:val="24"/>
-          <w:szCs w:val="24"/>
-          <w:lang w:val="en-MX"/>
+          <w:sz w:val="24"/>
+          <w:szCs w:val="24"/>
+          <w:lang/>
         </w:rPr>
         <w:t>:</w:t>
       </w:r>
@@ -6443,7 +6382,7 @@
           <w:rFonts w:ascii="Baskerville" w:hAnsi="Baskerville"/>
           <w:sz w:val="24"/>
           <w:szCs w:val="24"/>
-          <w:lang w:val="en-MX"/>
+          <w:lang/>
         </w:rPr>
         <w:t xml:space="preserve"> Pequeñas casas de renta en la zona metropolitana de SLC.</w:t>
       </w:r>
@@ -6459,15 +6398,15 @@
           <w:rFonts w:ascii="Baskerville" w:hAnsi="Baskerville"/>
           <w:sz w:val="24"/>
           <w:szCs w:val="24"/>
-          <w:lang w:val="en-MX"/>
-        </w:rPr>
-      </w:pPr>
-      <w:r>
-        <w:rPr>
-          <w:rFonts w:ascii="Baskerville" w:hAnsi="Baskerville"/>
-          <w:sz w:val="24"/>
-          <w:szCs w:val="24"/>
-          <w:lang w:val="en-MX"/>
+          <w:lang/>
+        </w:rPr>
+      </w:pPr>
+      <w:r>
+        <w:rPr>
+          <w:rFonts w:ascii="Baskerville" w:hAnsi="Baskerville"/>
+          <w:sz w:val="24"/>
+          <w:szCs w:val="24"/>
+          <w:lang/>
         </w:rPr>
         <w:t>Riesgos: Su incapacidad de respuesta rápida ante cambios de último minuto les hace perder contratos grandes.</w:t>
       </w:r>
@@ -6483,15 +6422,15 @@
           <w:rFonts w:ascii="Baskerville" w:hAnsi="Baskerville"/>
           <w:sz w:val="24"/>
           <w:szCs w:val="24"/>
-          <w:lang w:val="en-MX"/>
-        </w:rPr>
-      </w:pPr>
-      <w:r>
-        <w:rPr>
-          <w:rFonts w:ascii="Baskerville" w:hAnsi="Baskerville"/>
-          <w:sz w:val="24"/>
-          <w:szCs w:val="24"/>
-          <w:lang w:val="en-MX"/>
+          <w:lang/>
+        </w:rPr>
+      </w:pPr>
+      <w:r>
+        <w:rPr>
+          <w:rFonts w:ascii="Baskerville" w:hAnsi="Baskerville"/>
+          <w:sz w:val="24"/>
+          <w:szCs w:val="24"/>
+          <w:lang/>
         </w:rPr>
         <w:t>Nuestra Ventaja: Agilidad operativa extrema. Mientras un competidor manual debe llamar por teléfono al driver para avisar de un cambio, nuestro sistema sincroniza la orden instantáneamente.</w:t>
       </w:r>
@@ -6518,7 +6457,7 @@
         <mc:AlternateContent>
           <mc:Choice Requires="wps">
             <w:drawing>
-              <wp:anchor distT="0" distB="0" distL="114300" distR="114300" simplePos="0" relativeHeight="251658266" behindDoc="0" locked="0" layoutInCell="1" allowOverlap="1" wp14:anchorId="60822DEC" wp14:editId="7D2892F8">
+              <wp:anchor distT="0" distB="0" distL="114300" distR="114300" simplePos="0" relativeHeight="251658265" behindDoc="0" locked="0" layoutInCell="1" allowOverlap="1" wp14:anchorId="60822DEC" wp14:editId="7D2892F8">
                 <wp:simplePos x="0" y="0"/>
                 <wp:positionH relativeFrom="column">
                   <wp:posOffset>-840510</wp:posOffset>
@@ -6904,7 +6843,7 @@
         <mc:AlternateContent>
           <mc:Choice Requires="wps">
             <w:drawing>
-              <wp:anchor distT="0" distB="0" distL="114300" distR="114300" simplePos="0" relativeHeight="251658268" behindDoc="0" locked="0" layoutInCell="1" allowOverlap="1" wp14:anchorId="2E979611" wp14:editId="0864CFCA">
+              <wp:anchor distT="0" distB="0" distL="114300" distR="114300" simplePos="0" relativeHeight="251658267" behindDoc="0" locked="0" layoutInCell="1" allowOverlap="1" wp14:anchorId="2E979611" wp14:editId="0864CFCA">
                 <wp:simplePos x="0" y="0"/>
                 <wp:positionH relativeFrom="column">
                   <wp:posOffset>-1094740</wp:posOffset>
@@ -7003,7 +6942,7 @@
         <mc:AlternateContent>
           <mc:Choice Requires="wps">
             <w:drawing>
-              <wp:anchor distT="0" distB="0" distL="114300" distR="114300" simplePos="0" relativeHeight="251658267" behindDoc="0" locked="0" layoutInCell="1" allowOverlap="1" wp14:anchorId="1E84220C" wp14:editId="4E1AD989">
+              <wp:anchor distT="0" distB="0" distL="114300" distR="114300" simplePos="0" relativeHeight="251658266" behindDoc="0" locked="0" layoutInCell="1" allowOverlap="1" wp14:anchorId="1E84220C" wp14:editId="4E1AD989">
                 <wp:simplePos x="0" y="0"/>
                 <wp:positionH relativeFrom="column">
                   <wp:posOffset>-1090930</wp:posOffset>
@@ -7114,7 +7053,7 @@
         <mc:AlternateContent>
           <mc:Choice Requires="wps">
             <w:drawing>
-              <wp:anchor distT="0" distB="0" distL="114300" distR="114300" simplePos="0" relativeHeight="251658269" behindDoc="0" locked="0" layoutInCell="1" allowOverlap="1" wp14:anchorId="63626F3F" wp14:editId="5252B45A">
+              <wp:anchor distT="0" distB="0" distL="114300" distR="114300" simplePos="0" relativeHeight="251658268" behindDoc="0" locked="0" layoutInCell="1" allowOverlap="1" wp14:anchorId="63626F3F" wp14:editId="5252B45A">
                 <wp:simplePos x="0" y="0"/>
                 <wp:positionH relativeFrom="column">
                   <wp:posOffset>-840510</wp:posOffset>
@@ -7250,7 +7189,7 @@
         <mc:AlternateContent>
           <mc:Choice Requires="wps">
             <w:drawing>
-              <wp:anchor distT="0" distB="0" distL="114300" distR="114300" simplePos="0" relativeHeight="251658270" behindDoc="0" locked="0" layoutInCell="1" allowOverlap="1" wp14:anchorId="3D7FA70E" wp14:editId="6538A38B">
+              <wp:anchor distT="0" distB="0" distL="114300" distR="114300" simplePos="0" relativeHeight="251658269" behindDoc="0" locked="0" layoutInCell="1" allowOverlap="1" wp14:anchorId="3D7FA70E" wp14:editId="6538A38B">
                 <wp:simplePos x="0" y="0"/>
                 <wp:positionH relativeFrom="column">
                   <wp:posOffset>-840510</wp:posOffset>
@@ -7390,7 +7329,7 @@
         <mc:AlternateContent>
           <mc:Choice Requires="wps">
             <w:drawing>
-              <wp:anchor distT="0" distB="0" distL="114300" distR="114300" simplePos="0" relativeHeight="251658271" behindDoc="0" locked="0" layoutInCell="1" allowOverlap="1" wp14:anchorId="0EE0AE0E" wp14:editId="5C81FCCA">
+              <wp:anchor distT="0" distB="0" distL="114300" distR="114300" simplePos="0" relativeHeight="251658270" behindDoc="0" locked="0" layoutInCell="1" allowOverlap="1" wp14:anchorId="0EE0AE0E" wp14:editId="5C81FCCA">
                 <wp:simplePos x="0" y="0"/>
                 <wp:positionH relativeFrom="column">
                   <wp:posOffset>-840510</wp:posOffset>
@@ -7611,7 +7550,7 @@
         <mc:AlternateContent>
           <mc:Choice Requires="wps">
             <w:drawing>
-              <wp:anchor distT="0" distB="0" distL="114300" distR="114300" simplePos="0" relativeHeight="251658273" behindDoc="0" locked="0" layoutInCell="1" allowOverlap="1" wp14:anchorId="0F95361E" wp14:editId="6A49D6F7">
+              <wp:anchor distT="0" distB="0" distL="114300" distR="114300" simplePos="0" relativeHeight="251658272" behindDoc="0" locked="0" layoutInCell="1" allowOverlap="1" wp14:anchorId="0F95361E" wp14:editId="6A49D6F7">
                 <wp:simplePos x="0" y="0"/>
                 <wp:positionH relativeFrom="column">
                   <wp:posOffset>-1094740</wp:posOffset>
@@ -7710,7 +7649,7 @@
         <mc:AlternateContent>
           <mc:Choice Requires="wps">
             <w:drawing>
-              <wp:anchor distT="0" distB="0" distL="114300" distR="114300" simplePos="0" relativeHeight="251658272" behindDoc="0" locked="0" layoutInCell="1" allowOverlap="1" wp14:anchorId="2DC8B92B" wp14:editId="08746EA2">
+              <wp:anchor distT="0" distB="0" distL="114300" distR="114300" simplePos="0" relativeHeight="251658271" behindDoc="0" locked="0" layoutInCell="1" allowOverlap="1" wp14:anchorId="2DC8B92B" wp14:editId="08746EA2">
                 <wp:simplePos x="0" y="0"/>
                 <wp:positionH relativeFrom="column">
                   <wp:posOffset>-1090930</wp:posOffset>
@@ -7807,11 +7746,11 @@
         </w:rPr>
       </w:pPr>
     </w:p>
+    <w:bookmarkStart w:id="19" w:name="_Toc229638670"/>
     <w:p>
       <w:pPr>
         <w:pStyle w:val="Heading2"/>
       </w:pPr>
-      <w:bookmarkStart w:id="19" w:name="_Toc229638670"/>
       <w:r>
         <w:rPr>
           <w:noProof/>
@@ -7821,7 +7760,7 @@
         <mc:AlternateContent>
           <mc:Choice Requires="wps">
             <w:drawing>
-              <wp:anchor distT="0" distB="0" distL="114300" distR="114300" simplePos="0" relativeHeight="251658274" behindDoc="0" locked="0" layoutInCell="1" allowOverlap="1" wp14:anchorId="5DFF6370" wp14:editId="11C4AC6A">
+              <wp:anchor distT="0" distB="0" distL="114300" distR="114300" simplePos="0" relativeHeight="251658273" behindDoc="0" locked="0" layoutInCell="1" allowOverlap="1" wp14:anchorId="5DFF6370" wp14:editId="11C4AC6A">
                 <wp:simplePos x="0" y="0"/>
                 <wp:positionH relativeFrom="column">
                   <wp:posOffset>-840510</wp:posOffset>
@@ -7894,7 +7833,7 @@
           </mc:Choice>
           <mc:Fallback>
             <w:pict>
-              <v:shape w14:anchorId="763B5601" id="Equal 21" o:spid="_x0000_s1026" style="position:absolute;margin-left:-66.2pt;margin-top:16.7pt;width:492.75pt;height:10.05pt;z-index:251658274;visibility:visible;mso-wrap-style:square;mso-width-percent:0;mso-height-percent:0;mso-wrap-distance-left:9pt;mso-wrap-distance-top:0;mso-wrap-distance-right:9pt;mso-wrap-distance-bottom:0;mso-position-horizontal:absolute;mso-position-horizontal-relative:text;mso-position-vertical:absolute;mso-position-vertical-relative:text;mso-width-percent:0;mso-height-percent:0;mso-width-relative:margin;mso-height-relative:margin;v-text-anchor:middle" coordsize="6257925,127635" o:gfxdata="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" path="m829488,42448r4598949,l5428437,51745r-4598949,l829488,42448xm829488,75890r4598949,l5428437,85187r-4598949,l829488,75890xe" fillcolor="#d8d8d8 [2732]" stroked="f" strokeweight="1pt">
+              <v:shape w14:anchorId="6B977E59" id="Equal 21" o:spid="_x0000_s1026" style="position:absolute;margin-left:-66.2pt;margin-top:16.7pt;width:492.75pt;height:10.05pt;z-index:251658274;visibility:visible;mso-wrap-style:square;mso-width-percent:0;mso-height-percent:0;mso-wrap-distance-left:9pt;mso-wrap-distance-top:0;mso-wrap-distance-right:9pt;mso-wrap-distance-bottom:0;mso-position-horizontal:absolute;mso-position-horizontal-relative:text;mso-position-vertical:absolute;mso-position-vertical-relative:text;mso-width-percent:0;mso-height-percent:0;mso-width-relative:margin;mso-height-relative:margin;v-text-anchor:middle" coordsize="6257925,127635" o:gfxdata="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" path="m829488,42448r4598949,l5428437,51745r-4598949,l829488,42448xm829488,75890r4598949,l5428437,85187r-4598949,l829488,75890xe" fillcolor="#d8d8d8 [2732]" stroked="f" strokeweight="1pt">
                 <v:stroke joinstyle="miter"/>
                 <v:path arrowok="t" o:connecttype="custom" o:connectlocs="829488,42448;5428437,42448;5428437,51745;829488,51745;829488,42448;829488,75890;5428437,75890;5428437,85187;829488,85187;829488,75890" o:connectangles="0,0,0,0,0,0,0,0,0,0"/>
               </v:shape>
@@ -7936,7 +7875,7 @@
           <w:noProof/>
         </w:rPr>
         <w:drawing>
-          <wp:anchor distT="0" distB="0" distL="114300" distR="114300" simplePos="0" relativeHeight="251660332" behindDoc="0" locked="0" layoutInCell="1" allowOverlap="1" wp14:anchorId="5965AF9F" wp14:editId="64DC41CE">
+          <wp:anchor distT="0" distB="0" distL="114300" distR="114300" simplePos="0" relativeHeight="251658284" behindDoc="0" locked="0" layoutInCell="1" allowOverlap="1" wp14:anchorId="5965AF9F" wp14:editId="64DC41CE">
             <wp:simplePos x="0" y="0"/>
             <wp:positionH relativeFrom="column">
               <wp:posOffset>66040</wp:posOffset>
@@ -8038,7 +7977,7 @@
         <mc:AlternateContent>
           <mc:Choice Requires="wps">
             <w:drawing>
-              <wp:anchor distT="0" distB="0" distL="114300" distR="114300" simplePos="0" relativeHeight="251658276" behindDoc="0" locked="0" layoutInCell="1" allowOverlap="1" wp14:anchorId="5D4DA1EC" wp14:editId="0649BC38">
+              <wp:anchor distT="0" distB="0" distL="114300" distR="114300" simplePos="0" relativeHeight="251658275" behindDoc="0" locked="0" layoutInCell="1" allowOverlap="1" wp14:anchorId="5D4DA1EC" wp14:editId="0649BC38">
                 <wp:simplePos x="0" y="0"/>
                 <wp:positionH relativeFrom="column">
                   <wp:posOffset>-1094740</wp:posOffset>
@@ -8137,7 +8076,7 @@
         <mc:AlternateContent>
           <mc:Choice Requires="wps">
             <w:drawing>
-              <wp:anchor distT="0" distB="0" distL="114300" distR="114300" simplePos="0" relativeHeight="251658275" behindDoc="0" locked="0" layoutInCell="1" allowOverlap="1" wp14:anchorId="55C66FE2" wp14:editId="38BF0C24">
+              <wp:anchor distT="0" distB="0" distL="114300" distR="114300" simplePos="0" relativeHeight="251658274" behindDoc="0" locked="0" layoutInCell="1" allowOverlap="1" wp14:anchorId="55C66FE2" wp14:editId="38BF0C24">
                 <wp:simplePos x="0" y="0"/>
                 <wp:positionH relativeFrom="column">
                   <wp:posOffset>-1090930</wp:posOffset>
@@ -8255,7 +8194,7 @@
         <mc:AlternateContent>
           <mc:Choice Requires="wps">
             <w:drawing>
-              <wp:anchor distT="0" distB="0" distL="114300" distR="114300" simplePos="0" relativeHeight="251658277" behindDoc="0" locked="0" layoutInCell="1" allowOverlap="1" wp14:anchorId="215A77A2" wp14:editId="26AC4EF4">
+              <wp:anchor distT="0" distB="0" distL="114300" distR="114300" simplePos="0" relativeHeight="251658276" behindDoc="0" locked="0" layoutInCell="1" allowOverlap="1" wp14:anchorId="215A77A2" wp14:editId="26AC4EF4">
                 <wp:simplePos x="0" y="0"/>
                 <wp:positionH relativeFrom="column">
                   <wp:posOffset>-840510</wp:posOffset>
@@ -8552,7 +8491,7 @@
         <mc:AlternateContent>
           <mc:Choice Requires="wps">
             <w:drawing>
-              <wp:anchor distT="0" distB="0" distL="114300" distR="114300" simplePos="0" relativeHeight="251658278" behindDoc="0" locked="0" layoutInCell="1" allowOverlap="1" wp14:anchorId="55FF92FA" wp14:editId="48B66F6A">
+              <wp:anchor distT="0" distB="0" distL="114300" distR="114300" simplePos="0" relativeHeight="251658277" behindDoc="0" locked="0" layoutInCell="1" allowOverlap="1" wp14:anchorId="55FF92FA" wp14:editId="48B66F6A">
                 <wp:simplePos x="0" y="0"/>
                 <wp:positionH relativeFrom="column">
                   <wp:posOffset>-840510</wp:posOffset>
@@ -9112,7 +9051,7 @@
         <mc:AlternateContent>
           <mc:Choice Requires="wps">
             <w:drawing>
-              <wp:anchor distT="0" distB="0" distL="114300" distR="114300" simplePos="0" relativeHeight="251658279" behindDoc="0" locked="0" layoutInCell="1" allowOverlap="1" wp14:anchorId="4FD87BB1" wp14:editId="3F0E1AFB">
+              <wp:anchor distT="0" distB="0" distL="114300" distR="114300" simplePos="0" relativeHeight="251658278" behindDoc="0" locked="0" layoutInCell="1" allowOverlap="1" wp14:anchorId="4FD87BB1" wp14:editId="3F0E1AFB">
                 <wp:simplePos x="0" y="0"/>
                 <wp:positionH relativeFrom="column">
                   <wp:posOffset>-840510</wp:posOffset>
@@ -11049,6 +10988,246 @@
     <w:p>
       <w:pPr>
         <w:rPr>
+          <w:sz w:val="36"/>
+          <w:szCs w:val="32"/>
+        </w:rPr>
+      </w:pPr>
+      <w:r>
+        <w:rPr>
+          <w:sz w:val="36"/>
+          <w:szCs w:val="32"/>
+        </w:rPr>
+        <w:br w:type="page"/>
+      </w:r>
+    </w:p>
+    <w:p>
+      <w:pPr>
+        <w:rPr>
+          <w:rFonts w:ascii="Baskerville" w:hAnsi="Baskerville"/>
+        </w:rPr>
+      </w:pPr>
+    </w:p>
+    <w:p>
+      <w:pPr>
+        <w:spacing w:line="276" w:lineRule="auto"/>
+        <w:jc w:val="both"/>
+        <w:rPr>
+          <w:rFonts w:ascii="Baskerville" w:hAnsi="Baskerville"/>
+        </w:rPr>
+      </w:pPr>
+      <w:r>
+        <w:rPr>
+          <w:noProof/>
+          <w:sz w:val="36"/>
+          <w:szCs w:val="32"/>
+        </w:rPr>
+        <mc:AlternateContent>
+          <mc:Choice Requires="wps">
+            <w:drawing>
+              <wp:anchor distT="0" distB="0" distL="114300" distR="114300" simplePos="0" relativeHeight="251658286" behindDoc="0" locked="0" layoutInCell="1" allowOverlap="1" wp14:anchorId="3DF728A8" wp14:editId="4DDF78FE">
+                <wp:simplePos x="0" y="0"/>
+                <wp:positionH relativeFrom="column">
+                  <wp:posOffset>-1094740</wp:posOffset>
+                </wp:positionH>
+                <wp:positionV relativeFrom="paragraph">
+                  <wp:posOffset>157480</wp:posOffset>
+                </wp:positionV>
+                <wp:extent cx="7745656" cy="128239"/>
+                <wp:effectExtent l="0" t="0" r="0" b="0"/>
+                <wp:wrapNone/>
+                <wp:docPr id="1952462055" name="Equal 21"/>
+                <wp:cNvGraphicFramePr/>
+                <a:graphic xmlns:a="http://schemas.openxmlformats.org/drawingml/2006/main">
+                  <a:graphicData uri="http://schemas.microsoft.com/office/word/2010/wordprocessingShape">
+                    <wps:wsp>
+                      <wps:cNvSpPr/>
+                      <wps:spPr>
+                        <a:xfrm>
+                          <a:off x="0" y="0"/>
+                          <a:ext cx="7745656" cy="128239"/>
+                        </a:xfrm>
+                        <a:prstGeom prst="mathEqual">
+                          <a:avLst>
+                            <a:gd name="adj1" fmla="val 23520"/>
+                            <a:gd name="adj2" fmla="val 18918"/>
+                          </a:avLst>
+                        </a:prstGeom>
+                        <a:solidFill>
+                          <a:schemeClr val="bg1">
+                            <a:lumMod val="85000"/>
+                          </a:schemeClr>
+                        </a:solidFill>
+                        <a:ln>
+                          <a:noFill/>
+                        </a:ln>
+                      </wps:spPr>
+                      <wps:style>
+                        <a:lnRef idx="2">
+                          <a:schemeClr val="dk1">
+                            <a:shade val="15000"/>
+                          </a:schemeClr>
+                        </a:lnRef>
+                        <a:fillRef idx="1">
+                          <a:schemeClr val="dk1"/>
+                        </a:fillRef>
+                        <a:effectRef idx="0">
+                          <a:schemeClr val="dk1"/>
+                        </a:effectRef>
+                        <a:fontRef idx="minor">
+                          <a:schemeClr val="lt1"/>
+                        </a:fontRef>
+                      </wps:style>
+                      <wps:bodyPr rot="0" spcFirstLastPara="0" vertOverflow="overflow" horzOverflow="overflow" vert="horz" wrap="square" lIns="91440" tIns="45720" rIns="91440" bIns="45720" numCol="1" spcCol="0" rtlCol="0" fromWordArt="0" anchor="ctr" anchorCtr="0" forceAA="0" compatLnSpc="1">
+                        <a:prstTxWarp prst="textNoShape">
+                          <a:avLst/>
+                        </a:prstTxWarp>
+                        <a:noAutofit/>
+                      </wps:bodyPr>
+                    </wps:wsp>
+                  </a:graphicData>
+                </a:graphic>
+                <wp14:sizeRelH relativeFrom="margin">
+                  <wp14:pctWidth>0</wp14:pctWidth>
+                </wp14:sizeRelH>
+                <wp14:sizeRelV relativeFrom="margin">
+                  <wp14:pctHeight>0</wp14:pctHeight>
+                </wp14:sizeRelV>
+              </wp:anchor>
+            </w:drawing>
+          </mc:Choice>
+          <mc:Fallback>
+            <w:pict>
+              <v:shape w14:anchorId="569C1859" id="Equal 21" o:spid="_x0000_s1026" style="position:absolute;margin-left:-86.2pt;margin-top:12.4pt;width:609.9pt;height:10.1pt;z-index:251658286;visibility:visible;mso-wrap-style:square;mso-width-percent:0;mso-height-percent:0;mso-wrap-distance-left:9pt;mso-wrap-distance-top:0;mso-wrap-distance-right:9pt;mso-wrap-distance-bottom:0;mso-position-horizontal:absolute;mso-position-horizontal-relative:text;mso-position-vertical:absolute;mso-position-vertical-relative:text;mso-width-percent:0;mso-height-percent:0;mso-width-relative:margin;mso-height-relative:margin;v-text-anchor:middle" coordsize="7745656,128239" o:gfxdata="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" path="m1026687,21828r5692282,l6718969,51989r-5692282,l1026687,21828xm1026687,76250r5692282,l6718969,106411r-5692282,l1026687,76250xe" fillcolor="#d8d8d8 [2732]" stroked="f" strokeweight="1pt">
+                <v:stroke joinstyle="miter"/>
+                <v:path arrowok="t" o:connecttype="custom" o:connectlocs="1026687,21828;6718969,21828;6718969,51989;1026687,51989;1026687,21828;1026687,76250;6718969,76250;6718969,106411;1026687,106411;1026687,76250" o:connectangles="0,0,0,0,0,0,0,0,0,0"/>
+              </v:shape>
+            </w:pict>
+          </mc:Fallback>
+        </mc:AlternateContent>
+      </w:r>
+    </w:p>
+    <w:p>
+      <w:pPr>
+        <w:pStyle w:val="Heading1"/>
+        <w:rPr>
+          <w:rStyle w:val="TitleChar"/>
+        </w:rPr>
+      </w:pPr>
+      <w:r>
+        <w:rPr>
+          <w:noProof/>
+          <w:sz w:val="44"/>
+          <w:szCs w:val="40"/>
+        </w:rPr>
+        <mc:AlternateContent>
+          <mc:Choice Requires="wps">
+            <w:drawing>
+              <wp:anchor distT="0" distB="0" distL="114300" distR="114300" simplePos="0" relativeHeight="251658285" behindDoc="0" locked="0" layoutInCell="1" allowOverlap="1" wp14:anchorId="11317873" wp14:editId="31E694E4">
+                <wp:simplePos x="0" y="0"/>
+                <wp:positionH relativeFrom="column">
+                  <wp:posOffset>-1090930</wp:posOffset>
+                </wp:positionH>
+                <wp:positionV relativeFrom="paragraph">
+                  <wp:posOffset>302260</wp:posOffset>
+                </wp:positionV>
+                <wp:extent cx="7745656" cy="128239"/>
+                <wp:effectExtent l="0" t="0" r="0" b="0"/>
+                <wp:wrapNone/>
+                <wp:docPr id="1698794379" name="Equal 21"/>
+                <wp:cNvGraphicFramePr/>
+                <a:graphic xmlns:a="http://schemas.openxmlformats.org/drawingml/2006/main">
+                  <a:graphicData uri="http://schemas.microsoft.com/office/word/2010/wordprocessingShape">
+                    <wps:wsp>
+                      <wps:cNvSpPr/>
+                      <wps:spPr>
+                        <a:xfrm>
+                          <a:off x="0" y="0"/>
+                          <a:ext cx="7745656" cy="128239"/>
+                        </a:xfrm>
+                        <a:prstGeom prst="mathEqual">
+                          <a:avLst>
+                            <a:gd name="adj1" fmla="val 23520"/>
+                            <a:gd name="adj2" fmla="val 18918"/>
+                          </a:avLst>
+                        </a:prstGeom>
+                        <a:solidFill>
+                          <a:schemeClr val="bg1">
+                            <a:lumMod val="85000"/>
+                          </a:schemeClr>
+                        </a:solidFill>
+                        <a:ln>
+                          <a:noFill/>
+                        </a:ln>
+                      </wps:spPr>
+                      <wps:style>
+                        <a:lnRef idx="2">
+                          <a:schemeClr val="dk1">
+                            <a:shade val="15000"/>
+                          </a:schemeClr>
+                        </a:lnRef>
+                        <a:fillRef idx="1">
+                          <a:schemeClr val="dk1"/>
+                        </a:fillRef>
+                        <a:effectRef idx="0">
+                          <a:schemeClr val="dk1"/>
+                        </a:effectRef>
+                        <a:fontRef idx="minor">
+                          <a:schemeClr val="lt1"/>
+                        </a:fontRef>
+                      </wps:style>
+                      <wps:bodyPr rot="0" spcFirstLastPara="0" vertOverflow="overflow" horzOverflow="overflow" vert="horz" wrap="square" lIns="91440" tIns="45720" rIns="91440" bIns="45720" numCol="1" spcCol="0" rtlCol="0" fromWordArt="0" anchor="ctr" anchorCtr="0" forceAA="0" compatLnSpc="1">
+                        <a:prstTxWarp prst="textNoShape">
+                          <a:avLst/>
+                        </a:prstTxWarp>
+                        <a:noAutofit/>
+                      </wps:bodyPr>
+                    </wps:wsp>
+                  </a:graphicData>
+                </a:graphic>
+                <wp14:sizeRelH relativeFrom="margin">
+                  <wp14:pctWidth>0</wp14:pctWidth>
+                </wp14:sizeRelH>
+                <wp14:sizeRelV relativeFrom="margin">
+                  <wp14:pctHeight>0</wp14:pctHeight>
+                </wp14:sizeRelV>
+              </wp:anchor>
+            </w:drawing>
+          </mc:Choice>
+          <mc:Fallback>
+            <w:pict>
+              <v:shape w14:anchorId="208B49F7" id="Equal 21" o:spid="_x0000_s1026" style="position:absolute;margin-left:-85.9pt;margin-top:23.8pt;width:609.9pt;height:10.1pt;z-index:251658285;visibility:visible;mso-wrap-style:square;mso-width-percent:0;mso-height-percent:0;mso-wrap-distance-left:9pt;mso-wrap-distance-top:0;mso-wrap-distance-right:9pt;mso-wrap-distance-bottom:0;mso-position-horizontal:absolute;mso-position-horizontal-relative:text;mso-position-vertical:absolute;mso-position-vertical-relative:text;mso-width-percent:0;mso-height-percent:0;mso-width-relative:margin;mso-height-relative:margin;v-text-anchor:middle" coordsize="7745656,128239" o:gfxdata="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" path="m1026687,21828r5692282,l6718969,51989r-5692282,l1026687,21828xm1026687,76250r5692282,l6718969,106411r-5692282,l1026687,76250xe" fillcolor="#d8d8d8 [2732]" stroked="f" strokeweight="1pt">
+                <v:stroke joinstyle="miter"/>
+                <v:path arrowok="t" o:connecttype="custom" o:connectlocs="1026687,21828;6718969,21828;6718969,51989;1026687,51989;1026687,21828;1026687,76250;6718969,76250;6718969,106411;1026687,106411;1026687,76250" o:connectangles="0,0,0,0,0,0,0,0,0,0"/>
+              </v:shape>
+            </w:pict>
+          </mc:Fallback>
+        </mc:AlternateContent>
+      </w:r>
+      <w:r>
+        <w:rPr>
+          <w:sz w:val="44"/>
+          <w:szCs w:val="40"/>
+        </w:rPr>
+        <w:t>7.</w:t>
+      </w:r>
+      <w:r>
+        <w:rPr>
+          <w:sz w:val="44"/>
+          <w:szCs w:val="40"/>
+        </w:rPr>
+        <w:t xml:space="preserve"> </w:t>
+      </w:r>
+      <w:r>
+        <w:rPr>
+          <w:sz w:val="44"/>
+          <w:szCs w:val="40"/>
+        </w:rPr>
+        <w:t>Puntos de Función</w:t>
+      </w:r>
+    </w:p>
+    <w:p>
+      <w:pPr>
+        <w:rPr>
           <w:rFonts w:ascii="Baskerville" w:eastAsiaTheme="majorEastAsia" w:hAnsi="Baskerville" w:cstheme="majorBidi"/>
           <w:color w:val="595959" w:themeColor="text1" w:themeTint="A6"/>
           <w:spacing w:val="15"/>
@@ -11056,33 +11235,3092 @@
           <w:szCs w:val="32"/>
         </w:rPr>
       </w:pPr>
-      <w:r>
-        <w:rPr>
-          <w:sz w:val="36"/>
-          <w:szCs w:val="32"/>
-        </w:rPr>
-        <w:br w:type="page"/>
-      </w:r>
-    </w:p>
-    <w:p>
-      <w:pPr>
-        <w:spacing w:line="276" w:lineRule="auto"/>
-        <w:jc w:val="both"/>
-        <w:rPr>
-          <w:rFonts w:ascii="Baskerville" w:hAnsi="Baskerville"/>
-        </w:rPr>
+    </w:p>
+    <w:p>
+      <w:pPr>
+        <w:pStyle w:val="Heading2"/>
       </w:pPr>
       <w:r>
         <w:rPr>
           <w:noProof/>
           <w:sz w:val="36"/>
           <w:szCs w:val="32"/>
+        </w:rPr>
+        <w:drawing>
+          <wp:anchor distT="0" distB="0" distL="114300" distR="114300" simplePos="0" relativeHeight="251658288" behindDoc="0" locked="0" layoutInCell="1" allowOverlap="1" wp14:anchorId="6C837166" wp14:editId="1D013690">
+            <wp:simplePos x="0" y="0"/>
+            <wp:positionH relativeFrom="column">
+              <wp:posOffset>-616585</wp:posOffset>
+            </wp:positionH>
+            <wp:positionV relativeFrom="paragraph">
+              <wp:posOffset>551313</wp:posOffset>
+            </wp:positionV>
+            <wp:extent cx="6823710" cy="2471420"/>
+            <wp:effectExtent l="0" t="0" r="0" b="5080"/>
+            <wp:wrapTopAndBottom/>
+            <wp:docPr id="1318150330" name="Picture 54"/>
+            <wp:cNvGraphicFramePr>
+              <a:graphicFrameLocks xmlns:a="http://schemas.openxmlformats.org/drawingml/2006/main" noChangeAspect="1"/>
+            </wp:cNvGraphicFramePr>
+            <a:graphic xmlns:a="http://schemas.openxmlformats.org/drawingml/2006/main">
+              <a:graphicData uri="http://schemas.openxmlformats.org/drawingml/2006/picture">
+                <pic:pic xmlns:pic="http://schemas.openxmlformats.org/drawingml/2006/picture">
+                  <pic:nvPicPr>
+                    <pic:cNvPr id="1318150330" name="Picture 1318150330"/>
+                    <pic:cNvPicPr/>
+                  </pic:nvPicPr>
+                  <pic:blipFill>
+                    <a:blip r:embed="rId15" cstate="print">
+                      <a:extLst>
+                        <a:ext uri="{28A0092B-C50C-407E-A947-70E740481C1C}">
+                          <a14:useLocalDpi xmlns:a14="http://schemas.microsoft.com/office/drawing/2010/main" val="0"/>
+                        </a:ext>
+                      </a:extLst>
+                    </a:blip>
+                    <a:stretch>
+                      <a:fillRect/>
+                    </a:stretch>
+                  </pic:blipFill>
+                  <pic:spPr>
+                    <a:xfrm>
+                      <a:off x="0" y="0"/>
+                      <a:ext cx="6823710" cy="2471420"/>
+                    </a:xfrm>
+                    <a:prstGeom prst="rect">
+                      <a:avLst/>
+                    </a:prstGeom>
+                  </pic:spPr>
+                </pic:pic>
+              </a:graphicData>
+            </a:graphic>
+            <wp14:sizeRelH relativeFrom="page">
+              <wp14:pctWidth>0</wp14:pctWidth>
+            </wp14:sizeRelH>
+            <wp14:sizeRelV relativeFrom="page">
+              <wp14:pctHeight>0</wp14:pctHeight>
+            </wp14:sizeRelV>
+          </wp:anchor>
+        </w:drawing>
+      </w:r>
+      <w:r>
+        <w:rPr>
+          <w:noProof/>
+          <w:sz w:val="36"/>
+          <w:szCs w:val="32"/>
+        </w:rPr>
+        <mc:AlternateContent>
+          <mc:Choice Requires="wps">
+            <w:drawing>
+              <wp:anchor distT="0" distB="0" distL="114300" distR="114300" simplePos="0" relativeHeight="251658287" behindDoc="0" locked="0" layoutInCell="1" allowOverlap="1" wp14:anchorId="46CDC45F" wp14:editId="27642EFB">
+                <wp:simplePos x="0" y="0"/>
+                <wp:positionH relativeFrom="column">
+                  <wp:posOffset>-840510</wp:posOffset>
+                </wp:positionH>
+                <wp:positionV relativeFrom="paragraph">
+                  <wp:posOffset>211802</wp:posOffset>
+                </wp:positionV>
+                <wp:extent cx="6257925" cy="127635"/>
+                <wp:effectExtent l="0" t="0" r="0" b="0"/>
+                <wp:wrapNone/>
+                <wp:docPr id="1728193337" name="Equal 21"/>
+                <wp:cNvGraphicFramePr/>
+                <a:graphic xmlns:a="http://schemas.openxmlformats.org/drawingml/2006/main">
+                  <a:graphicData uri="http://schemas.microsoft.com/office/word/2010/wordprocessingShape">
+                    <wps:wsp>
+                      <wps:cNvSpPr/>
+                      <wps:spPr>
+                        <a:xfrm>
+                          <a:off x="0" y="0"/>
+                          <a:ext cx="6257925" cy="127635"/>
+                        </a:xfrm>
+                        <a:prstGeom prst="mathEqual">
+                          <a:avLst>
+                            <a:gd name="adj1" fmla="val 7284"/>
+                            <a:gd name="adj2" fmla="val 18918"/>
+                          </a:avLst>
+                        </a:prstGeom>
+                        <a:solidFill>
+                          <a:schemeClr val="bg1">
+                            <a:lumMod val="85000"/>
+                          </a:schemeClr>
+                        </a:solidFill>
+                        <a:ln>
+                          <a:noFill/>
+                        </a:ln>
+                      </wps:spPr>
+                      <wps:style>
+                        <a:lnRef idx="2">
+                          <a:schemeClr val="dk1">
+                            <a:shade val="15000"/>
+                          </a:schemeClr>
+                        </a:lnRef>
+                        <a:fillRef idx="1">
+                          <a:schemeClr val="dk1"/>
+                        </a:fillRef>
+                        <a:effectRef idx="0">
+                          <a:schemeClr val="dk1"/>
+                        </a:effectRef>
+                        <a:fontRef idx="minor">
+                          <a:schemeClr val="lt1"/>
+                        </a:fontRef>
+                      </wps:style>
+                      <wps:bodyPr rot="0" spcFirstLastPara="0" vertOverflow="overflow" horzOverflow="overflow" vert="horz" wrap="square" lIns="91440" tIns="45720" rIns="91440" bIns="45720" numCol="1" spcCol="0" rtlCol="0" fromWordArt="0" anchor="ctr" anchorCtr="0" forceAA="0" compatLnSpc="1">
+                        <a:prstTxWarp prst="textNoShape">
+                          <a:avLst/>
+                        </a:prstTxWarp>
+                        <a:noAutofit/>
+                      </wps:bodyPr>
+                    </wps:wsp>
+                  </a:graphicData>
+                </a:graphic>
+                <wp14:sizeRelH relativeFrom="margin">
+                  <wp14:pctWidth>0</wp14:pctWidth>
+                </wp14:sizeRelH>
+                <wp14:sizeRelV relativeFrom="margin">
+                  <wp14:pctHeight>0</wp14:pctHeight>
+                </wp14:sizeRelV>
+              </wp:anchor>
+            </w:drawing>
+          </mc:Choice>
+          <mc:Fallback>
+            <w:pict>
+              <v:shape w14:anchorId="3502B85F" id="Equal 21" o:spid="_x0000_s1026" style="position:absolute;margin-left:-66.2pt;margin-top:16.7pt;width:492.75pt;height:10.05pt;z-index:251658287;visibility:visible;mso-wrap-style:square;mso-width-percent:0;mso-height-percent:0;mso-wrap-distance-left:9pt;mso-wrap-distance-top:0;mso-wrap-distance-right:9pt;mso-wrap-distance-bottom:0;mso-position-horizontal:absolute;mso-position-horizontal-relative:text;mso-position-vertical:absolute;mso-position-vertical-relative:text;mso-width-percent:0;mso-height-percent:0;mso-width-relative:margin;mso-height-relative:margin;v-text-anchor:middle" coordsize="6257925,127635" o:gfxdata="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" path="m829488,42448r4598949,l5428437,51745r-4598949,l829488,42448xm829488,75890r4598949,l5428437,85187r-4598949,l829488,75890xe" fillcolor="#d8d8d8 [2732]" stroked="f" strokeweight="1pt">
+                <v:stroke joinstyle="miter"/>
+                <v:path arrowok="t" o:connecttype="custom" o:connectlocs="829488,42448;5428437,42448;5428437,51745;829488,51745;829488,42448;829488,75890;5428437,75890;5428437,85187;829488,85187;829488,75890" o:connectangles="0,0,0,0,0,0,0,0,0,0"/>
+              </v:shape>
+            </w:pict>
+          </mc:Fallback>
+        </mc:AlternateContent>
+      </w:r>
+      <w:r>
+        <w:t>7</w:t>
+      </w:r>
+      <w:r>
+        <w:t>.</w:t>
+      </w:r>
+      <w:r>
+        <w:t>1</w:t>
+      </w:r>
+      <w:r>
+        <w:t xml:space="preserve"> </w:t>
+      </w:r>
+      <w:r>
+        <w:t>Detalle de Componentes del Sistema</w:t>
+      </w:r>
+    </w:p>
+    <w:p>
+      <w:pPr>
+        <w:rPr>
+          <w:rFonts w:ascii="Baskerville" w:eastAsiaTheme="majorEastAsia" w:hAnsi="Baskerville" w:cstheme="majorBidi"/>
+          <w:color w:val="595959" w:themeColor="text1" w:themeTint="A6"/>
+          <w:spacing w:val="15"/>
+          <w:sz w:val="36"/>
+          <w:szCs w:val="32"/>
+        </w:rPr>
+      </w:pPr>
+    </w:p>
+    <w:p>
+      <w:pPr>
+        <w:rPr>
+          <w:rFonts w:ascii="Baskerville" w:eastAsiaTheme="majorEastAsia" w:hAnsi="Baskerville" w:cstheme="majorBidi"/>
+          <w:color w:val="595959" w:themeColor="text1" w:themeTint="A6"/>
+          <w:spacing w:val="15"/>
+          <w:sz w:val="36"/>
+          <w:szCs w:val="32"/>
+        </w:rPr>
+      </w:pPr>
+    </w:p>
+    <w:p>
+      <w:pPr>
+        <w:pStyle w:val="Heading2"/>
+      </w:pPr>
+      <w:r>
+        <w:rPr>
+          <w:noProof/>
+          <w:sz w:val="36"/>
+          <w:szCs w:val="32"/>
+        </w:rPr>
+        <w:drawing>
+          <wp:anchor distT="0" distB="0" distL="114300" distR="114300" simplePos="0" relativeHeight="251658293" behindDoc="0" locked="0" layoutInCell="1" allowOverlap="1" wp14:anchorId="559DD7F5" wp14:editId="00681A00">
+            <wp:simplePos x="0" y="0"/>
+            <wp:positionH relativeFrom="column">
+              <wp:posOffset>-248861</wp:posOffset>
+            </wp:positionH>
+            <wp:positionV relativeFrom="paragraph">
+              <wp:posOffset>501280</wp:posOffset>
+            </wp:positionV>
+            <wp:extent cx="5588000" cy="1473200"/>
+            <wp:effectExtent l="0" t="0" r="0" b="0"/>
+            <wp:wrapTopAndBottom/>
+            <wp:docPr id="1022494454" name="Picture 55"/>
+            <wp:cNvGraphicFramePr>
+              <a:graphicFrameLocks xmlns:a="http://schemas.openxmlformats.org/drawingml/2006/main" noChangeAspect="1"/>
+            </wp:cNvGraphicFramePr>
+            <a:graphic xmlns:a="http://schemas.openxmlformats.org/drawingml/2006/main">
+              <a:graphicData uri="http://schemas.openxmlformats.org/drawingml/2006/picture">
+                <pic:pic xmlns:pic="http://schemas.openxmlformats.org/drawingml/2006/picture">
+                  <pic:nvPicPr>
+                    <pic:cNvPr id="1022494454" name="Picture 1022494454"/>
+                    <pic:cNvPicPr/>
+                  </pic:nvPicPr>
+                  <pic:blipFill>
+                    <a:blip r:embed="rId16">
+                      <a:extLst>
+                        <a:ext uri="{28A0092B-C50C-407E-A947-70E740481C1C}">
+                          <a14:useLocalDpi xmlns:a14="http://schemas.microsoft.com/office/drawing/2010/main" val="0"/>
+                        </a:ext>
+                      </a:extLst>
+                    </a:blip>
+                    <a:stretch>
+                      <a:fillRect/>
+                    </a:stretch>
+                  </pic:blipFill>
+                  <pic:spPr>
+                    <a:xfrm>
+                      <a:off x="0" y="0"/>
+                      <a:ext cx="5588000" cy="1473200"/>
+                    </a:xfrm>
+                    <a:prstGeom prst="rect">
+                      <a:avLst/>
+                    </a:prstGeom>
+                  </pic:spPr>
+                </pic:pic>
+              </a:graphicData>
+            </a:graphic>
+            <wp14:sizeRelH relativeFrom="page">
+              <wp14:pctWidth>0</wp14:pctWidth>
+            </wp14:sizeRelH>
+            <wp14:sizeRelV relativeFrom="page">
+              <wp14:pctHeight>0</wp14:pctHeight>
+            </wp14:sizeRelV>
+          </wp:anchor>
+        </w:drawing>
+      </w:r>
+      <w:r>
+        <w:rPr>
+          <w:noProof/>
+          <w:sz w:val="36"/>
+          <w:szCs w:val="32"/>
+        </w:rPr>
+        <mc:AlternateContent>
+          <mc:Choice Requires="wps">
+            <w:drawing>
+              <wp:anchor distT="0" distB="0" distL="114300" distR="114300" simplePos="0" relativeHeight="251658289" behindDoc="0" locked="0" layoutInCell="1" allowOverlap="1" wp14:anchorId="0DB37543" wp14:editId="38A63D65">
+                <wp:simplePos x="0" y="0"/>
+                <wp:positionH relativeFrom="column">
+                  <wp:posOffset>-840510</wp:posOffset>
+                </wp:positionH>
+                <wp:positionV relativeFrom="paragraph">
+                  <wp:posOffset>211802</wp:posOffset>
+                </wp:positionV>
+                <wp:extent cx="6257925" cy="127635"/>
+                <wp:effectExtent l="0" t="0" r="0" b="0"/>
+                <wp:wrapNone/>
+                <wp:docPr id="434007149" name="Equal 21"/>
+                <wp:cNvGraphicFramePr/>
+                <a:graphic xmlns:a="http://schemas.openxmlformats.org/drawingml/2006/main">
+                  <a:graphicData uri="http://schemas.microsoft.com/office/word/2010/wordprocessingShape">
+                    <wps:wsp>
+                      <wps:cNvSpPr/>
+                      <wps:spPr>
+                        <a:xfrm>
+                          <a:off x="0" y="0"/>
+                          <a:ext cx="6257925" cy="127635"/>
+                        </a:xfrm>
+                        <a:prstGeom prst="mathEqual">
+                          <a:avLst>
+                            <a:gd name="adj1" fmla="val 7284"/>
+                            <a:gd name="adj2" fmla="val 18918"/>
+                          </a:avLst>
+                        </a:prstGeom>
+                        <a:solidFill>
+                          <a:schemeClr val="bg1">
+                            <a:lumMod val="85000"/>
+                          </a:schemeClr>
+                        </a:solidFill>
+                        <a:ln>
+                          <a:noFill/>
+                        </a:ln>
+                      </wps:spPr>
+                      <wps:style>
+                        <a:lnRef idx="2">
+                          <a:schemeClr val="dk1">
+                            <a:shade val="15000"/>
+                          </a:schemeClr>
+                        </a:lnRef>
+                        <a:fillRef idx="1">
+                          <a:schemeClr val="dk1"/>
+                        </a:fillRef>
+                        <a:effectRef idx="0">
+                          <a:schemeClr val="dk1"/>
+                        </a:effectRef>
+                        <a:fontRef idx="minor">
+                          <a:schemeClr val="lt1"/>
+                        </a:fontRef>
+                      </wps:style>
+                      <wps:bodyPr rot="0" spcFirstLastPara="0" vertOverflow="overflow" horzOverflow="overflow" vert="horz" wrap="square" lIns="91440" tIns="45720" rIns="91440" bIns="45720" numCol="1" spcCol="0" rtlCol="0" fromWordArt="0" anchor="ctr" anchorCtr="0" forceAA="0" compatLnSpc="1">
+                        <a:prstTxWarp prst="textNoShape">
+                          <a:avLst/>
+                        </a:prstTxWarp>
+                        <a:noAutofit/>
+                      </wps:bodyPr>
+                    </wps:wsp>
+                  </a:graphicData>
+                </a:graphic>
+                <wp14:sizeRelH relativeFrom="margin">
+                  <wp14:pctWidth>0</wp14:pctWidth>
+                </wp14:sizeRelH>
+                <wp14:sizeRelV relativeFrom="margin">
+                  <wp14:pctHeight>0</wp14:pctHeight>
+                </wp14:sizeRelV>
+              </wp:anchor>
+            </w:drawing>
+          </mc:Choice>
+          <mc:Fallback>
+            <w:pict>
+              <v:shape w14:anchorId="566BAF27" id="Equal 21" o:spid="_x0000_s1026" style="position:absolute;margin-left:-66.2pt;margin-top:16.7pt;width:492.75pt;height:10.05pt;z-index:251658289;visibility:visible;mso-wrap-style:square;mso-width-percent:0;mso-height-percent:0;mso-wrap-distance-left:9pt;mso-wrap-distance-top:0;mso-wrap-distance-right:9pt;mso-wrap-distance-bottom:0;mso-position-horizontal:absolute;mso-position-horizontal-relative:text;mso-position-vertical:absolute;mso-position-vertical-relative:text;mso-width-percent:0;mso-height-percent:0;mso-width-relative:margin;mso-height-relative:margin;v-text-anchor:middle" coordsize="6257925,127635" o:gfxdata="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" path="m829488,42448r4598949,l5428437,51745r-4598949,l829488,42448xm829488,75890r4598949,l5428437,85187r-4598949,l829488,75890xe" fillcolor="#d8d8d8 [2732]" stroked="f" strokeweight="1pt">
+                <v:stroke joinstyle="miter"/>
+                <v:path arrowok="t" o:connecttype="custom" o:connectlocs="829488,42448;5428437,42448;5428437,51745;829488,51745;829488,42448;829488,75890;5428437,75890;5428437,85187;829488,85187;829488,75890" o:connectangles="0,0,0,0,0,0,0,0,0,0"/>
+              </v:shape>
+            </w:pict>
+          </mc:Fallback>
+        </mc:AlternateContent>
+      </w:r>
+      <w:r>
+        <w:t>7</w:t>
+      </w:r>
+      <w:r>
+        <w:t>.2</w:t>
+      </w:r>
+      <w:r>
+        <w:t xml:space="preserve"> </w:t>
+      </w:r>
+      <w:r>
+        <w:t>Puntos de Función sin Ajustar</w:t>
+      </w:r>
+    </w:p>
+    <w:p>
+      <w:pPr>
+        <w:rPr>
+          <w:rFonts w:ascii="Baskerville" w:eastAsiaTheme="majorEastAsia" w:hAnsi="Baskerville" w:cstheme="majorBidi"/>
+          <w:color w:val="595959" w:themeColor="text1" w:themeTint="A6"/>
+          <w:spacing w:val="15"/>
+          <w:sz w:val="36"/>
+          <w:szCs w:val="32"/>
+        </w:rPr>
+      </w:pPr>
+    </w:p>
+    <w:p>
+      <w:pPr>
+        <w:pStyle w:val="Heading2"/>
+      </w:pPr>
+    </w:p>
+    <w:p/>
+    <w:p>
+      <w:pPr>
+        <w:pStyle w:val="Heading2"/>
+      </w:pPr>
+      <w:r>
+        <w:rPr>
+          <w:noProof/>
+          <w:sz w:val="36"/>
+          <w:szCs w:val="32"/>
+        </w:rPr>
+        <w:lastRenderedPageBreak/>
+        <w:drawing>
+          <wp:anchor distT="0" distB="0" distL="114300" distR="114300" simplePos="0" relativeHeight="251658294" behindDoc="0" locked="0" layoutInCell="1" allowOverlap="1" wp14:anchorId="39B7E406" wp14:editId="15459A07">
+            <wp:simplePos x="0" y="0"/>
+            <wp:positionH relativeFrom="column">
+              <wp:posOffset>3810</wp:posOffset>
+            </wp:positionH>
+            <wp:positionV relativeFrom="paragraph">
+              <wp:posOffset>513819</wp:posOffset>
+            </wp:positionV>
+            <wp:extent cx="5612130" cy="3408680"/>
+            <wp:effectExtent l="0" t="0" r="1270" b="0"/>
+            <wp:wrapTopAndBottom/>
+            <wp:docPr id="1621226466" name="Picture 56"/>
+            <wp:cNvGraphicFramePr>
+              <a:graphicFrameLocks xmlns:a="http://schemas.openxmlformats.org/drawingml/2006/main" noChangeAspect="1"/>
+            </wp:cNvGraphicFramePr>
+            <a:graphic xmlns:a="http://schemas.openxmlformats.org/drawingml/2006/main">
+              <a:graphicData uri="http://schemas.openxmlformats.org/drawingml/2006/picture">
+                <pic:pic xmlns:pic="http://schemas.openxmlformats.org/drawingml/2006/picture">
+                  <pic:nvPicPr>
+                    <pic:cNvPr id="1621226466" name="Picture 1621226466"/>
+                    <pic:cNvPicPr/>
+                  </pic:nvPicPr>
+                  <pic:blipFill>
+                    <a:blip r:embed="rId17" cstate="print">
+                      <a:extLst>
+                        <a:ext uri="{28A0092B-C50C-407E-A947-70E740481C1C}">
+                          <a14:useLocalDpi xmlns:a14="http://schemas.microsoft.com/office/drawing/2010/main" val="0"/>
+                        </a:ext>
+                      </a:extLst>
+                    </a:blip>
+                    <a:stretch>
+                      <a:fillRect/>
+                    </a:stretch>
+                  </pic:blipFill>
+                  <pic:spPr>
+                    <a:xfrm>
+                      <a:off x="0" y="0"/>
+                      <a:ext cx="5612130" cy="3408680"/>
+                    </a:xfrm>
+                    <a:prstGeom prst="rect">
+                      <a:avLst/>
+                    </a:prstGeom>
+                  </pic:spPr>
+                </pic:pic>
+              </a:graphicData>
+            </a:graphic>
+            <wp14:sizeRelH relativeFrom="page">
+              <wp14:pctWidth>0</wp14:pctWidth>
+            </wp14:sizeRelH>
+            <wp14:sizeRelV relativeFrom="page">
+              <wp14:pctHeight>0</wp14:pctHeight>
+            </wp14:sizeRelV>
+          </wp:anchor>
+        </w:drawing>
+      </w:r>
+      <w:r>
+        <w:rPr>
+          <w:noProof/>
+          <w:sz w:val="36"/>
+          <w:szCs w:val="32"/>
+        </w:rPr>
+        <mc:AlternateContent>
+          <mc:Choice Requires="wps">
+            <w:drawing>
+              <wp:anchor distT="0" distB="0" distL="114300" distR="114300" simplePos="0" relativeHeight="251658290" behindDoc="0" locked="0" layoutInCell="1" allowOverlap="1" wp14:anchorId="21E157BB" wp14:editId="5CEF6019">
+                <wp:simplePos x="0" y="0"/>
+                <wp:positionH relativeFrom="column">
+                  <wp:posOffset>-840510</wp:posOffset>
+                </wp:positionH>
+                <wp:positionV relativeFrom="paragraph">
+                  <wp:posOffset>211802</wp:posOffset>
+                </wp:positionV>
+                <wp:extent cx="6257925" cy="127635"/>
+                <wp:effectExtent l="0" t="0" r="0" b="0"/>
+                <wp:wrapNone/>
+                <wp:docPr id="1342347819" name="Equal 21"/>
+                <wp:cNvGraphicFramePr/>
+                <a:graphic xmlns:a="http://schemas.openxmlformats.org/drawingml/2006/main">
+                  <a:graphicData uri="http://schemas.microsoft.com/office/word/2010/wordprocessingShape">
+                    <wps:wsp>
+                      <wps:cNvSpPr/>
+                      <wps:spPr>
+                        <a:xfrm>
+                          <a:off x="0" y="0"/>
+                          <a:ext cx="6257925" cy="127635"/>
+                        </a:xfrm>
+                        <a:prstGeom prst="mathEqual">
+                          <a:avLst>
+                            <a:gd name="adj1" fmla="val 7284"/>
+                            <a:gd name="adj2" fmla="val 18918"/>
+                          </a:avLst>
+                        </a:prstGeom>
+                        <a:solidFill>
+                          <a:schemeClr val="bg1">
+                            <a:lumMod val="85000"/>
+                          </a:schemeClr>
+                        </a:solidFill>
+                        <a:ln>
+                          <a:noFill/>
+                        </a:ln>
+                      </wps:spPr>
+                      <wps:style>
+                        <a:lnRef idx="2">
+                          <a:schemeClr val="dk1">
+                            <a:shade val="15000"/>
+                          </a:schemeClr>
+                        </a:lnRef>
+                        <a:fillRef idx="1">
+                          <a:schemeClr val="dk1"/>
+                        </a:fillRef>
+                        <a:effectRef idx="0">
+                          <a:schemeClr val="dk1"/>
+                        </a:effectRef>
+                        <a:fontRef idx="minor">
+                          <a:schemeClr val="lt1"/>
+                        </a:fontRef>
+                      </wps:style>
+                      <wps:bodyPr rot="0" spcFirstLastPara="0" vertOverflow="overflow" horzOverflow="overflow" vert="horz" wrap="square" lIns="91440" tIns="45720" rIns="91440" bIns="45720" numCol="1" spcCol="0" rtlCol="0" fromWordArt="0" anchor="ctr" anchorCtr="0" forceAA="0" compatLnSpc="1">
+                        <a:prstTxWarp prst="textNoShape">
+                          <a:avLst/>
+                        </a:prstTxWarp>
+                        <a:noAutofit/>
+                      </wps:bodyPr>
+                    </wps:wsp>
+                  </a:graphicData>
+                </a:graphic>
+                <wp14:sizeRelH relativeFrom="margin">
+                  <wp14:pctWidth>0</wp14:pctWidth>
+                </wp14:sizeRelH>
+                <wp14:sizeRelV relativeFrom="margin">
+                  <wp14:pctHeight>0</wp14:pctHeight>
+                </wp14:sizeRelV>
+              </wp:anchor>
+            </w:drawing>
+          </mc:Choice>
+          <mc:Fallback>
+            <w:pict>
+              <v:shape w14:anchorId="471DE975" id="Equal 21" o:spid="_x0000_s1026" style="position:absolute;margin-left:-66.2pt;margin-top:16.7pt;width:492.75pt;height:10.05pt;z-index:251658290;visibility:visible;mso-wrap-style:square;mso-width-percent:0;mso-height-percent:0;mso-wrap-distance-left:9pt;mso-wrap-distance-top:0;mso-wrap-distance-right:9pt;mso-wrap-distance-bottom:0;mso-position-horizontal:absolute;mso-position-horizontal-relative:text;mso-position-vertical:absolute;mso-position-vertical-relative:text;mso-width-percent:0;mso-height-percent:0;mso-width-relative:margin;mso-height-relative:margin;v-text-anchor:middle" coordsize="6257925,127635" o:gfxdata="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" path="m829488,42448r4598949,l5428437,51745r-4598949,l829488,42448xm829488,75890r4598949,l5428437,85187r-4598949,l829488,75890xe" fillcolor="#d8d8d8 [2732]" stroked="f" strokeweight="1pt">
+                <v:stroke joinstyle="miter"/>
+                <v:path arrowok="t" o:connecttype="custom" o:connectlocs="829488,42448;5428437,42448;5428437,51745;829488,51745;829488,42448;829488,75890;5428437,75890;5428437,85187;829488,85187;829488,75890" o:connectangles="0,0,0,0,0,0,0,0,0,0"/>
+              </v:shape>
+            </w:pict>
+          </mc:Fallback>
+        </mc:AlternateContent>
+      </w:r>
+      <w:r>
+        <w:t>7.</w:t>
+      </w:r>
+      <w:r>
+        <w:t>3</w:t>
+      </w:r>
+      <w:r>
+        <w:t xml:space="preserve"> </w:t>
+      </w:r>
+      <w:r>
+        <w:t>Evaluación del Grado de Influencia</w:t>
+      </w:r>
+    </w:p>
+    <w:p>
+      <w:pPr>
+        <w:rPr>
+          <w:rFonts w:ascii="Baskerville" w:eastAsiaTheme="majorEastAsia" w:hAnsi="Baskerville" w:cstheme="majorBidi"/>
+          <w:color w:val="595959" w:themeColor="text1" w:themeTint="A6"/>
+          <w:spacing w:val="15"/>
+          <w:sz w:val="36"/>
+          <w:szCs w:val="32"/>
+        </w:rPr>
+      </w:pPr>
+    </w:p>
+    <w:p>
+      <w:pPr>
+        <w:rPr>
+          <w:rFonts w:ascii="Baskerville" w:eastAsiaTheme="majorEastAsia" w:hAnsi="Baskerville" w:cstheme="majorBidi"/>
+          <w:color w:val="595959" w:themeColor="text1" w:themeTint="A6"/>
+          <w:spacing w:val="15"/>
+          <w:sz w:val="36"/>
+          <w:szCs w:val="32"/>
+        </w:rPr>
+      </w:pPr>
+    </w:p>
+    <w:p>
+      <w:pPr>
+        <w:pStyle w:val="Heading2"/>
+      </w:pPr>
+      <w:r>
+        <w:rPr>
+          <w:noProof/>
+          <w:sz w:val="36"/>
+          <w:szCs w:val="32"/>
+        </w:rPr>
+        <w:drawing>
+          <wp:anchor distT="0" distB="0" distL="114300" distR="114300" simplePos="0" relativeHeight="251658295" behindDoc="0" locked="0" layoutInCell="1" allowOverlap="1" wp14:anchorId="506AF235" wp14:editId="24D92581">
+            <wp:simplePos x="0" y="0"/>
+            <wp:positionH relativeFrom="column">
+              <wp:posOffset>3810</wp:posOffset>
+            </wp:positionH>
+            <wp:positionV relativeFrom="paragraph">
+              <wp:posOffset>502551</wp:posOffset>
+            </wp:positionV>
+            <wp:extent cx="5612130" cy="1334770"/>
+            <wp:effectExtent l="0" t="0" r="1270" b="0"/>
+            <wp:wrapTopAndBottom/>
+            <wp:docPr id="2044277782" name="Picture 57"/>
+            <wp:cNvGraphicFramePr>
+              <a:graphicFrameLocks xmlns:a="http://schemas.openxmlformats.org/drawingml/2006/main" noChangeAspect="1"/>
+            </wp:cNvGraphicFramePr>
+            <a:graphic xmlns:a="http://schemas.openxmlformats.org/drawingml/2006/main">
+              <a:graphicData uri="http://schemas.openxmlformats.org/drawingml/2006/picture">
+                <pic:pic xmlns:pic="http://schemas.openxmlformats.org/drawingml/2006/picture">
+                  <pic:nvPicPr>
+                    <pic:cNvPr id="2044277782" name="Picture 2044277782"/>
+                    <pic:cNvPicPr/>
+                  </pic:nvPicPr>
+                  <pic:blipFill>
+                    <a:blip r:embed="rId18">
+                      <a:extLst>
+                        <a:ext uri="{28A0092B-C50C-407E-A947-70E740481C1C}">
+                          <a14:useLocalDpi xmlns:a14="http://schemas.microsoft.com/office/drawing/2010/main" val="0"/>
+                        </a:ext>
+                      </a:extLst>
+                    </a:blip>
+                    <a:stretch>
+                      <a:fillRect/>
+                    </a:stretch>
+                  </pic:blipFill>
+                  <pic:spPr>
+                    <a:xfrm>
+                      <a:off x="0" y="0"/>
+                      <a:ext cx="5612130" cy="1334770"/>
+                    </a:xfrm>
+                    <a:prstGeom prst="rect">
+                      <a:avLst/>
+                    </a:prstGeom>
+                  </pic:spPr>
+                </pic:pic>
+              </a:graphicData>
+            </a:graphic>
+            <wp14:sizeRelH relativeFrom="page">
+              <wp14:pctWidth>0</wp14:pctWidth>
+            </wp14:sizeRelH>
+            <wp14:sizeRelV relativeFrom="page">
+              <wp14:pctHeight>0</wp14:pctHeight>
+            </wp14:sizeRelV>
+          </wp:anchor>
+        </w:drawing>
+      </w:r>
+      <w:r>
+        <w:rPr>
+          <w:noProof/>
+          <w:sz w:val="36"/>
+          <w:szCs w:val="32"/>
+        </w:rPr>
+        <mc:AlternateContent>
+          <mc:Choice Requires="wps">
+            <w:drawing>
+              <wp:anchor distT="0" distB="0" distL="114300" distR="114300" simplePos="0" relativeHeight="251658291" behindDoc="0" locked="0" layoutInCell="1" allowOverlap="1" wp14:anchorId="2FE0A1BB" wp14:editId="57A95474">
+                <wp:simplePos x="0" y="0"/>
+                <wp:positionH relativeFrom="column">
+                  <wp:posOffset>-840510</wp:posOffset>
+                </wp:positionH>
+                <wp:positionV relativeFrom="paragraph">
+                  <wp:posOffset>211802</wp:posOffset>
+                </wp:positionV>
+                <wp:extent cx="6257925" cy="127635"/>
+                <wp:effectExtent l="0" t="0" r="0" b="0"/>
+                <wp:wrapNone/>
+                <wp:docPr id="1381629436" name="Equal 21"/>
+                <wp:cNvGraphicFramePr/>
+                <a:graphic xmlns:a="http://schemas.openxmlformats.org/drawingml/2006/main">
+                  <a:graphicData uri="http://schemas.microsoft.com/office/word/2010/wordprocessingShape">
+                    <wps:wsp>
+                      <wps:cNvSpPr/>
+                      <wps:spPr>
+                        <a:xfrm>
+                          <a:off x="0" y="0"/>
+                          <a:ext cx="6257925" cy="127635"/>
+                        </a:xfrm>
+                        <a:prstGeom prst="mathEqual">
+                          <a:avLst>
+                            <a:gd name="adj1" fmla="val 7284"/>
+                            <a:gd name="adj2" fmla="val 18918"/>
+                          </a:avLst>
+                        </a:prstGeom>
+                        <a:solidFill>
+                          <a:schemeClr val="bg1">
+                            <a:lumMod val="85000"/>
+                          </a:schemeClr>
+                        </a:solidFill>
+                        <a:ln>
+                          <a:noFill/>
+                        </a:ln>
+                      </wps:spPr>
+                      <wps:style>
+                        <a:lnRef idx="2">
+                          <a:schemeClr val="dk1">
+                            <a:shade val="15000"/>
+                          </a:schemeClr>
+                        </a:lnRef>
+                        <a:fillRef idx="1">
+                          <a:schemeClr val="dk1"/>
+                        </a:fillRef>
+                        <a:effectRef idx="0">
+                          <a:schemeClr val="dk1"/>
+                        </a:effectRef>
+                        <a:fontRef idx="minor">
+                          <a:schemeClr val="lt1"/>
+                        </a:fontRef>
+                      </wps:style>
+                      <wps:bodyPr rot="0" spcFirstLastPara="0" vertOverflow="overflow" horzOverflow="overflow" vert="horz" wrap="square" lIns="91440" tIns="45720" rIns="91440" bIns="45720" numCol="1" spcCol="0" rtlCol="0" fromWordArt="0" anchor="ctr" anchorCtr="0" forceAA="0" compatLnSpc="1">
+                        <a:prstTxWarp prst="textNoShape">
+                          <a:avLst/>
+                        </a:prstTxWarp>
+                        <a:noAutofit/>
+                      </wps:bodyPr>
+                    </wps:wsp>
+                  </a:graphicData>
+                </a:graphic>
+                <wp14:sizeRelH relativeFrom="margin">
+                  <wp14:pctWidth>0</wp14:pctWidth>
+                </wp14:sizeRelH>
+                <wp14:sizeRelV relativeFrom="margin">
+                  <wp14:pctHeight>0</wp14:pctHeight>
+                </wp14:sizeRelV>
+              </wp:anchor>
+            </w:drawing>
+          </mc:Choice>
+          <mc:Fallback>
+            <w:pict>
+              <v:shape w14:anchorId="60674E09" id="Equal 21" o:spid="_x0000_s1026" style="position:absolute;margin-left:-66.2pt;margin-top:16.7pt;width:492.75pt;height:10.05pt;z-index:251658291;visibility:visible;mso-wrap-style:square;mso-width-percent:0;mso-height-percent:0;mso-wrap-distance-left:9pt;mso-wrap-distance-top:0;mso-wrap-distance-right:9pt;mso-wrap-distance-bottom:0;mso-position-horizontal:absolute;mso-position-horizontal-relative:text;mso-position-vertical:absolute;mso-position-vertical-relative:text;mso-width-percent:0;mso-height-percent:0;mso-width-relative:margin;mso-height-relative:margin;v-text-anchor:middle" coordsize="6257925,127635" o:gfxdata="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" path="m829488,42448r4598949,l5428437,51745r-4598949,l829488,42448xm829488,75890r4598949,l5428437,85187r-4598949,l829488,75890xe" fillcolor="#d8d8d8 [2732]" stroked="f" strokeweight="1pt">
+                <v:stroke joinstyle="miter"/>
+                <v:path arrowok="t" o:connecttype="custom" o:connectlocs="829488,42448;5428437,42448;5428437,51745;829488,51745;829488,42448;829488,75890;5428437,75890;5428437,85187;829488,85187;829488,75890" o:connectangles="0,0,0,0,0,0,0,0,0,0"/>
+              </v:shape>
+            </w:pict>
+          </mc:Fallback>
+        </mc:AlternateContent>
+      </w:r>
+      <w:r>
+        <w:t>7.</w:t>
+      </w:r>
+      <w:r>
+        <w:t>4</w:t>
+      </w:r>
+      <w:r>
+        <w:t xml:space="preserve"> </w:t>
+      </w:r>
+      <w:r>
+        <w:t>Puntos de Función Ajustados</w:t>
+      </w:r>
+    </w:p>
+    <w:p>
+      <w:pPr>
+        <w:rPr>
+          <w:rFonts w:ascii="Baskerville" w:eastAsiaTheme="majorEastAsia" w:hAnsi="Baskerville" w:cstheme="majorBidi"/>
+          <w:color w:val="595959" w:themeColor="text1" w:themeTint="A6"/>
+          <w:spacing w:val="15"/>
+          <w:sz w:val="36"/>
+          <w:szCs w:val="32"/>
+        </w:rPr>
+      </w:pPr>
+    </w:p>
+    <w:p>
+      <w:pPr>
+        <w:rPr>
+          <w:rFonts w:ascii="Baskerville" w:eastAsiaTheme="majorEastAsia" w:hAnsi="Baskerville" w:cstheme="majorBidi"/>
+          <w:color w:val="595959" w:themeColor="text1" w:themeTint="A6"/>
+          <w:spacing w:val="15"/>
+          <w:sz w:val="36"/>
+          <w:szCs w:val="32"/>
+        </w:rPr>
+      </w:pPr>
+    </w:p>
+    <w:p>
+      <w:pPr>
+        <w:pStyle w:val="Heading2"/>
+      </w:pPr>
+      <w:r>
+        <w:rPr>
+          <w:noProof/>
+          <w:sz w:val="36"/>
+          <w:szCs w:val="32"/>
+        </w:rPr>
+        <mc:AlternateContent>
+          <mc:Choice Requires="wps">
+            <w:drawing>
+              <wp:anchor distT="0" distB="0" distL="114300" distR="114300" simplePos="0" relativeHeight="251658292" behindDoc="0" locked="0" layoutInCell="1" allowOverlap="1" wp14:anchorId="2B2BB519" wp14:editId="46CF5C65">
+                <wp:simplePos x="0" y="0"/>
+                <wp:positionH relativeFrom="column">
+                  <wp:posOffset>-840510</wp:posOffset>
+                </wp:positionH>
+                <wp:positionV relativeFrom="paragraph">
+                  <wp:posOffset>211802</wp:posOffset>
+                </wp:positionV>
+                <wp:extent cx="6257925" cy="127635"/>
+                <wp:effectExtent l="0" t="0" r="0" b="0"/>
+                <wp:wrapNone/>
+                <wp:docPr id="1683914100" name="Equal 21"/>
+                <wp:cNvGraphicFramePr/>
+                <a:graphic xmlns:a="http://schemas.openxmlformats.org/drawingml/2006/main">
+                  <a:graphicData uri="http://schemas.microsoft.com/office/word/2010/wordprocessingShape">
+                    <wps:wsp>
+                      <wps:cNvSpPr/>
+                      <wps:spPr>
+                        <a:xfrm>
+                          <a:off x="0" y="0"/>
+                          <a:ext cx="6257925" cy="127635"/>
+                        </a:xfrm>
+                        <a:prstGeom prst="mathEqual">
+                          <a:avLst>
+                            <a:gd name="adj1" fmla="val 7284"/>
+                            <a:gd name="adj2" fmla="val 18918"/>
+                          </a:avLst>
+                        </a:prstGeom>
+                        <a:solidFill>
+                          <a:schemeClr val="bg1">
+                            <a:lumMod val="85000"/>
+                          </a:schemeClr>
+                        </a:solidFill>
+                        <a:ln>
+                          <a:noFill/>
+                        </a:ln>
+                      </wps:spPr>
+                      <wps:style>
+                        <a:lnRef idx="2">
+                          <a:schemeClr val="dk1">
+                            <a:shade val="15000"/>
+                          </a:schemeClr>
+                        </a:lnRef>
+                        <a:fillRef idx="1">
+                          <a:schemeClr val="dk1"/>
+                        </a:fillRef>
+                        <a:effectRef idx="0">
+                          <a:schemeClr val="dk1"/>
+                        </a:effectRef>
+                        <a:fontRef idx="minor">
+                          <a:schemeClr val="lt1"/>
+                        </a:fontRef>
+                      </wps:style>
+                      <wps:bodyPr rot="0" spcFirstLastPara="0" vertOverflow="overflow" horzOverflow="overflow" vert="horz" wrap="square" lIns="91440" tIns="45720" rIns="91440" bIns="45720" numCol="1" spcCol="0" rtlCol="0" fromWordArt="0" anchor="ctr" anchorCtr="0" forceAA="0" compatLnSpc="1">
+                        <a:prstTxWarp prst="textNoShape">
+                          <a:avLst/>
+                        </a:prstTxWarp>
+                        <a:noAutofit/>
+                      </wps:bodyPr>
+                    </wps:wsp>
+                  </a:graphicData>
+                </a:graphic>
+                <wp14:sizeRelH relativeFrom="margin">
+                  <wp14:pctWidth>0</wp14:pctWidth>
+                </wp14:sizeRelH>
+                <wp14:sizeRelV relativeFrom="margin">
+                  <wp14:pctHeight>0</wp14:pctHeight>
+                </wp14:sizeRelV>
+              </wp:anchor>
+            </w:drawing>
+          </mc:Choice>
+          <mc:Fallback>
+            <w:pict>
+              <v:shape w14:anchorId="0D7F0381" id="Equal 21" o:spid="_x0000_s1026" style="position:absolute;margin-left:-66.2pt;margin-top:16.7pt;width:492.75pt;height:10.05pt;z-index:251658292;visibility:visible;mso-wrap-style:square;mso-width-percent:0;mso-height-percent:0;mso-wrap-distance-left:9pt;mso-wrap-distance-top:0;mso-wrap-distance-right:9pt;mso-wrap-distance-bottom:0;mso-position-horizontal:absolute;mso-position-horizontal-relative:text;mso-position-vertical:absolute;mso-position-vertical-relative:text;mso-width-percent:0;mso-height-percent:0;mso-width-relative:margin;mso-height-relative:margin;v-text-anchor:middle" coordsize="6257925,127635" o:gfxdata="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" path="m829488,42448r4598949,l5428437,51745r-4598949,l829488,42448xm829488,75890r4598949,l5428437,85187r-4598949,l829488,75890xe" fillcolor="#d8d8d8 [2732]" stroked="f" strokeweight="1pt">
+                <v:stroke joinstyle="miter"/>
+                <v:path arrowok="t" o:connecttype="custom" o:connectlocs="829488,42448;5428437,42448;5428437,51745;829488,51745;829488,42448;829488,75890;5428437,75890;5428437,85187;829488,85187;829488,75890" o:connectangles="0,0,0,0,0,0,0,0,0,0"/>
+              </v:shape>
+            </w:pict>
+          </mc:Fallback>
+        </mc:AlternateContent>
+      </w:r>
+      <w:r>
+        <w:t>7.</w:t>
+      </w:r>
+      <w:r>
+        <w:t>5</w:t>
+      </w:r>
+      <w:r>
+        <w:t xml:space="preserve"> </w:t>
+      </w:r>
+      <w:r>
+        <w:t>Estimación de Tiempo</w:t>
+      </w:r>
+    </w:p>
+    <w:p>
+      <w:pPr>
+        <w:spacing w:line="276" w:lineRule="auto"/>
+        <w:jc w:val="both"/>
+        <w:rPr>
+          <w:rFonts w:ascii="Baskerville" w:hAnsi="Baskerville"/>
+          <w:sz w:val="24"/>
+          <w:szCs w:val="24"/>
+        </w:rPr>
+      </w:pPr>
+      <w:r>
+        <w:rPr>
+          <w:rFonts w:ascii="Baskerville" w:hAnsi="Baskerville"/>
+          <w:sz w:val="24"/>
+          <w:szCs w:val="24"/>
+        </w:rPr>
+        <w:t>Dado</w:t>
+      </w:r>
+      <w:r>
+        <w:rPr>
+          <w:rFonts w:ascii="Baskerville" w:hAnsi="Baskerville"/>
+          <w:sz w:val="24"/>
+          <w:szCs w:val="24"/>
+        </w:rPr>
+        <w:t xml:space="preserve">s los puntos de función ajustados </w:t>
+      </w:r>
+      <w:r>
+        <w:rPr>
+          <w:rFonts w:ascii="Baskerville" w:hAnsi="Baskerville"/>
+          <w:sz w:val="24"/>
+          <w:szCs w:val="24"/>
+        </w:rPr>
+        <w:t xml:space="preserve">calculados </w:t>
+      </w:r>
+      <w:r>
+        <w:rPr>
+          <w:rFonts w:ascii="Baskerville" w:hAnsi="Baskerville"/>
+          <w:sz w:val="24"/>
+          <w:szCs w:val="24"/>
+        </w:rPr>
+        <w:t>en la sección anterior</w:t>
+      </w:r>
+      <w:r>
+        <w:rPr>
+          <w:rFonts w:ascii="Baskerville" w:hAnsi="Baskerville"/>
+          <w:sz w:val="24"/>
+          <w:szCs w:val="24"/>
+        </w:rPr>
+        <w:t>, ahora estimaremos</w:t>
+      </w:r>
+      <w:r>
+        <w:rPr>
+          <w:rFonts w:ascii="Baskerville" w:hAnsi="Baskerville"/>
+          <w:sz w:val="24"/>
+          <w:szCs w:val="24"/>
+        </w:rPr>
+        <w:t xml:space="preserve"> </w:t>
+      </w:r>
+      <w:r>
+        <w:rPr>
+          <w:rFonts w:ascii="Baskerville" w:hAnsi="Baskerville"/>
+          <w:sz w:val="24"/>
+          <w:szCs w:val="24"/>
+        </w:rPr>
+        <w:t>el esfuerzo total requerido para el desarrollo de</w:t>
+      </w:r>
+      <w:r>
+        <w:rPr>
+          <w:rFonts w:ascii="Baskerville" w:hAnsi="Baskerville"/>
+          <w:sz w:val="24"/>
+          <w:szCs w:val="24"/>
+        </w:rPr>
+        <w:t xml:space="preserve">l </w:t>
+      </w:r>
+      <w:r>
+        <w:rPr>
+          <w:rFonts w:ascii="Baskerville" w:hAnsi="Baskerville"/>
+          <w:sz w:val="24"/>
+          <w:szCs w:val="24"/>
+        </w:rPr>
+        <w:t>proyect</w:t>
+      </w:r>
+      <w:r>
+        <w:rPr>
+          <w:rFonts w:ascii="Baskerville" w:hAnsi="Baskerville"/>
+          <w:sz w:val="24"/>
+          <w:szCs w:val="24"/>
+        </w:rPr>
+        <w:t xml:space="preserve">o, tomando en cuenta que los desarrolladores contaran con una jornada </w:t>
+      </w:r>
+      <w:r>
+        <w:rPr>
+          <w:rFonts w:ascii="Baskerville" w:hAnsi="Baskerville"/>
+          <w:sz w:val="24"/>
+          <w:szCs w:val="24"/>
+        </w:rPr>
+        <w:t xml:space="preserve">laboral </w:t>
+      </w:r>
+      <w:r>
+        <w:rPr>
+          <w:rFonts w:ascii="Baskerville" w:hAnsi="Baskerville"/>
+          <w:sz w:val="24"/>
+          <w:szCs w:val="24"/>
+        </w:rPr>
+        <w:t xml:space="preserve">de 8 horas </w:t>
+      </w:r>
+      <w:r>
+        <w:rPr>
+          <w:rFonts w:ascii="Baskerville" w:hAnsi="Baskerville"/>
+          <w:sz w:val="24"/>
+          <w:szCs w:val="24"/>
+        </w:rPr>
+        <w:t xml:space="preserve">y </w:t>
+      </w:r>
+      <w:r>
+        <w:rPr>
+          <w:rFonts w:ascii="Baskerville" w:hAnsi="Baskerville"/>
+          <w:sz w:val="24"/>
+          <w:szCs w:val="24"/>
+        </w:rPr>
+        <w:t>trabajaran</w:t>
+      </w:r>
+      <w:r>
+        <w:rPr>
+          <w:rFonts w:ascii="Baskerville" w:hAnsi="Baskerville"/>
+          <w:sz w:val="24"/>
+          <w:szCs w:val="24"/>
+        </w:rPr>
+        <w:t xml:space="preserve"> 5 días de la semana</w:t>
+      </w:r>
+      <w:r>
+        <w:rPr>
+          <w:rFonts w:ascii="Baskerville" w:hAnsi="Baskerville"/>
+          <w:sz w:val="24"/>
+          <w:szCs w:val="24"/>
+        </w:rPr>
+        <w:t>:</w:t>
+      </w:r>
+    </w:p>
+    <w:p>
+      <w:pPr>
+        <w:jc w:val="both"/>
+        <w:rPr>
+          <w:rFonts w:ascii="Baskerville" w:hAnsi="Baskerville"/>
+          <w:sz w:val="24"/>
+          <w:szCs w:val="24"/>
+        </w:rPr>
+      </w:pPr>
+      <m:oMathPara>
+        <m:oMath>
+          <m:r>
+            <w:rPr>
+              <w:rFonts w:ascii="Cambria Math" w:hAnsi="Cambria Math"/>
+              <w:sz w:val="24"/>
+              <w:szCs w:val="24"/>
+            </w:rPr>
+            <w:lastRenderedPageBreak/>
+            <m:t>Esfuerzo=FP*8</m:t>
+          </m:r>
+          <m:r>
+            <w:rPr>
+              <w:rFonts w:ascii="Cambria Math" w:eastAsiaTheme="minorEastAsia" w:hAnsi="Cambria Math"/>
+              <w:sz w:val="24"/>
+              <w:szCs w:val="24"/>
+            </w:rPr>
+            <m:t xml:space="preserve">=77*8=616 </m:t>
+          </m:r>
+          <m:r>
+            <w:rPr>
+              <w:rFonts w:ascii="Cambria Math" w:eastAsiaTheme="minorEastAsia" w:hAnsi="Cambria Math"/>
+              <w:sz w:val="24"/>
+              <w:szCs w:val="24"/>
+            </w:rPr>
+            <m:t>horas/persona</m:t>
+          </m:r>
+        </m:oMath>
+      </m:oMathPara>
+    </w:p>
+    <w:p>
+      <w:pPr>
+        <w:jc w:val="both"/>
+        <w:rPr>
+          <w:rFonts w:ascii="Baskerville" w:hAnsi="Baskerville"/>
+          <w:sz w:val="24"/>
+          <w:szCs w:val="24"/>
+        </w:rPr>
+      </w:pPr>
+    </w:p>
+    <w:p>
+      <w:pPr>
+        <w:jc w:val="both"/>
+        <w:rPr>
+          <w:rFonts w:ascii="Baskerville" w:hAnsi="Baskerville"/>
+          <w:sz w:val="24"/>
+          <w:szCs w:val="24"/>
+        </w:rPr>
+      </w:pPr>
+      <w:r>
+        <w:rPr>
+          <w:rFonts w:ascii="Baskerville" w:hAnsi="Baskerville"/>
+          <w:sz w:val="24"/>
+          <w:szCs w:val="24"/>
+        </w:rPr>
+        <w:t xml:space="preserve">Y después definiremos las horas </w:t>
+      </w:r>
+      <w:r>
+        <w:rPr>
+          <w:rFonts w:ascii="Baskerville" w:hAnsi="Baskerville"/>
+          <w:sz w:val="24"/>
+          <w:szCs w:val="24"/>
+        </w:rPr>
+        <w:t>por desarrollador:</w:t>
+      </w:r>
+    </w:p>
+    <w:p>
+      <w:pPr>
+        <w:jc w:val="both"/>
+        <w:rPr>
+          <w:rFonts w:ascii="Baskerville" w:hAnsi="Baskerville"/>
+          <w:sz w:val="24"/>
+          <w:szCs w:val="24"/>
+        </w:rPr>
+      </w:pPr>
+    </w:p>
+    <w:p>
+      <w:pPr>
+        <w:jc w:val="both"/>
+        <w:rPr>
+          <w:rFonts w:ascii="Baskerville" w:hAnsi="Baskerville"/>
+          <w:sz w:val="24"/>
+          <w:szCs w:val="24"/>
+        </w:rPr>
+      </w:pPr>
+      <m:oMathPara>
+        <m:oMath>
+          <m:r>
+            <w:rPr>
+              <w:rFonts w:ascii="Cambria Math" w:hAnsi="Cambria Math"/>
+              <w:sz w:val="24"/>
+              <w:szCs w:val="24"/>
+            </w:rPr>
+            <m:t>Horas</m:t>
+          </m:r>
+          <m:r>
+            <w:rPr>
+              <w:rFonts w:ascii="Cambria Math" w:hAnsi="Cambria Math"/>
+              <w:sz w:val="24"/>
+              <w:szCs w:val="24"/>
+            </w:rPr>
+            <m:t>=</m:t>
+          </m:r>
+          <m:f>
+            <m:fPr>
+              <m:ctrlPr>
+                <w:rPr>
+                  <w:rFonts w:ascii="Cambria Math" w:eastAsiaTheme="minorEastAsia" w:hAnsi="Cambria Math"/>
+                  <w:i/>
+                  <w:sz w:val="24"/>
+                  <w:szCs w:val="24"/>
+                </w:rPr>
+              </m:ctrlPr>
+            </m:fPr>
+            <m:num>
+              <m:r>
+                <w:rPr>
+                  <w:rFonts w:ascii="Cambria Math" w:eastAsiaTheme="minorEastAsia" w:hAnsi="Cambria Math"/>
+                  <w:sz w:val="24"/>
+                  <w:szCs w:val="24"/>
+                </w:rPr>
+                <m:t>616</m:t>
+              </m:r>
+            </m:num>
+            <m:den>
+              <m:r>
+                <w:rPr>
+                  <w:rFonts w:ascii="Cambria Math" w:eastAsiaTheme="minorEastAsia" w:hAnsi="Cambria Math"/>
+                  <w:sz w:val="24"/>
+                  <w:szCs w:val="24"/>
+                </w:rPr>
+                <m:t>2</m:t>
+              </m:r>
+            </m:den>
+          </m:f>
+          <m:r>
+            <w:rPr>
+              <w:rFonts w:ascii="Cambria Math" w:eastAsiaTheme="minorEastAsia" w:hAnsi="Cambria Math"/>
+              <w:sz w:val="24"/>
+              <w:szCs w:val="24"/>
+            </w:rPr>
+            <m:t>=</m:t>
+          </m:r>
+          <m:r>
+            <w:rPr>
+              <w:rFonts w:ascii="Cambria Math" w:eastAsiaTheme="minorEastAsia" w:hAnsi="Cambria Math"/>
+              <w:sz w:val="24"/>
+              <w:szCs w:val="24"/>
+            </w:rPr>
+            <m:t xml:space="preserve">308 </m:t>
+          </m:r>
+          <m:r>
+            <w:rPr>
+              <w:rFonts w:ascii="Cambria Math" w:eastAsiaTheme="minorEastAsia" w:hAnsi="Cambria Math"/>
+              <w:sz w:val="24"/>
+              <w:szCs w:val="24"/>
+            </w:rPr>
+            <m:t>hora</m:t>
+          </m:r>
+          <m:r>
+            <w:rPr>
+              <w:rFonts w:ascii="Cambria Math" w:eastAsiaTheme="minorEastAsia" w:hAnsi="Cambria Math"/>
+              <w:sz w:val="24"/>
+              <w:szCs w:val="24"/>
+            </w:rPr>
+            <m:t>s*</m:t>
+          </m:r>
+          <m:r>
+            <w:rPr>
+              <w:rFonts w:ascii="Cambria Math" w:eastAsiaTheme="minorEastAsia" w:hAnsi="Cambria Math"/>
+              <w:sz w:val="24"/>
+              <w:szCs w:val="24"/>
+            </w:rPr>
+            <m:t>persona</m:t>
+          </m:r>
+        </m:oMath>
+      </m:oMathPara>
+    </w:p>
+    <w:p>
+      <w:pPr>
+        <w:jc w:val="both"/>
+        <w:rPr>
+          <w:rFonts w:ascii="Baskerville" w:hAnsi="Baskerville"/>
+          <w:sz w:val="24"/>
+          <w:szCs w:val="24"/>
+        </w:rPr>
+      </w:pPr>
+    </w:p>
+    <w:p>
+      <w:pPr>
+        <w:jc w:val="both"/>
+        <w:rPr>
+          <w:rFonts w:ascii="Baskerville" w:hAnsi="Baskerville"/>
+          <w:sz w:val="24"/>
+          <w:szCs w:val="24"/>
+        </w:rPr>
+      </w:pPr>
+      <w:r>
+        <w:rPr>
+          <w:rFonts w:ascii="Baskerville" w:hAnsi="Baskerville"/>
+          <w:sz w:val="24"/>
+          <w:szCs w:val="24"/>
+        </w:rPr>
+        <w:t xml:space="preserve">Asumiremos que los desarrolladores </w:t>
+      </w:r>
+      <w:r>
+        <w:rPr>
+          <w:rFonts w:ascii="Baskerville" w:hAnsi="Baskerville"/>
+          <w:sz w:val="24"/>
+          <w:szCs w:val="24"/>
+        </w:rPr>
+        <w:t>solo cuentan con 5 horas efectivas de trabajo sin interrupción:</w:t>
+      </w:r>
+    </w:p>
+    <w:p>
+      <w:pPr>
+        <w:jc w:val="both"/>
+        <w:rPr>
+          <w:rFonts w:ascii="Baskerville" w:hAnsi="Baskerville"/>
+          <w:sz w:val="24"/>
+          <w:szCs w:val="24"/>
+        </w:rPr>
+      </w:pPr>
+    </w:p>
+    <w:p>
+      <w:pPr>
+        <w:jc w:val="both"/>
+        <w:rPr>
+          <w:rFonts w:ascii="Baskerville" w:eastAsiaTheme="majorEastAsia" w:hAnsi="Baskerville" w:cstheme="majorBidi"/>
+          <w:color w:val="595959" w:themeColor="text1" w:themeTint="A6"/>
+          <w:spacing w:val="15"/>
+          <w:sz w:val="36"/>
+          <w:szCs w:val="32"/>
+        </w:rPr>
+      </w:pPr>
+      <m:oMathPara>
+        <m:oMath>
+          <m:r>
+            <w:rPr>
+              <w:rFonts w:ascii="Cambria Math" w:hAnsi="Cambria Math"/>
+              <w:sz w:val="24"/>
+              <w:szCs w:val="24"/>
+            </w:rPr>
+            <m:t>Horas</m:t>
+          </m:r>
+          <m:r>
+            <w:rPr>
+              <w:rFonts w:ascii="Cambria Math" w:hAnsi="Cambria Math"/>
+              <w:sz w:val="24"/>
+              <w:szCs w:val="24"/>
+            </w:rPr>
+            <m:t>Semanales</m:t>
+          </m:r>
+          <m:r>
+            <w:rPr>
+              <w:rFonts w:ascii="Cambria Math" w:hAnsi="Cambria Math"/>
+              <w:sz w:val="24"/>
+              <w:szCs w:val="24"/>
+            </w:rPr>
+            <m:t>=</m:t>
+          </m:r>
+          <m:r>
+            <w:rPr>
+              <w:rFonts w:ascii="Cambria Math" w:hAnsi="Cambria Math"/>
+              <w:sz w:val="24"/>
+              <w:szCs w:val="24"/>
+            </w:rPr>
+            <m:t>5</m:t>
+          </m:r>
+          <m:r>
+            <w:rPr>
+              <w:rFonts w:ascii="Cambria Math" w:eastAsiaTheme="minorEastAsia" w:hAnsi="Cambria Math"/>
+              <w:sz w:val="24"/>
+              <w:szCs w:val="24"/>
+            </w:rPr>
+            <m:t xml:space="preserve"> ho</m:t>
+          </m:r>
+          <m:r>
+            <w:rPr>
+              <w:rFonts w:ascii="Cambria Math" w:eastAsiaTheme="minorEastAsia" w:hAnsi="Cambria Math"/>
+              <w:sz w:val="24"/>
+              <w:szCs w:val="24"/>
+            </w:rPr>
+            <m:t xml:space="preserve">ras*5 dias=25 </m:t>
+          </m:r>
+          <m:r>
+            <w:rPr>
+              <w:rFonts w:ascii="Cambria Math" w:eastAsiaTheme="minorEastAsia" w:hAnsi="Cambria Math"/>
+              <w:sz w:val="24"/>
+              <w:szCs w:val="24"/>
+            </w:rPr>
+            <m:t xml:space="preserve">hrs*semana </m:t>
+          </m:r>
+          <m:r>
+            <w:rPr>
+              <w:rFonts w:ascii="Cambria Math" w:eastAsiaTheme="minorEastAsia" w:hAnsi="Cambria Math"/>
+              <w:sz w:val="24"/>
+              <w:szCs w:val="24"/>
+            </w:rPr>
+            <m:t xml:space="preserve"> </m:t>
+          </m:r>
+        </m:oMath>
+      </m:oMathPara>
+    </w:p>
+    <w:p>
+      <w:pPr>
+        <w:rPr>
+          <w:rFonts w:ascii="Baskerville" w:eastAsiaTheme="majorEastAsia" w:hAnsi="Baskerville" w:cstheme="majorBidi"/>
+          <w:color w:val="595959" w:themeColor="text1" w:themeTint="A6"/>
+          <w:spacing w:val="15"/>
+          <w:sz w:val="36"/>
+          <w:szCs w:val="32"/>
+        </w:rPr>
+      </w:pPr>
+    </w:p>
+    <w:p>
+      <w:pPr>
+        <w:rPr>
+          <w:rFonts w:ascii="Baskerville" w:hAnsi="Baskerville"/>
+          <w:sz w:val="24"/>
+          <w:szCs w:val="24"/>
+        </w:rPr>
+      </w:pPr>
+      <w:r>
+        <w:rPr>
+          <w:rFonts w:ascii="Baskerville" w:hAnsi="Baskerville"/>
+          <w:sz w:val="24"/>
+          <w:szCs w:val="24"/>
+        </w:rPr>
+        <w:t>La duración ideal de nuestro proyecto será de:</w:t>
+      </w:r>
+    </w:p>
+    <w:p>
+      <w:pPr>
+        <w:rPr>
+          <w:rFonts w:ascii="Baskerville" w:hAnsi="Baskerville"/>
+          <w:sz w:val="24"/>
+          <w:szCs w:val="24"/>
+        </w:rPr>
+      </w:pPr>
+    </w:p>
+    <w:p>
+      <w:pPr>
+        <w:jc w:val="both"/>
+        <w:rPr>
+          <w:rFonts w:ascii="Baskerville" w:eastAsiaTheme="majorEastAsia" w:hAnsi="Baskerville" w:cstheme="majorBidi"/>
+          <w:sz w:val="24"/>
+          <w:szCs w:val="24"/>
+        </w:rPr>
+      </w:pPr>
+      <m:oMathPara>
+        <m:oMath>
+          <m:r>
+            <w:rPr>
+              <w:rFonts w:ascii="Cambria Math" w:hAnsi="Cambria Math"/>
+              <w:sz w:val="24"/>
+              <w:szCs w:val="24"/>
+            </w:rPr>
+            <m:t>duracionIdeal</m:t>
+          </m:r>
+          <m:r>
+            <w:rPr>
+              <w:rFonts w:ascii="Cambria Math" w:hAnsi="Cambria Math"/>
+              <w:sz w:val="24"/>
+              <w:szCs w:val="24"/>
+            </w:rPr>
+            <m:t>=</m:t>
+          </m:r>
+          <m:f>
+            <m:fPr>
+              <m:ctrlPr>
+                <w:rPr>
+                  <w:rFonts w:ascii="Cambria Math" w:hAnsi="Cambria Math"/>
+                  <w:i/>
+                  <w:sz w:val="24"/>
+                  <w:szCs w:val="24"/>
+                </w:rPr>
+              </m:ctrlPr>
+            </m:fPr>
+            <m:num>
+              <m:r>
+                <w:rPr>
+                  <w:rFonts w:ascii="Cambria Math" w:hAnsi="Cambria Math"/>
+                  <w:sz w:val="24"/>
+                  <w:szCs w:val="24"/>
+                </w:rPr>
+                <m:t>308</m:t>
+              </m:r>
+            </m:num>
+            <m:den>
+              <m:r>
+                <w:rPr>
+                  <w:rFonts w:ascii="Cambria Math" w:hAnsi="Cambria Math"/>
+                  <w:sz w:val="24"/>
+                  <w:szCs w:val="24"/>
+                </w:rPr>
+                <m:t>25</m:t>
+              </m:r>
+            </m:den>
+          </m:f>
+          <m:r>
+            <w:rPr>
+              <w:rFonts w:ascii="Cambria Math" w:hAnsi="Cambria Math"/>
+              <w:sz w:val="24"/>
+              <w:szCs w:val="24"/>
+            </w:rPr>
+            <m:t>=12.32 semanas</m:t>
+          </m:r>
+        </m:oMath>
+      </m:oMathPara>
+    </w:p>
+    <w:p>
+      <w:pPr>
+        <w:jc w:val="both"/>
+        <w:rPr>
+          <w:rFonts w:ascii="Baskerville" w:eastAsiaTheme="majorEastAsia" w:hAnsi="Baskerville" w:cstheme="majorBidi"/>
+          <w:color w:val="595959" w:themeColor="text1" w:themeTint="A6"/>
+          <w:spacing w:val="15"/>
+          <w:sz w:val="36"/>
+          <w:szCs w:val="32"/>
+        </w:rPr>
+      </w:pPr>
+    </w:p>
+    <w:p>
+      <w:pPr>
+        <w:rPr>
+          <w:rFonts w:ascii="Baskerville" w:hAnsi="Baskerville"/>
+          <w:sz w:val="24"/>
+          <w:szCs w:val="24"/>
+        </w:rPr>
+      </w:pPr>
+      <w:r>
+        <w:rPr>
+          <w:rFonts w:ascii="Baskerville" w:hAnsi="Baskerville"/>
+          <w:sz w:val="24"/>
+          <w:szCs w:val="24"/>
+        </w:rPr>
+        <w:t xml:space="preserve">Nuestro tiempo ideal de desarrollo será de </w:t>
+      </w:r>
+      <w:r>
+        <w:rPr>
+          <w:rFonts w:ascii="Baskerville" w:hAnsi="Baskerville"/>
+          <w:sz w:val="24"/>
+          <w:szCs w:val="24"/>
+        </w:rPr>
+        <w:t xml:space="preserve">aproximadamente </w:t>
+      </w:r>
+      <w:r>
+        <w:rPr>
+          <w:rFonts w:ascii="Baskerville" w:hAnsi="Baskerville"/>
+          <w:b/>
+          <w:bCs/>
+          <w:sz w:val="24"/>
+          <w:szCs w:val="24"/>
+        </w:rPr>
+        <w:t>3</w:t>
+      </w:r>
+      <w:r>
+        <w:rPr>
+          <w:rFonts w:ascii="Baskerville" w:hAnsi="Baskerville"/>
+          <w:b/>
+          <w:bCs/>
+          <w:sz w:val="24"/>
+          <w:szCs w:val="24"/>
+        </w:rPr>
+        <w:t xml:space="preserve"> meses</w:t>
+      </w:r>
+      <w:r>
+        <w:rPr>
+          <w:rFonts w:ascii="Baskerville" w:hAnsi="Baskerville"/>
+          <w:sz w:val="24"/>
+          <w:szCs w:val="24"/>
+        </w:rPr>
+        <w:t>, debido a que es probable que se presenten inconvenientes que retrasen el desarrollo del proyecto, agregaremos un margen del 30%</w:t>
+      </w:r>
+      <w:r>
+        <w:rPr>
+          <w:rFonts w:ascii="Baskerville" w:hAnsi="Baskerville"/>
+          <w:sz w:val="24"/>
+          <w:szCs w:val="24"/>
+        </w:rPr>
+        <w:t xml:space="preserve"> a nuestro tiempo de desarrollo:</w:t>
+      </w:r>
+    </w:p>
+    <w:p>
+      <w:pPr>
+        <w:rPr>
+          <w:rFonts w:ascii="Baskerville" w:hAnsi="Baskerville"/>
+          <w:sz w:val="24"/>
+          <w:szCs w:val="24"/>
+        </w:rPr>
+      </w:pPr>
+    </w:p>
+    <w:p>
+      <w:pPr>
+        <w:jc w:val="both"/>
+        <w:rPr>
+          <w:rFonts w:ascii="Baskerville" w:eastAsiaTheme="majorEastAsia" w:hAnsi="Baskerville" w:cstheme="majorBidi"/>
+          <w:sz w:val="24"/>
+          <w:szCs w:val="24"/>
+        </w:rPr>
+      </w:pPr>
+      <m:oMathPara>
+        <m:oMath>
+          <m:r>
+            <w:rPr>
+              <w:rFonts w:ascii="Cambria Math" w:hAnsi="Cambria Math"/>
+              <w:sz w:val="24"/>
+              <w:szCs w:val="24"/>
+            </w:rPr>
+            <m:t>duracion</m:t>
+          </m:r>
+          <m:r>
+            <w:rPr>
+              <w:rFonts w:ascii="Cambria Math" w:hAnsi="Cambria Math"/>
+              <w:sz w:val="24"/>
+              <w:szCs w:val="24"/>
+            </w:rPr>
+            <m:t>Real</m:t>
+          </m:r>
+          <m:r>
+            <w:rPr>
+              <w:rFonts w:ascii="Cambria Math" w:hAnsi="Cambria Math"/>
+              <w:sz w:val="24"/>
+              <w:szCs w:val="24"/>
+            </w:rPr>
+            <m:t>=12.32</m:t>
+          </m:r>
+          <m:r>
+            <w:rPr>
+              <w:rFonts w:ascii="Cambria Math" w:hAnsi="Cambria Math"/>
+              <w:sz w:val="24"/>
+              <w:szCs w:val="24"/>
+            </w:rPr>
+            <m:t>*1.3=16.01 semas</m:t>
+          </m:r>
+        </m:oMath>
+      </m:oMathPara>
+    </w:p>
+    <w:p>
+      <w:pPr>
+        <w:rPr>
+          <w:rFonts w:ascii="Baskerville" w:hAnsi="Baskerville"/>
+          <w:sz w:val="24"/>
+          <w:szCs w:val="24"/>
+        </w:rPr>
+      </w:pPr>
+    </w:p>
+    <w:p>
+      <w:pPr>
+        <w:rPr>
+          <w:rFonts w:ascii="Baskerville" w:eastAsiaTheme="majorEastAsia" w:hAnsi="Baskerville" w:cstheme="majorBidi"/>
+          <w:color w:val="595959" w:themeColor="text1" w:themeTint="A6"/>
+          <w:spacing w:val="15"/>
+          <w:sz w:val="36"/>
+          <w:szCs w:val="32"/>
+        </w:rPr>
+      </w:pPr>
+      <w:r>
+        <w:rPr>
+          <w:rFonts w:ascii="Baskerville" w:hAnsi="Baskerville"/>
+          <w:sz w:val="24"/>
+          <w:szCs w:val="24"/>
+        </w:rPr>
+        <w:t xml:space="preserve">El proyecto requerirá de </w:t>
+      </w:r>
+      <w:r>
+        <w:rPr>
+          <w:rFonts w:ascii="Baskerville" w:hAnsi="Baskerville"/>
+          <w:b/>
+          <w:bCs/>
+          <w:sz w:val="24"/>
+          <w:szCs w:val="24"/>
+        </w:rPr>
+        <w:t>4 meses</w:t>
+      </w:r>
+      <w:r>
+        <w:rPr>
+          <w:rFonts w:ascii="Baskerville" w:hAnsi="Baskerville"/>
+          <w:sz w:val="24"/>
+          <w:szCs w:val="24"/>
+        </w:rPr>
+        <w:t xml:space="preserve"> de desarrollo activo para llegar a terminarlo.</w:t>
+      </w:r>
+    </w:p>
+    <w:p>
+      <w:pPr>
+        <w:jc w:val="center"/>
+        <w:rPr>
+          <w:rFonts w:ascii="Baskerville" w:eastAsiaTheme="majorEastAsia" w:hAnsi="Baskerville" w:cstheme="majorBidi"/>
+          <w:color w:val="595959" w:themeColor="text1" w:themeTint="A6"/>
+          <w:spacing w:val="15"/>
+          <w:sz w:val="36"/>
+          <w:szCs w:val="32"/>
+        </w:rPr>
+      </w:pPr>
+    </w:p>
+    <w:p>
+      <w:pPr>
+        <w:jc w:val="center"/>
+        <w:rPr>
+          <w:rFonts w:ascii="Baskerville" w:eastAsiaTheme="majorEastAsia" w:hAnsi="Baskerville" w:cstheme="majorBidi"/>
+          <w:color w:val="595959" w:themeColor="text1" w:themeTint="A6"/>
+          <w:spacing w:val="15"/>
+          <w:sz w:val="36"/>
+          <w:szCs w:val="32"/>
+        </w:rPr>
+      </w:pPr>
+    </w:p>
+    <w:p>
+      <w:pPr>
+        <w:pStyle w:val="Heading2"/>
+      </w:pPr>
+      <w:r>
+        <w:rPr>
+          <w:noProof/>
+          <w:sz w:val="36"/>
+          <w:szCs w:val="32"/>
+        </w:rPr>
+        <mc:AlternateContent>
+          <mc:Choice Requires="wps">
+            <w:drawing>
+              <wp:anchor distT="0" distB="0" distL="114300" distR="114300" simplePos="0" relativeHeight="251658296" behindDoc="0" locked="0" layoutInCell="1" allowOverlap="1" wp14:anchorId="72376584" wp14:editId="523E67D9">
+                <wp:simplePos x="0" y="0"/>
+                <wp:positionH relativeFrom="column">
+                  <wp:posOffset>-840510</wp:posOffset>
+                </wp:positionH>
+                <wp:positionV relativeFrom="paragraph">
+                  <wp:posOffset>211802</wp:posOffset>
+                </wp:positionV>
+                <wp:extent cx="6257925" cy="127635"/>
+                <wp:effectExtent l="0" t="0" r="0" b="0"/>
+                <wp:wrapNone/>
+                <wp:docPr id="1701153761" name="Equal 21"/>
+                <wp:cNvGraphicFramePr/>
+                <a:graphic xmlns:a="http://schemas.openxmlformats.org/drawingml/2006/main">
+                  <a:graphicData uri="http://schemas.microsoft.com/office/word/2010/wordprocessingShape">
+                    <wps:wsp>
+                      <wps:cNvSpPr/>
+                      <wps:spPr>
+                        <a:xfrm>
+                          <a:off x="0" y="0"/>
+                          <a:ext cx="6257925" cy="127635"/>
+                        </a:xfrm>
+                        <a:prstGeom prst="mathEqual">
+                          <a:avLst>
+                            <a:gd name="adj1" fmla="val 7284"/>
+                            <a:gd name="adj2" fmla="val 18918"/>
+                          </a:avLst>
+                        </a:prstGeom>
+                        <a:solidFill>
+                          <a:schemeClr val="bg1">
+                            <a:lumMod val="85000"/>
+                          </a:schemeClr>
+                        </a:solidFill>
+                        <a:ln>
+                          <a:noFill/>
+                        </a:ln>
+                      </wps:spPr>
+                      <wps:style>
+                        <a:lnRef idx="2">
+                          <a:schemeClr val="dk1">
+                            <a:shade val="15000"/>
+                          </a:schemeClr>
+                        </a:lnRef>
+                        <a:fillRef idx="1">
+                          <a:schemeClr val="dk1"/>
+                        </a:fillRef>
+                        <a:effectRef idx="0">
+                          <a:schemeClr val="dk1"/>
+                        </a:effectRef>
+                        <a:fontRef idx="minor">
+                          <a:schemeClr val="lt1"/>
+                        </a:fontRef>
+                      </wps:style>
+                      <wps:bodyPr rot="0" spcFirstLastPara="0" vertOverflow="overflow" horzOverflow="overflow" vert="horz" wrap="square" lIns="91440" tIns="45720" rIns="91440" bIns="45720" numCol="1" spcCol="0" rtlCol="0" fromWordArt="0" anchor="ctr" anchorCtr="0" forceAA="0" compatLnSpc="1">
+                        <a:prstTxWarp prst="textNoShape">
+                          <a:avLst/>
+                        </a:prstTxWarp>
+                        <a:noAutofit/>
+                      </wps:bodyPr>
+                    </wps:wsp>
+                  </a:graphicData>
+                </a:graphic>
+                <wp14:sizeRelH relativeFrom="margin">
+                  <wp14:pctWidth>0</wp14:pctWidth>
+                </wp14:sizeRelH>
+                <wp14:sizeRelV relativeFrom="margin">
+                  <wp14:pctHeight>0</wp14:pctHeight>
+                </wp14:sizeRelV>
+              </wp:anchor>
+            </w:drawing>
+          </mc:Choice>
+          <mc:Fallback>
+            <w:pict>
+              <v:shape w14:anchorId="7F78E82C" id="Equal 21" o:spid="_x0000_s1026" style="position:absolute;margin-left:-66.2pt;margin-top:16.7pt;width:492.75pt;height:10.05pt;z-index:251658296;visibility:visible;mso-wrap-style:square;mso-width-percent:0;mso-height-percent:0;mso-wrap-distance-left:9pt;mso-wrap-distance-top:0;mso-wrap-distance-right:9pt;mso-wrap-distance-bottom:0;mso-position-horizontal:absolute;mso-position-horizontal-relative:text;mso-position-vertical:absolute;mso-position-vertical-relative:text;mso-width-percent:0;mso-height-percent:0;mso-width-relative:margin;mso-height-relative:margin;v-text-anchor:middle" coordsize="6257925,127635" o:gfxdata="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" path="m829488,42448r4598949,l5428437,51745r-4598949,l829488,42448xm829488,75890r4598949,l5428437,85187r-4598949,l829488,75890xe" fillcolor="#d8d8d8 [2732]" stroked="f" strokeweight="1pt">
+                <v:stroke joinstyle="miter"/>
+                <v:path arrowok="t" o:connecttype="custom" o:connectlocs="829488,42448;5428437,42448;5428437,51745;829488,51745;829488,42448;829488,75890;5428437,75890;5428437,85187;829488,85187;829488,75890" o:connectangles="0,0,0,0,0,0,0,0,0,0"/>
+              </v:shape>
+            </w:pict>
+          </mc:Fallback>
+        </mc:AlternateContent>
+      </w:r>
+      <w:r>
+        <w:t>7.</w:t>
+      </w:r>
+      <w:r>
+        <w:t>6</w:t>
+      </w:r>
+      <w:r>
+        <w:t xml:space="preserve"> </w:t>
+      </w:r>
+      <w:r>
+        <w:t xml:space="preserve">Estimación de </w:t>
+      </w:r>
+      <w:r>
+        <w:t>Costos</w:t>
+      </w:r>
+    </w:p>
+    <w:p>
+      <w:pPr>
+        <w:pStyle w:val="Subtitle"/>
+        <w:rPr>
+          <w:rStyle w:val="Emphasis"/>
+        </w:rPr>
+      </w:pPr>
+      <w:r>
+        <w:tab/>
+      </w:r>
+      <w:r>
+        <w:rPr>
+          <w:rStyle w:val="Emphasis"/>
+        </w:rPr>
+        <w:t>Sueldos</w:t>
+      </w:r>
+    </w:p>
+    <w:p>
+      <w:pPr>
+        <w:rPr>
+          <w:rFonts w:ascii="Baskerville" w:hAnsi="Baskerville"/>
+          <w:sz w:val="24"/>
+          <w:szCs w:val="24"/>
+        </w:rPr>
+      </w:pPr>
+      <w:r>
+        <w:rPr>
+          <w:rFonts w:ascii="Baskerville" w:hAnsi="Baskerville"/>
+          <w:noProof/>
+          <w:sz w:val="24"/>
+          <w:szCs w:val="24"/>
         </w:rPr>
         <w:lastRenderedPageBreak/>
         <mc:AlternateContent>
           <mc:Choice Requires="wps">
             <w:drawing>
-              <wp:anchor distT="0" distB="0" distL="114300" distR="114300" simplePos="0" relativeHeight="251658281" behindDoc="0" locked="0" layoutInCell="1" allowOverlap="1" wp14:anchorId="09E1FDD3" wp14:editId="3DD34013">
+              <wp:anchor distT="0" distB="0" distL="114300" distR="114300" simplePos="0" relativeHeight="251658298" behindDoc="0" locked="0" layoutInCell="1" allowOverlap="1" wp14:anchorId="673B1B89" wp14:editId="77D80198">
+                <wp:simplePos x="0" y="0"/>
+                <wp:positionH relativeFrom="column">
+                  <wp:posOffset>257175</wp:posOffset>
+                </wp:positionH>
+                <wp:positionV relativeFrom="paragraph">
+                  <wp:posOffset>604887</wp:posOffset>
+                </wp:positionV>
+                <wp:extent cx="5177790" cy="1405255"/>
+                <wp:effectExtent l="0" t="0" r="3810" b="4445"/>
+                <wp:wrapTopAndBottom/>
+                <wp:docPr id="1208752847" name="Text Box 58"/>
+                <wp:cNvGraphicFramePr/>
+                <a:graphic xmlns:a="http://schemas.openxmlformats.org/drawingml/2006/main">
+                  <a:graphicData uri="http://schemas.microsoft.com/office/word/2010/wordprocessingShape">
+                    <wps:wsp>
+                      <wps:cNvSpPr txBox="1"/>
+                      <wps:spPr>
+                        <a:xfrm>
+                          <a:off x="0" y="0"/>
+                          <a:ext cx="5177790" cy="1405255"/>
+                        </a:xfrm>
+                        <a:prstGeom prst="rect">
+                          <a:avLst/>
+                        </a:prstGeom>
+                        <a:solidFill>
+                          <a:schemeClr val="bg1">
+                            <a:lumMod val="95000"/>
+                          </a:schemeClr>
+                        </a:solidFill>
+                        <a:ln w="6350">
+                          <a:noFill/>
+                        </a:ln>
+                      </wps:spPr>
+                      <wps:txbx>
+                        <w:txbxContent>
+                          <w:p>
+                            <w:pPr>
+                              <w:rPr>
+                                <w:rFonts w:ascii="Baskerville" w:hAnsi="Baskerville"/>
+                                <w:sz w:val="28"/>
+                                <w:szCs w:val="28"/>
+                              </w:rPr>
+                            </w:pPr>
+                            <w:r>
+                              <w:rPr>
+                                <w:rFonts w:ascii="Baskerville" w:hAnsi="Baskerville"/>
+                                <w:sz w:val="28"/>
+                                <w:szCs w:val="28"/>
+                              </w:rPr>
+                              <w:t>Sueld</w:t>
+                            </w:r>
+                            <w:r>
+                              <w:rPr>
+                                <w:rFonts w:ascii="Baskerville" w:hAnsi="Baskerville"/>
+                                <w:sz w:val="28"/>
+                                <w:szCs w:val="28"/>
+                              </w:rPr>
+                              <w:t xml:space="preserve">o por </w:t>
+                            </w:r>
+                            <w:r>
+                              <w:rPr>
+                                <w:rFonts w:ascii="Baskerville" w:hAnsi="Baskerville"/>
+                                <w:sz w:val="28"/>
+                                <w:szCs w:val="28"/>
+                              </w:rPr>
+                              <w:t>D</w:t>
+                            </w:r>
+                            <w:r>
+                              <w:rPr>
+                                <w:rFonts w:ascii="Baskerville" w:hAnsi="Baskerville"/>
+                                <w:sz w:val="28"/>
+                                <w:szCs w:val="28"/>
+                              </w:rPr>
+                              <w:t>esarrollador</w:t>
+                            </w:r>
+                            <w:r>
+                              <w:rPr>
+                                <w:rFonts w:ascii="Baskerville" w:hAnsi="Baskerville"/>
+                                <w:sz w:val="28"/>
+                                <w:szCs w:val="28"/>
+                              </w:rPr>
+                              <w:t xml:space="preserve"> Mensual </w:t>
+                            </w:r>
+                            <w:r>
+                              <w:rPr>
+                                <w:rFonts w:ascii="Baskerville" w:hAnsi="Baskerville"/>
+                                <w:sz w:val="28"/>
+                                <w:szCs w:val="28"/>
+                              </w:rPr>
+                              <w:tab/>
+                              <w:t xml:space="preserve">$1,800 </w:t>
+                            </w:r>
+                            <w:r>
+                              <w:rPr>
+                                <w:rFonts w:ascii="Baskerville" w:hAnsi="Baskerville"/>
+                                <w:sz w:val="28"/>
+                                <w:szCs w:val="28"/>
+                              </w:rPr>
+                              <w:t>USD</w:t>
+                            </w:r>
+                          </w:p>
+                          <w:p>
+                            <w:pPr>
+                              <w:rPr>
+                                <w:rFonts w:ascii="Baskerville" w:hAnsi="Baskerville"/>
+                                <w:sz w:val="24"/>
+                                <w:szCs w:val="24"/>
+                              </w:rPr>
+                            </w:pPr>
+                          </w:p>
+                          <w:p>
+                            <w:pPr>
+                              <w:jc w:val="both"/>
+                              <w:rPr>
+                                <w:rFonts w:eastAsiaTheme="minorEastAsia"/>
+                                <w:sz w:val="24"/>
+                                <w:szCs w:val="24"/>
+                              </w:rPr>
+                            </w:pPr>
+                            <m:oMathPara>
+                              <m:oMath>
+                                <m:r>
+                                  <w:rPr>
+                                    <w:rFonts w:ascii="Cambria Math" w:hAnsi="Cambria Math"/>
+                                    <w:sz w:val="24"/>
+                                    <w:szCs w:val="24"/>
+                                  </w:rPr>
+                                  <m:t>sueldos</m:t>
+                                </m:r>
+                                <m:r>
+                                  <w:rPr>
+                                    <w:rFonts w:ascii="Cambria Math" w:hAnsi="Cambria Math"/>
+                                    <w:sz w:val="24"/>
+                                    <w:szCs w:val="24"/>
+                                  </w:rPr>
+                                  <m:t>=</m:t>
+                                </m:r>
+                                <m:r>
+                                  <w:rPr>
+                                    <w:rFonts w:ascii="Cambria Math" w:hAnsi="Cambria Math"/>
+                                    <w:sz w:val="24"/>
+                                    <w:szCs w:val="24"/>
+                                  </w:rPr>
+                                  <m:t>1,800 USD*2 desarrolladores*4 meses=</m:t>
+                                </m:r>
+                                <m:r>
+                                  <w:rPr>
+                                    <w:rFonts w:ascii="Cambria Math" w:hAnsi="Cambria Math"/>
+                                    <w:sz w:val="24"/>
+                                    <w:szCs w:val="24"/>
+                                  </w:rPr>
+                                  <m:t>$14,400 USD</m:t>
+                                </m:r>
+                                <m:r>
+                                  <w:rPr>
+                                    <w:rFonts w:ascii="Cambria Math" w:hAnsi="Cambria Math"/>
+                                    <w:sz w:val="24"/>
+                                    <w:szCs w:val="24"/>
+                                  </w:rPr>
+                                  <m:t xml:space="preserve"> </m:t>
+                                </m:r>
+                              </m:oMath>
+                            </m:oMathPara>
+                          </w:p>
+                          <w:p>
+                            <w:pPr>
+                              <w:jc w:val="both"/>
+                            </w:pPr>
+                          </w:p>
+                        </w:txbxContent>
+                      </wps:txbx>
+                      <wps:bodyPr rot="0" spcFirstLastPara="0" vertOverflow="overflow" horzOverflow="overflow" vert="horz" wrap="square" lIns="91440" tIns="45720" rIns="91440" bIns="45720" numCol="1" spcCol="0" rtlCol="0" fromWordArt="0" anchor="t" anchorCtr="0" forceAA="0" compatLnSpc="1">
+                        <a:prstTxWarp prst="textNoShape">
+                          <a:avLst/>
+                        </a:prstTxWarp>
+                        <a:noAutofit/>
+                      </wps:bodyPr>
+                    </wps:wsp>
+                  </a:graphicData>
+                </a:graphic>
+                <wp14:sizeRelH relativeFrom="margin">
+                  <wp14:pctWidth>0</wp14:pctWidth>
+                </wp14:sizeRelH>
+                <wp14:sizeRelV relativeFrom="margin">
+                  <wp14:pctHeight>0</wp14:pctHeight>
+                </wp14:sizeRelV>
+              </wp:anchor>
+            </w:drawing>
+          </mc:Choice>
+          <mc:Fallback>
+            <w:pict>
+              <v:shapetype w14:anchorId="673B1B89" id="_x0000_t202" coordsize="21600,21600" o:spt="202" path="m,l,21600r21600,l21600,xe">
+                <v:stroke joinstyle="miter"/>
+                <v:path gradientshapeok="t" o:connecttype="rect"/>
+              </v:shapetype>
+              <v:shape id="Text Box 58" o:spid="_x0000_s1029" type="#_x0000_t202" style="position:absolute;margin-left:20.25pt;margin-top:47.65pt;width:407.7pt;height:110.65pt;z-index:251658298;visibility:visible;mso-wrap-style:square;mso-width-percent:0;mso-height-percent:0;mso-wrap-distance-left:9pt;mso-wrap-distance-top:0;mso-wrap-distance-right:9pt;mso-wrap-distance-bottom:0;mso-position-horizontal:absolute;mso-position-horizontal-relative:text;mso-position-vertical:absolute;mso-position-vertical-relative:text;mso-width-percent:0;mso-height-percent:0;mso-width-relative:margin;mso-height-relative:margin;v-text-anchor:top" o:gfxdata="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" fillcolor="#f2f2f2 [3052]" stroked="f" strokeweight=".5pt">
+                <v:textbox>
+                  <w:txbxContent>
+                    <w:p>
+                      <w:pPr>
+                        <w:rPr>
+                          <w:rFonts w:ascii="Baskerville" w:hAnsi="Baskerville"/>
+                          <w:sz w:val="28"/>
+                          <w:szCs w:val="28"/>
+                        </w:rPr>
+                      </w:pPr>
+                      <w:r>
+                        <w:rPr>
+                          <w:rFonts w:ascii="Baskerville" w:hAnsi="Baskerville"/>
+                          <w:sz w:val="28"/>
+                          <w:szCs w:val="28"/>
+                        </w:rPr>
+                        <w:t>Sueld</w:t>
+                      </w:r>
+                      <w:r>
+                        <w:rPr>
+                          <w:rFonts w:ascii="Baskerville" w:hAnsi="Baskerville"/>
+                          <w:sz w:val="28"/>
+                          <w:szCs w:val="28"/>
+                        </w:rPr>
+                        <w:t xml:space="preserve">o por </w:t>
+                      </w:r>
+                      <w:r>
+                        <w:rPr>
+                          <w:rFonts w:ascii="Baskerville" w:hAnsi="Baskerville"/>
+                          <w:sz w:val="28"/>
+                          <w:szCs w:val="28"/>
+                        </w:rPr>
+                        <w:t>D</w:t>
+                      </w:r>
+                      <w:r>
+                        <w:rPr>
+                          <w:rFonts w:ascii="Baskerville" w:hAnsi="Baskerville"/>
+                          <w:sz w:val="28"/>
+                          <w:szCs w:val="28"/>
+                        </w:rPr>
+                        <w:t>esarrollador</w:t>
+                      </w:r>
+                      <w:r>
+                        <w:rPr>
+                          <w:rFonts w:ascii="Baskerville" w:hAnsi="Baskerville"/>
+                          <w:sz w:val="28"/>
+                          <w:szCs w:val="28"/>
+                        </w:rPr>
+                        <w:t xml:space="preserve"> Mensual </w:t>
+                      </w:r>
+                      <w:r>
+                        <w:rPr>
+                          <w:rFonts w:ascii="Baskerville" w:hAnsi="Baskerville"/>
+                          <w:sz w:val="28"/>
+                          <w:szCs w:val="28"/>
+                        </w:rPr>
+                        <w:tab/>
+                        <w:t xml:space="preserve">$1,800 </w:t>
+                      </w:r>
+                      <w:r>
+                        <w:rPr>
+                          <w:rFonts w:ascii="Baskerville" w:hAnsi="Baskerville"/>
+                          <w:sz w:val="28"/>
+                          <w:szCs w:val="28"/>
+                        </w:rPr>
+                        <w:t>USD</w:t>
+                      </w:r>
+                    </w:p>
+                    <w:p>
+                      <w:pPr>
+                        <w:rPr>
+                          <w:rFonts w:ascii="Baskerville" w:hAnsi="Baskerville"/>
+                          <w:sz w:val="24"/>
+                          <w:szCs w:val="24"/>
+                        </w:rPr>
+                      </w:pPr>
+                    </w:p>
+                    <w:p>
+                      <w:pPr>
+                        <w:jc w:val="both"/>
+                        <w:rPr>
+                          <w:rFonts w:eastAsiaTheme="minorEastAsia"/>
+                          <w:sz w:val="24"/>
+                          <w:szCs w:val="24"/>
+                        </w:rPr>
+                      </w:pPr>
+                      <m:oMathPara>
+                        <m:oMath>
+                          <m:r>
+                            <w:rPr>
+                              <w:rFonts w:ascii="Cambria Math" w:hAnsi="Cambria Math"/>
+                              <w:sz w:val="24"/>
+                              <w:szCs w:val="24"/>
+                            </w:rPr>
+                            <m:t>sueldos</m:t>
+                          </m:r>
+                          <m:r>
+                            <w:rPr>
+                              <w:rFonts w:ascii="Cambria Math" w:hAnsi="Cambria Math"/>
+                              <w:sz w:val="24"/>
+                              <w:szCs w:val="24"/>
+                            </w:rPr>
+                            <m:t>=</m:t>
+                          </m:r>
+                          <m:r>
+                            <w:rPr>
+                              <w:rFonts w:ascii="Cambria Math" w:hAnsi="Cambria Math"/>
+                              <w:sz w:val="24"/>
+                              <w:szCs w:val="24"/>
+                            </w:rPr>
+                            <m:t>1,800 USD*2 desarrolladores*4 meses=</m:t>
+                          </m:r>
+                          <m:r>
+                            <w:rPr>
+                              <w:rFonts w:ascii="Cambria Math" w:hAnsi="Cambria Math"/>
+                              <w:sz w:val="24"/>
+                              <w:szCs w:val="24"/>
+                            </w:rPr>
+                            <m:t>$14,400 USD</m:t>
+                          </m:r>
+                          <m:r>
+                            <w:rPr>
+                              <w:rFonts w:ascii="Cambria Math" w:hAnsi="Cambria Math"/>
+                              <w:sz w:val="24"/>
+                              <w:szCs w:val="24"/>
+                            </w:rPr>
+                            <m:t xml:space="preserve"> </m:t>
+                          </m:r>
+                        </m:oMath>
+                      </m:oMathPara>
+                    </w:p>
+                    <w:p>
+                      <w:pPr>
+                        <w:jc w:val="both"/>
+                      </w:pPr>
+                    </w:p>
+                  </w:txbxContent>
+                </v:textbox>
+                <w10:wrap type="topAndBottom"/>
+              </v:shape>
+            </w:pict>
+          </mc:Fallback>
+        </mc:AlternateContent>
+      </w:r>
+      <w:r>
+        <w:rPr>
+          <w:rFonts w:ascii="Baskerville" w:hAnsi="Baskerville"/>
+          <w:sz w:val="24"/>
+          <w:szCs w:val="24"/>
+        </w:rPr>
+        <w:t xml:space="preserve">Asignaremos un </w:t>
+      </w:r>
+      <w:r>
+        <w:rPr>
+          <w:rFonts w:ascii="Baskerville" w:hAnsi="Baskerville"/>
+          <w:sz w:val="24"/>
+          <w:szCs w:val="24"/>
+        </w:rPr>
+        <w:t>sueldo</w:t>
+      </w:r>
+      <w:r>
+        <w:rPr>
+          <w:rFonts w:ascii="Baskerville" w:hAnsi="Baskerville"/>
+          <w:sz w:val="24"/>
+          <w:szCs w:val="24"/>
+        </w:rPr>
+        <w:t xml:space="preserve"> mensual de $</w:t>
+      </w:r>
+      <w:r>
+        <w:rPr>
+          <w:rFonts w:ascii="Baskerville" w:hAnsi="Baskerville"/>
+          <w:sz w:val="24"/>
+          <w:szCs w:val="24"/>
+        </w:rPr>
+        <w:t>1,800 USD</w:t>
+      </w:r>
+      <w:r>
+        <w:rPr>
+          <w:rFonts w:ascii="Baskerville" w:hAnsi="Baskerville"/>
+          <w:sz w:val="24"/>
+          <w:szCs w:val="24"/>
+        </w:rPr>
+        <w:t>(</w:t>
+      </w:r>
+      <w:r>
+        <w:rPr>
+          <w:rFonts w:ascii="Baskerville" w:hAnsi="Baskerville"/>
+          <w:sz w:val="24"/>
+          <w:szCs w:val="24"/>
+        </w:rPr>
+        <w:t>$</w:t>
+      </w:r>
+      <w:r>
+        <w:rPr>
+          <w:rFonts w:ascii="Baskerville" w:hAnsi="Baskerville"/>
+          <w:sz w:val="24"/>
+          <w:szCs w:val="24"/>
+        </w:rPr>
+        <w:t>36,000MXN</w:t>
+      </w:r>
+      <w:r>
+        <w:rPr>
+          <w:rFonts w:ascii="Baskerville" w:hAnsi="Baskerville"/>
+          <w:sz w:val="24"/>
+          <w:szCs w:val="24"/>
+        </w:rPr>
+        <w:t>)</w:t>
+      </w:r>
+      <w:r>
+        <w:rPr>
+          <w:rFonts w:ascii="Baskerville" w:hAnsi="Baskerville"/>
+          <w:sz w:val="24"/>
+          <w:szCs w:val="24"/>
+        </w:rPr>
+        <w:t xml:space="preserve"> mensuales por desarrollador:</w:t>
+      </w:r>
+    </w:p>
+    <w:p>
+      <w:pPr>
+        <w:rPr>
+          <w:rFonts w:ascii="Baskerville" w:hAnsi="Baskerville"/>
+          <w:sz w:val="24"/>
+          <w:szCs w:val="24"/>
+        </w:rPr>
+      </w:pPr>
+    </w:p>
+    <w:p>
+      <w:pPr>
+        <w:pStyle w:val="Subtitle"/>
+        <w:rPr>
+          <w:rStyle w:val="Emphasis"/>
+        </w:rPr>
+      </w:pPr>
+      <w:r>
+        <w:rPr>
+          <w:rStyle w:val="Emphasis"/>
+        </w:rPr>
+        <w:t>Otros Gastos</w:t>
+      </w:r>
+    </w:p>
+    <w:p>
+      <w:pPr>
+        <w:rPr>
+          <w:rFonts w:ascii="Baskerville" w:hAnsi="Baskerville"/>
+          <w:sz w:val="24"/>
+          <w:szCs w:val="24"/>
+        </w:rPr>
+      </w:pPr>
+      <w:del w:id="24" w:author="Microsoft Word" w:date="2026-05-19T08:47:00Z" w16du:dateUtc="2026-05-19T14:47:00Z">
+        <w:r>
+          <w:rPr>
+            <w:rFonts w:ascii="Baskerville" w:hAnsi="Baskerville"/>
+            <w:noProof/>
+            <w:sz w:val="24"/>
+            <w:szCs w:val="24"/>
+          </w:rPr>
+          <mc:AlternateContent>
+            <mc:Choice Requires="wps">
+              <w:drawing>
+                <wp:anchor distT="0" distB="0" distL="114300" distR="114300" simplePos="0" relativeHeight="251658297" behindDoc="0" locked="0" layoutInCell="1" allowOverlap="1" wp14:anchorId="673B1B89" wp14:editId="6695F70F">
+                  <wp:simplePos x="0" y="0"/>
+                  <wp:positionH relativeFrom="column">
+                    <wp:posOffset>260985</wp:posOffset>
+                  </wp:positionH>
+                  <wp:positionV relativeFrom="paragraph">
+                    <wp:posOffset>2540</wp:posOffset>
+                  </wp:positionV>
+                  <wp:extent cx="5177790" cy="2956560"/>
+                  <wp:effectExtent l="0" t="0" r="22860" b="15240"/>
+                  <wp:wrapTopAndBottom/>
+                  <wp:docPr id="518043903" name="Text Box 58"/>
+                  <wp:cNvGraphicFramePr/>
+                  <a:graphic xmlns:a="http://schemas.openxmlformats.org/drawingml/2006/main">
+                    <a:graphicData uri="http://schemas.microsoft.com/office/word/2010/wordprocessingShape">
+                      <wps:wsp>
+                        <wps:cNvSpPr txBox="1"/>
+                        <wps:spPr>
+                          <a:xfrm>
+                            <a:off x="0" y="0"/>
+                            <a:ext cx="5177790" cy="2956560"/>
+                          </a:xfrm>
+                          <a:prstGeom prst="rect">
+                            <a:avLst/>
+                          </a:prstGeom>
+                          <a:solidFill>
+                            <a:schemeClr val="bg1">
+                              <a:lumMod val="95000"/>
+                            </a:schemeClr>
+                          </a:solidFill>
+                          <a:ln w="6350">
+                            <a:solidFill>
+                              <a:prstClr val="black"/>
+                            </a:solidFill>
+                          </a:ln>
+                        </wps:spPr>
+                        <wps:txbx>
+                          <w:txbxContent>
+                            <w:p>
+                              <w:pPr>
+                                <w:rPr>
+                                  <w:rFonts w:ascii="Baskerville" w:hAnsi="Baskerville"/>
+                                  <w:sz w:val="28"/>
+                                  <w:szCs w:val="28"/>
+                                </w:rPr>
+                              </w:pPr>
+                              <w:r>
+                                <w:rPr>
+                                  <w:rFonts w:ascii="Baskerville" w:hAnsi="Baskerville"/>
+                                  <w:sz w:val="28"/>
+                                  <w:szCs w:val="28"/>
+                                </w:rPr>
+                                <w:t>Sueld</w:t>
+                              </w:r>
+                              <w:r>
+                                <w:rPr>
+                                  <w:rFonts w:ascii="Baskerville" w:hAnsi="Baskerville"/>
+                                  <w:sz w:val="28"/>
+                                  <w:szCs w:val="28"/>
+                                </w:rPr>
+                                <w:t xml:space="preserve">o por </w:t>
+                              </w:r>
+                              <w:r>
+                                <w:rPr>
+                                  <w:rFonts w:ascii="Baskerville" w:hAnsi="Baskerville"/>
+                                  <w:sz w:val="28"/>
+                                  <w:szCs w:val="28"/>
+                                </w:rPr>
+                                <w:t>Desarrollador</w:t>
+                              </w:r>
+                              <w:r>
+                                <w:rPr>
+                                  <w:rFonts w:ascii="Baskerville" w:hAnsi="Baskerville"/>
+                                  <w:sz w:val="28"/>
+                                  <w:szCs w:val="28"/>
+                                </w:rPr>
+                                <w:t xml:space="preserve"> Mensual </w:t>
+                              </w:r>
+                              <w:r>
+                                <w:rPr>
+                                  <w:rFonts w:ascii="Baskerville" w:hAnsi="Baskerville"/>
+                                  <w:sz w:val="28"/>
+                                  <w:szCs w:val="28"/>
+                                </w:rPr>
+                                <w:tab/>
+                                <w:t xml:space="preserve">$1,800 </w:t>
+                              </w:r>
+                              <w:r>
+                                <w:rPr>
+                                  <w:rFonts w:ascii="Baskerville" w:hAnsi="Baskerville"/>
+                                  <w:sz w:val="28"/>
+                                  <w:szCs w:val="28"/>
+                                </w:rPr>
+                                <w:t>USD</w:t>
+                              </w:r>
+                            </w:p>
+                            <w:p>
+                              <w:pPr>
+                                <w:rPr>
+                                  <w:rFonts w:ascii="Baskerville" w:hAnsi="Baskerville"/>
+                                  <w:sz w:val="24"/>
+                                  <w:szCs w:val="24"/>
+                                </w:rPr>
+                              </w:pPr>
+                            </w:p>
+                            <w:p>
+                              <w:pPr>
+                                <w:jc w:val="both"/>
+                                <w:rPr>
+                                  <w:rFonts w:eastAsiaTheme="minorEastAsia"/>
+                                  <w:sz w:val="24"/>
+                                  <w:szCs w:val="24"/>
+                                </w:rPr>
+                              </w:pPr>
+                              <m:oMathPara>
+                                <m:oMath>
+                                  <m:r>
+                                    <w:rPr>
+                                      <w:rFonts w:ascii="Cambria Math" w:hAnsi="Cambria Math"/>
+                                      <w:sz w:val="24"/>
+                                      <w:szCs w:val="24"/>
+                                    </w:rPr>
+                                    <m:t xml:space="preserve">sueldos=1,800 USD*2 desarrolladores*4 meses=$14,400 USD </m:t>
+                                  </m:r>
+                                </m:oMath>
+                              </m:oMathPara>
+                            </w:p>
+                            <w:tbl>
+                              <w:tblPr>
+                                <w:tblStyle w:val="TableGrid"/>
+                                <w:tblW w:w="0" w:type="auto"/>
+                                <w:tblLook w:val="04A0" w:firstRow="1" w:lastRow="0" w:firstColumn="1" w:lastColumn="0" w:noHBand="0" w:noVBand="1"/>
+                              </w:tblPr>
+                              <w:tblGrid>
+                                <w:gridCol w:w="1965"/>
+                                <w:gridCol w:w="1965"/>
+                                <w:gridCol w:w="1965"/>
+                                <w:gridCol w:w="1966"/>
+                              </w:tblGrid>
+                              <w:tr>
+                                <w:tc>
+                                  <w:tcPr>
+                                    <w:tcW w:w="1965" w:type="dxa"/>
+                                  </w:tcPr>
+                                  <w:p>
+                                    <w:pPr>
+                                      <w:jc w:val="both"/>
+                                    </w:pPr>
+                                  </w:p>
+                                </w:tc>
+                                <w:tc>
+                                  <w:tcPr>
+                                    <w:tcW w:w="1965" w:type="dxa"/>
+                                  </w:tcPr>
+                                  <w:p>
+                                    <w:pPr>
+                                      <w:jc w:val="both"/>
+                                    </w:pPr>
+                                  </w:p>
+                                </w:tc>
+                                <w:tc>
+                                  <w:tcPr>
+                                    <w:tcW w:w="1965" w:type="dxa"/>
+                                  </w:tcPr>
+                                  <w:p>
+                                    <w:pPr>
+                                      <w:jc w:val="both"/>
+                                    </w:pPr>
+                                  </w:p>
+                                </w:tc>
+                                <w:tc>
+                                  <w:tcPr>
+                                    <w:tcW w:w="1966" w:type="dxa"/>
+                                  </w:tcPr>
+                                  <w:p>
+                                    <w:pPr>
+                                      <w:jc w:val="both"/>
+                                    </w:pPr>
+                                  </w:p>
+                                </w:tc>
+                              </w:tr>
+                              <w:tr>
+                                <w:tc>
+                                  <w:tcPr>
+                                    <w:tcW w:w="1965" w:type="dxa"/>
+                                  </w:tcPr>
+                                  <w:p>
+                                    <w:pPr>
+                                      <w:jc w:val="both"/>
+                                    </w:pPr>
+                                  </w:p>
+                                </w:tc>
+                                <w:tc>
+                                  <w:tcPr>
+                                    <w:tcW w:w="1965" w:type="dxa"/>
+                                  </w:tcPr>
+                                  <w:p>
+                                    <w:pPr>
+                                      <w:jc w:val="both"/>
+                                    </w:pPr>
+                                  </w:p>
+                                </w:tc>
+                                <w:tc>
+                                  <w:tcPr>
+                                    <w:tcW w:w="1965" w:type="dxa"/>
+                                  </w:tcPr>
+                                  <w:p>
+                                    <w:pPr>
+                                      <w:jc w:val="both"/>
+                                    </w:pPr>
+                                  </w:p>
+                                </w:tc>
+                                <w:tc>
+                                  <w:tcPr>
+                                    <w:tcW w:w="1966" w:type="dxa"/>
+                                  </w:tcPr>
+                                  <w:p>
+                                    <w:pPr>
+                                      <w:jc w:val="both"/>
+                                    </w:pPr>
+                                  </w:p>
+                                </w:tc>
+                              </w:tr>
+                              <w:tr>
+                                <w:tc>
+                                  <w:tcPr>
+                                    <w:tcW w:w="1965" w:type="dxa"/>
+                                  </w:tcPr>
+                                  <w:p>
+                                    <w:pPr>
+                                      <w:jc w:val="both"/>
+                                    </w:pPr>
+                                  </w:p>
+                                </w:tc>
+                                <w:tc>
+                                  <w:tcPr>
+                                    <w:tcW w:w="1965" w:type="dxa"/>
+                                  </w:tcPr>
+                                  <w:p>
+                                    <w:pPr>
+                                      <w:jc w:val="both"/>
+                                    </w:pPr>
+                                  </w:p>
+                                </w:tc>
+                                <w:tc>
+                                  <w:tcPr>
+                                    <w:tcW w:w="1965" w:type="dxa"/>
+                                  </w:tcPr>
+                                  <w:p>
+                                    <w:pPr>
+                                      <w:jc w:val="both"/>
+                                    </w:pPr>
+                                  </w:p>
+                                </w:tc>
+                                <w:tc>
+                                  <w:tcPr>
+                                    <w:tcW w:w="1966" w:type="dxa"/>
+                                  </w:tcPr>
+                                  <w:p>
+                                    <w:pPr>
+                                      <w:jc w:val="both"/>
+                                    </w:pPr>
+                                  </w:p>
+                                </w:tc>
+                              </w:tr>
+                              <w:tr>
+                                <w:tc>
+                                  <w:tcPr>
+                                    <w:tcW w:w="1965" w:type="dxa"/>
+                                  </w:tcPr>
+                                  <w:p>
+                                    <w:pPr>
+                                      <w:jc w:val="both"/>
+                                    </w:pPr>
+                                  </w:p>
+                                </w:tc>
+                                <w:tc>
+                                  <w:tcPr>
+                                    <w:tcW w:w="1965" w:type="dxa"/>
+                                  </w:tcPr>
+                                  <w:p>
+                                    <w:pPr>
+                                      <w:jc w:val="both"/>
+                                    </w:pPr>
+                                  </w:p>
+                                </w:tc>
+                                <w:tc>
+                                  <w:tcPr>
+                                    <w:tcW w:w="1965" w:type="dxa"/>
+                                  </w:tcPr>
+                                  <w:p>
+                                    <w:pPr>
+                                      <w:jc w:val="both"/>
+                                    </w:pPr>
+                                  </w:p>
+                                </w:tc>
+                                <w:tc>
+                                  <w:tcPr>
+                                    <w:tcW w:w="1966" w:type="dxa"/>
+                                  </w:tcPr>
+                                  <w:p>
+                                    <w:pPr>
+                                      <w:jc w:val="both"/>
+                                    </w:pPr>
+                                  </w:p>
+                                </w:tc>
+                              </w:tr>
+                              <w:tr>
+                                <w:tc>
+                                  <w:tcPr>
+                                    <w:tcW w:w="1965" w:type="dxa"/>
+                                  </w:tcPr>
+                                  <w:p>
+                                    <w:pPr>
+                                      <w:jc w:val="both"/>
+                                    </w:pPr>
+                                  </w:p>
+                                </w:tc>
+                                <w:tc>
+                                  <w:tcPr>
+                                    <w:tcW w:w="1965" w:type="dxa"/>
+                                  </w:tcPr>
+                                  <w:p>
+                                    <w:pPr>
+                                      <w:jc w:val="both"/>
+                                    </w:pPr>
+                                  </w:p>
+                                </w:tc>
+                                <w:tc>
+                                  <w:tcPr>
+                                    <w:tcW w:w="1965" w:type="dxa"/>
+                                  </w:tcPr>
+                                  <w:p>
+                                    <w:pPr>
+                                      <w:jc w:val="both"/>
+                                    </w:pPr>
+                                  </w:p>
+                                </w:tc>
+                                <w:tc>
+                                  <w:tcPr>
+                                    <w:tcW w:w="1966" w:type="dxa"/>
+                                  </w:tcPr>
+                                  <w:p>
+                                    <w:pPr>
+                                      <w:jc w:val="both"/>
+                                    </w:pPr>
+                                  </w:p>
+                                </w:tc>
+                              </w:tr>
+                              <w:tr>
+                                <w:tc>
+                                  <w:tcPr>
+                                    <w:tcW w:w="1965" w:type="dxa"/>
+                                  </w:tcPr>
+                                  <w:p>
+                                    <w:pPr>
+                                      <w:jc w:val="both"/>
+                                    </w:pPr>
+                                  </w:p>
+                                </w:tc>
+                                <w:tc>
+                                  <w:tcPr>
+                                    <w:tcW w:w="1965" w:type="dxa"/>
+                                  </w:tcPr>
+                                  <w:p>
+                                    <w:pPr>
+                                      <w:jc w:val="both"/>
+                                    </w:pPr>
+                                  </w:p>
+                                </w:tc>
+                                <w:tc>
+                                  <w:tcPr>
+                                    <w:tcW w:w="1965" w:type="dxa"/>
+                                  </w:tcPr>
+                                  <w:p>
+                                    <w:pPr>
+                                      <w:jc w:val="both"/>
+                                    </w:pPr>
+                                  </w:p>
+                                </w:tc>
+                                <w:tc>
+                                  <w:tcPr>
+                                    <w:tcW w:w="1966" w:type="dxa"/>
+                                  </w:tcPr>
+                                  <w:p>
+                                    <w:pPr>
+                                      <w:jc w:val="both"/>
+                                    </w:pPr>
+                                  </w:p>
+                                </w:tc>
+                              </w:tr>
+                            </w:tbl>
+                            <w:p>
+                              <w:pPr>
+                                <w:jc w:val="both"/>
+                              </w:pPr>
+                            </w:p>
+                          </w:txbxContent>
+                        </wps:txbx>
+                        <wps:bodyPr rot="0" spcFirstLastPara="0" vertOverflow="overflow" horzOverflow="overflow" vert="horz" wrap="square" lIns="91440" tIns="45720" rIns="91440" bIns="45720" numCol="1" spcCol="0" rtlCol="0" fromWordArt="0" anchor="t" anchorCtr="0" forceAA="0" compatLnSpc="1">
+                          <a:prstTxWarp prst="textNoShape">
+                            <a:avLst/>
+                          </a:prstTxWarp>
+                          <a:noAutofit/>
+                        </wps:bodyPr>
+                      </wps:wsp>
+                    </a:graphicData>
+                  </a:graphic>
+                  <wp14:sizeRelH relativeFrom="margin">
+                    <wp14:pctWidth>0</wp14:pctWidth>
+                  </wp14:sizeRelH>
+                  <wp14:sizeRelV relativeFrom="margin">
+                    <wp14:pctHeight>0</wp14:pctHeight>
+                  </wp14:sizeRelV>
+                </wp:anchor>
+              </w:drawing>
+            </mc:Choice>
+            <mc:Fallback>
+              <w:pict>
+                <v:shape w14:anchorId="673B1B89" id="_x0000_s1030" type="#_x0000_t202" style="position:absolute;margin-left:20.55pt;margin-top:.2pt;width:407.7pt;height:232.8pt;z-index:251658297;visibility:visible;mso-wrap-style:square;mso-width-percent:0;mso-height-percent:0;mso-wrap-distance-left:9pt;mso-wrap-distance-top:0;mso-wrap-distance-right:9pt;mso-wrap-distance-bottom:0;mso-position-horizontal:absolute;mso-position-horizontal-relative:text;mso-position-vertical:absolute;mso-position-vertical-relative:text;mso-width-percent:0;mso-height-percent:0;mso-width-relative:margin;mso-height-relative:margin;v-text-anchor:top" o:gfxdata="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" fillcolor="#f2f2f2 [3052]" strokeweight=".5pt">
+                  <v:textbox>
+                    <w:txbxContent>
+                      <w:p>
+                        <w:pPr>
+                          <w:rPr>
+                            <w:rFonts w:ascii="Baskerville" w:hAnsi="Baskerville"/>
+                            <w:sz w:val="28"/>
+                            <w:szCs w:val="28"/>
+                          </w:rPr>
+                        </w:pPr>
+                        <w:r>
+                          <w:rPr>
+                            <w:rFonts w:ascii="Baskerville" w:hAnsi="Baskerville"/>
+                            <w:sz w:val="28"/>
+                            <w:szCs w:val="28"/>
+                          </w:rPr>
+                          <w:t>Sueld</w:t>
+                        </w:r>
+                        <w:r>
+                          <w:rPr>
+                            <w:rFonts w:ascii="Baskerville" w:hAnsi="Baskerville"/>
+                            <w:sz w:val="28"/>
+                            <w:szCs w:val="28"/>
+                          </w:rPr>
+                          <w:t xml:space="preserve">o por </w:t>
+                        </w:r>
+                        <w:r>
+                          <w:rPr>
+                            <w:rFonts w:ascii="Baskerville" w:hAnsi="Baskerville"/>
+                            <w:sz w:val="28"/>
+                            <w:szCs w:val="28"/>
+                          </w:rPr>
+                          <w:t>Desarrollador</w:t>
+                        </w:r>
+                        <w:r>
+                          <w:rPr>
+                            <w:rFonts w:ascii="Baskerville" w:hAnsi="Baskerville"/>
+                            <w:sz w:val="28"/>
+                            <w:szCs w:val="28"/>
+                          </w:rPr>
+                          <w:t xml:space="preserve"> Mensual </w:t>
+                        </w:r>
+                        <w:r>
+                          <w:rPr>
+                            <w:rFonts w:ascii="Baskerville" w:hAnsi="Baskerville"/>
+                            <w:sz w:val="28"/>
+                            <w:szCs w:val="28"/>
+                          </w:rPr>
+                          <w:tab/>
+                          <w:t xml:space="preserve">$1,800 </w:t>
+                        </w:r>
+                        <w:r>
+                          <w:rPr>
+                            <w:rFonts w:ascii="Baskerville" w:hAnsi="Baskerville"/>
+                            <w:sz w:val="28"/>
+                            <w:szCs w:val="28"/>
+                          </w:rPr>
+                          <w:t>USD</w:t>
+                        </w:r>
+                      </w:p>
+                      <w:p>
+                        <w:pPr>
+                          <w:rPr>
+                            <w:rFonts w:ascii="Baskerville" w:hAnsi="Baskerville"/>
+                            <w:sz w:val="24"/>
+                            <w:szCs w:val="24"/>
+                          </w:rPr>
+                        </w:pPr>
+                      </w:p>
+                      <w:p>
+                        <w:pPr>
+                          <w:jc w:val="both"/>
+                          <w:rPr>
+                            <w:rFonts w:eastAsiaTheme="minorEastAsia"/>
+                            <w:sz w:val="24"/>
+                            <w:szCs w:val="24"/>
+                          </w:rPr>
+                        </w:pPr>
+                        <m:oMathPara>
+                          <m:oMath>
+                            <m:r>
+                              <w:rPr>
+                                <w:rFonts w:ascii="Cambria Math" w:hAnsi="Cambria Math"/>
+                                <w:sz w:val="24"/>
+                                <w:szCs w:val="24"/>
+                              </w:rPr>
+                              <m:t xml:space="preserve">sueldos=1,800 USD*2 desarrolladores*4 meses=$14,400 USD </m:t>
+                            </m:r>
+                          </m:oMath>
+                        </m:oMathPara>
+                      </w:p>
+                      <w:tbl>
+                        <w:tblPr>
+                          <w:tblStyle w:val="TableGrid"/>
+                          <w:tblW w:w="0" w:type="auto"/>
+                          <w:tblLook w:val="04A0" w:firstRow="1" w:lastRow="0" w:firstColumn="1" w:lastColumn="0" w:noHBand="0" w:noVBand="1"/>
+                        </w:tblPr>
+                        <w:tblGrid>
+                          <w:gridCol w:w="1965"/>
+                          <w:gridCol w:w="1965"/>
+                          <w:gridCol w:w="1965"/>
+                          <w:gridCol w:w="1966"/>
+                        </w:tblGrid>
+                        <w:tr>
+                          <w:tc>
+                            <w:tcPr>
+                              <w:tcW w:w="1965" w:type="dxa"/>
+                            </w:tcPr>
+                            <w:p>
+                              <w:pPr>
+                                <w:jc w:val="both"/>
+                              </w:pPr>
+                            </w:p>
+                          </w:tc>
+                          <w:tc>
+                            <w:tcPr>
+                              <w:tcW w:w="1965" w:type="dxa"/>
+                            </w:tcPr>
+                            <w:p>
+                              <w:pPr>
+                                <w:jc w:val="both"/>
+                              </w:pPr>
+                            </w:p>
+                          </w:tc>
+                          <w:tc>
+                            <w:tcPr>
+                              <w:tcW w:w="1965" w:type="dxa"/>
+                            </w:tcPr>
+                            <w:p>
+                              <w:pPr>
+                                <w:jc w:val="both"/>
+                              </w:pPr>
+                            </w:p>
+                          </w:tc>
+                          <w:tc>
+                            <w:tcPr>
+                              <w:tcW w:w="1966" w:type="dxa"/>
+                            </w:tcPr>
+                            <w:p>
+                              <w:pPr>
+                                <w:jc w:val="both"/>
+                              </w:pPr>
+                            </w:p>
+                          </w:tc>
+                        </w:tr>
+                        <w:tr>
+                          <w:tc>
+                            <w:tcPr>
+                              <w:tcW w:w="1965" w:type="dxa"/>
+                            </w:tcPr>
+                            <w:p>
+                              <w:pPr>
+                                <w:jc w:val="both"/>
+                              </w:pPr>
+                            </w:p>
+                          </w:tc>
+                          <w:tc>
+                            <w:tcPr>
+                              <w:tcW w:w="1965" w:type="dxa"/>
+                            </w:tcPr>
+                            <w:p>
+                              <w:pPr>
+                                <w:jc w:val="both"/>
+                              </w:pPr>
+                            </w:p>
+                          </w:tc>
+                          <w:tc>
+                            <w:tcPr>
+                              <w:tcW w:w="1965" w:type="dxa"/>
+                            </w:tcPr>
+                            <w:p>
+                              <w:pPr>
+                                <w:jc w:val="both"/>
+                              </w:pPr>
+                            </w:p>
+                          </w:tc>
+                          <w:tc>
+                            <w:tcPr>
+                              <w:tcW w:w="1966" w:type="dxa"/>
+                            </w:tcPr>
+                            <w:p>
+                              <w:pPr>
+                                <w:jc w:val="both"/>
+                              </w:pPr>
+                            </w:p>
+                          </w:tc>
+                        </w:tr>
+                        <w:tr>
+                          <w:tc>
+                            <w:tcPr>
+                              <w:tcW w:w="1965" w:type="dxa"/>
+                            </w:tcPr>
+                            <w:p>
+                              <w:pPr>
+                                <w:jc w:val="both"/>
+                              </w:pPr>
+                            </w:p>
+                          </w:tc>
+                          <w:tc>
+                            <w:tcPr>
+                              <w:tcW w:w="1965" w:type="dxa"/>
+                            </w:tcPr>
+                            <w:p>
+                              <w:pPr>
+                                <w:jc w:val="both"/>
+                              </w:pPr>
+                            </w:p>
+                          </w:tc>
+                          <w:tc>
+                            <w:tcPr>
+                              <w:tcW w:w="1965" w:type="dxa"/>
+                            </w:tcPr>
+                            <w:p>
+                              <w:pPr>
+                                <w:jc w:val="both"/>
+                              </w:pPr>
+                            </w:p>
+                          </w:tc>
+                          <w:tc>
+                            <w:tcPr>
+                              <w:tcW w:w="1966" w:type="dxa"/>
+                            </w:tcPr>
+                            <w:p>
+                              <w:pPr>
+                                <w:jc w:val="both"/>
+                              </w:pPr>
+                            </w:p>
+                          </w:tc>
+                        </w:tr>
+                        <w:tr>
+                          <w:tc>
+                            <w:tcPr>
+                              <w:tcW w:w="1965" w:type="dxa"/>
+                            </w:tcPr>
+                            <w:p>
+                              <w:pPr>
+                                <w:jc w:val="both"/>
+                              </w:pPr>
+                            </w:p>
+                          </w:tc>
+                          <w:tc>
+                            <w:tcPr>
+                              <w:tcW w:w="1965" w:type="dxa"/>
+                            </w:tcPr>
+                            <w:p>
+                              <w:pPr>
+                                <w:jc w:val="both"/>
+                              </w:pPr>
+                            </w:p>
+                          </w:tc>
+                          <w:tc>
+                            <w:tcPr>
+                              <w:tcW w:w="1965" w:type="dxa"/>
+                            </w:tcPr>
+                            <w:p>
+                              <w:pPr>
+                                <w:jc w:val="both"/>
+                              </w:pPr>
+                            </w:p>
+                          </w:tc>
+                          <w:tc>
+                            <w:tcPr>
+                              <w:tcW w:w="1966" w:type="dxa"/>
+                            </w:tcPr>
+                            <w:p>
+                              <w:pPr>
+                                <w:jc w:val="both"/>
+                              </w:pPr>
+                            </w:p>
+                          </w:tc>
+                        </w:tr>
+                        <w:tr>
+                          <w:tc>
+                            <w:tcPr>
+                              <w:tcW w:w="1965" w:type="dxa"/>
+                            </w:tcPr>
+                            <w:p>
+                              <w:pPr>
+                                <w:jc w:val="both"/>
+                              </w:pPr>
+                            </w:p>
+                          </w:tc>
+                          <w:tc>
+                            <w:tcPr>
+                              <w:tcW w:w="1965" w:type="dxa"/>
+                            </w:tcPr>
+                            <w:p>
+                              <w:pPr>
+                                <w:jc w:val="both"/>
+                              </w:pPr>
+                            </w:p>
+                          </w:tc>
+                          <w:tc>
+                            <w:tcPr>
+                              <w:tcW w:w="1965" w:type="dxa"/>
+                            </w:tcPr>
+                            <w:p>
+                              <w:pPr>
+                                <w:jc w:val="both"/>
+                              </w:pPr>
+                            </w:p>
+                          </w:tc>
+                          <w:tc>
+                            <w:tcPr>
+                              <w:tcW w:w="1966" w:type="dxa"/>
+                            </w:tcPr>
+                            <w:p>
+                              <w:pPr>
+                                <w:jc w:val="both"/>
+                              </w:pPr>
+                            </w:p>
+                          </w:tc>
+                        </w:tr>
+                        <w:tr>
+                          <w:tc>
+                            <w:tcPr>
+                              <w:tcW w:w="1965" w:type="dxa"/>
+                            </w:tcPr>
+                            <w:p>
+                              <w:pPr>
+                                <w:jc w:val="both"/>
+                              </w:pPr>
+                            </w:p>
+                          </w:tc>
+                          <w:tc>
+                            <w:tcPr>
+                              <w:tcW w:w="1965" w:type="dxa"/>
+                            </w:tcPr>
+                            <w:p>
+                              <w:pPr>
+                                <w:jc w:val="both"/>
+                              </w:pPr>
+                            </w:p>
+                          </w:tc>
+                          <w:tc>
+                            <w:tcPr>
+                              <w:tcW w:w="1965" w:type="dxa"/>
+                            </w:tcPr>
+                            <w:p>
+                              <w:pPr>
+                                <w:jc w:val="both"/>
+                              </w:pPr>
+                            </w:p>
+                          </w:tc>
+                          <w:tc>
+                            <w:tcPr>
+                              <w:tcW w:w="1966" w:type="dxa"/>
+                            </w:tcPr>
+                            <w:p>
+                              <w:pPr>
+                                <w:jc w:val="both"/>
+                              </w:pPr>
+                            </w:p>
+                          </w:tc>
+                        </w:tr>
+                      </w:tbl>
+                      <w:p>
+                        <w:pPr>
+                          <w:jc w:val="both"/>
+                        </w:pPr>
+                      </w:p>
+                    </w:txbxContent>
+                  </v:textbox>
+                  <w10:wrap type="topAndBottom"/>
+                </v:shape>
+              </w:pict>
+            </mc:Fallback>
+          </mc:AlternateContent>
+        </w:r>
+      </w:del>
+    </w:p>
+    <w:p>
+      <w:pPr>
+        <w:rPr>
+          <w:rFonts w:ascii="Baskerville" w:eastAsiaTheme="majorEastAsia" w:hAnsi="Baskerville" w:cstheme="majorBidi"/>
+          <w:color w:val="595959" w:themeColor="text1" w:themeTint="A6"/>
+          <w:spacing w:val="15"/>
+          <w:sz w:val="36"/>
+          <w:szCs w:val="32"/>
+        </w:rPr>
+      </w:pPr>
+    </w:p>
+    <w:p>
+      <w:pPr>
+        <w:jc w:val="center"/>
+        <w:rPr>
+          <w:rFonts w:ascii="Baskerville" w:eastAsiaTheme="majorEastAsia" w:hAnsi="Baskerville" w:cstheme="majorBidi"/>
+          <w:color w:val="595959" w:themeColor="text1" w:themeTint="A6"/>
+          <w:spacing w:val="15"/>
+          <w:sz w:val="36"/>
+          <w:szCs w:val="32"/>
+        </w:rPr>
+      </w:pPr>
+    </w:p>
+    <w:p>
+      <w:pPr>
+        <w:jc w:val="center"/>
+        <w:rPr>
+          <w:rFonts w:ascii="Baskerville" w:eastAsiaTheme="majorEastAsia" w:hAnsi="Baskerville" w:cstheme="majorBidi"/>
+          <w:color w:val="595959" w:themeColor="text1" w:themeTint="A6"/>
+          <w:spacing w:val="15"/>
+          <w:sz w:val="36"/>
+          <w:szCs w:val="32"/>
+        </w:rPr>
+      </w:pPr>
+    </w:p>
+    <w:p>
+      <w:pPr>
+        <w:jc w:val="center"/>
+        <w:rPr>
+          <w:rFonts w:ascii="Baskerville" w:eastAsiaTheme="majorEastAsia" w:hAnsi="Baskerville" w:cstheme="majorBidi"/>
+          <w:color w:val="595959" w:themeColor="text1" w:themeTint="A6"/>
+          <w:spacing w:val="15"/>
+          <w:sz w:val="36"/>
+          <w:szCs w:val="32"/>
+        </w:rPr>
+      </w:pPr>
+    </w:p>
+    <w:p>
+      <w:pPr>
+        <w:spacing w:line="276" w:lineRule="auto"/>
+        <w:jc w:val="both"/>
+        <w:rPr>
+          <w:rFonts w:ascii="Baskerville" w:hAnsi="Baskerville"/>
+        </w:rPr>
+      </w:pPr>
+      <w:r>
+        <w:rPr>
+          <w:noProof/>
+          <w:sz w:val="36"/>
+          <w:szCs w:val="32"/>
+        </w:rPr>
+        <mc:AlternateContent>
+          <mc:Choice Requires="wps">
+            <w:drawing>
+              <wp:anchor distT="0" distB="0" distL="114300" distR="114300" simplePos="0" relativeHeight="251658280" behindDoc="0" locked="0" layoutInCell="1" allowOverlap="1" wp14:anchorId="09E1FDD3" wp14:editId="3DD34013">
                 <wp:simplePos x="0" y="0"/>
                 <wp:positionH relativeFrom="column">
                   <wp:posOffset>-1094740</wp:posOffset>
@@ -11164,7 +14402,7 @@
         </mc:AlternateContent>
       </w:r>
     </w:p>
-    <w:bookmarkStart w:id="24" w:name="_Toc229638675"/>
+    <w:bookmarkStart w:id="25" w:name="_Toc229638675"/>
     <w:p>
       <w:pPr>
         <w:pStyle w:val="Heading1"/>
@@ -11181,7 +14419,7 @@
         <mc:AlternateContent>
           <mc:Choice Requires="wps">
             <w:drawing>
-              <wp:anchor distT="0" distB="0" distL="114300" distR="114300" simplePos="0" relativeHeight="251658280" behindDoc="0" locked="0" layoutInCell="1" allowOverlap="1" wp14:anchorId="6C4DEA1F" wp14:editId="7EE2B3C9">
+              <wp:anchor distT="0" distB="0" distL="114300" distR="114300" simplePos="0" relativeHeight="251658279" behindDoc="0" locked="0" layoutInCell="1" allowOverlap="1" wp14:anchorId="6C4DEA1F" wp14:editId="7EE2B3C9">
                 <wp:simplePos x="0" y="0"/>
                 <wp:positionH relativeFrom="column">
                   <wp:posOffset>-1090930</wp:posOffset>
@@ -11269,7 +14507,7 @@
         </w:rPr>
         <w:t>14. Anexos</w:t>
       </w:r>
-      <w:bookmarkEnd w:id="24"/>
+      <w:bookmarkEnd w:id="25"/>
     </w:p>
     <w:p>
       <w:pPr>
@@ -11321,7 +14559,7 @@
                     </pic:cNvPicPr>
                   </pic:nvPicPr>
                   <pic:blipFill>
-                    <a:blip r:embed="rId15" cstate="print">
+                    <a:blip r:embed="rId19" cstate="print">
                       <a:extLst>
                         <a:ext uri="{28A0092B-C50C-407E-A947-70E740481C1C}">
                           <a14:useLocalDpi xmlns:a14="http://schemas.microsoft.com/office/drawing/2010/main" val="0"/>
@@ -11392,7 +14630,7 @@
           <w:noProof/>
         </w:rPr>
         <w:drawing>
-          <wp:anchor distT="0" distB="0" distL="114300" distR="114300" simplePos="0" relativeHeight="251658245" behindDoc="0" locked="0" layoutInCell="1" allowOverlap="1" wp14:anchorId="3DBA43CC" wp14:editId="19907EFF">
+          <wp:anchor distT="0" distB="0" distL="114300" distR="114300" simplePos="0" relativeHeight="251658245" behindDoc="0" locked="0" layoutInCell="1" allowOverlap="1" wp14:anchorId="3DBA43CC" wp14:editId="16548D94">
             <wp:simplePos x="0" y="0"/>
             <wp:positionH relativeFrom="margin">
               <wp:posOffset>3204845</wp:posOffset>
@@ -11415,7 +14653,7 @@
                     <pic:cNvPicPr/>
                   </pic:nvPicPr>
                   <pic:blipFill>
-                    <a:blip r:embed="rId16" cstate="print">
+                    <a:blip r:embed="rId20" cstate="print">
                       <a:extLst>
                         <a:ext uri="{28A0092B-C50C-407E-A947-70E740481C1C}">
                           <a14:useLocalDpi xmlns:a14="http://schemas.microsoft.com/office/drawing/2010/main" val="0"/>
@@ -11569,6 +14807,7 @@
           <w:b/>
           <w:bCs/>
         </w:rPr>
+        <w:lastRenderedPageBreak/>
         <w:t xml:space="preserve">Anexo B. </w:t>
       </w:r>
       <w:r>
@@ -11773,7 +15012,7 @@
           <w:highlight w:val="black"/>
         </w:rPr>
         <w:drawing>
-          <wp:anchor distT="0" distB="0" distL="114300" distR="114300" simplePos="0" relativeHeight="251658283" behindDoc="0" locked="0" layoutInCell="1" allowOverlap="1" wp14:anchorId="7E843AAA" wp14:editId="0024A9BE">
+          <wp:anchor distT="0" distB="0" distL="114300" distR="114300" simplePos="0" relativeHeight="251658282" behindDoc="0" locked="0" layoutInCell="1" allowOverlap="1" wp14:anchorId="7E843AAA" wp14:editId="118AD686">
             <wp:simplePos x="0" y="0"/>
             <wp:positionH relativeFrom="margin">
               <wp:posOffset>-242570</wp:posOffset>
@@ -11798,7 +15037,7 @@
                     </pic:cNvPicPr>
                   </pic:nvPicPr>
                   <pic:blipFill>
-                    <a:blip r:embed="rId17" cstate="print">
+                    <a:blip r:embed="rId21" cstate="print">
                       <a:extLst>
                         <a:ext uri="{28A0092B-C50C-407E-A947-70E740481C1C}">
                           <a14:useLocalDpi xmlns:a14="http://schemas.microsoft.com/office/drawing/2010/main" val="0"/>
@@ -11868,7 +15107,7 @@
           <w:highlight w:val="black"/>
         </w:rPr>
         <w:drawing>
-          <wp:anchor distT="0" distB="0" distL="114300" distR="114300" simplePos="0" relativeHeight="251658282" behindDoc="0" locked="0" layoutInCell="1" allowOverlap="1" wp14:anchorId="746BA3CF" wp14:editId="20029116">
+          <wp:anchor distT="0" distB="0" distL="114300" distR="114300" simplePos="0" relativeHeight="251658281" behindDoc="0" locked="0" layoutInCell="1" allowOverlap="1" wp14:anchorId="746BA3CF" wp14:editId="20029116">
             <wp:simplePos x="0" y="0"/>
             <wp:positionH relativeFrom="page">
               <wp:posOffset>3675927</wp:posOffset>
@@ -11893,7 +15132,7 @@
                     </pic:cNvPicPr>
                   </pic:nvPicPr>
                   <pic:blipFill rotWithShape="1">
-                    <a:blip r:embed="rId18" cstate="print">
+                    <a:blip r:embed="rId22" cstate="print">
                       <a:extLst>
                         <a:ext uri="{28A0092B-C50C-407E-A947-70E740481C1C}">
                           <a14:useLocalDpi xmlns:a14="http://schemas.microsoft.com/office/drawing/2010/main" val="0"/>
@@ -12072,7 +15311,6 @@
           <w:b/>
           <w:bCs/>
         </w:rPr>
-        <w:lastRenderedPageBreak/>
         <w:t xml:space="preserve">Anexo C. </w:t>
       </w:r>
       <w:r>
@@ -12096,7 +15334,7 @@
         <mc:AlternateContent>
           <mc:Choice Requires="wpg">
             <w:drawing>
-              <wp:anchor distT="0" distB="0" distL="114300" distR="114300" simplePos="0" relativeHeight="251658248" behindDoc="0" locked="0" layoutInCell="1" allowOverlap="1" wp14:anchorId="4842BF2B" wp14:editId="7A38DCD3">
+              <wp:anchor distT="0" distB="0" distL="114300" distR="114300" simplePos="0" relativeHeight="251658299" behindDoc="0" locked="0" layoutInCell="1" allowOverlap="1" wp14:anchorId="4842BF2B" wp14:editId="7A38DCD3">
                 <wp:simplePos x="0" y="0"/>
                 <wp:positionH relativeFrom="column">
                   <wp:posOffset>-640864</wp:posOffset>
@@ -12192,10 +15430,10 @@
                             </pic:cNvPicPr>
                           </pic:nvPicPr>
                           <pic:blipFill>
-                            <a:blip r:embed="rId19">
+                            <a:blip r:embed="rId23">
                               <a:extLst>
                                 <a:ext uri="{96DAC541-7B7A-43D3-8B79-37D633B846F1}">
-                                  <asvg:svgBlip xmlns:asvg="http://schemas.microsoft.com/office/drawing/2016/SVG/main" r:embed="rId20"/>
+                                  <asvg:svgBlip xmlns:asvg="http://schemas.microsoft.com/office/drawing/2016/SVG/main" r:embed="rId24"/>
                                 </a:ext>
                               </a:extLst>
                             </a:blip>
@@ -13059,10 +16297,10 @@
                             </pic:cNvPicPr>
                           </pic:nvPicPr>
                           <pic:blipFill>
-                            <a:blip r:embed="rId19">
+                            <a:blip r:embed="rId23">
                               <a:extLst>
                                 <a:ext uri="{96DAC541-7B7A-43D3-8B79-37D633B846F1}">
-                                  <asvg:svgBlip xmlns:asvg="http://schemas.microsoft.com/office/drawing/2016/SVG/main" r:embed="rId20"/>
+                                  <asvg:svgBlip xmlns:asvg="http://schemas.microsoft.com/office/drawing/2016/SVG/main" r:embed="rId24"/>
                                 </a:ext>
                               </a:extLst>
                             </a:blip>
@@ -13737,9 +16975,9 @@
           </mc:Choice>
           <mc:Fallback>
             <w:pict>
-              <v:group w14:anchorId="4842BF2B" id="Group 4" o:spid="_x0000_s1029" style="position:absolute;margin-left:-50.45pt;margin-top:1.65pt;width:551.75pt;height:273.6pt;z-index:251658248" coordsize="70069,34747" o:gfxdata="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">
-                <v:group id="Grupo 24" o:spid="_x0000_s1030" style="position:absolute;top:6633;width:26954;height:23352" coordsize="26954,23351" o:gfxdata="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">
-                  <v:roundrect id="Rectángulo: esquinas redondeadas 18" o:spid="_x0000_s1031" style="position:absolute;top:2470;width:26954;height:20881;visibility:visible;mso-wrap-style:square;v-text-anchor:middle" arcsize="10923f" o:gfxdata="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" filled="f" strokecolor="#091723 [484]" strokeweight="1.5pt">
+              <v:group w14:anchorId="4842BF2B" id="Group 4" o:spid="_x0000_s1031" style="position:absolute;margin-left:-50.45pt;margin-top:1.65pt;width:551.75pt;height:273.6pt;z-index:251658299" coordsize="70069,34747" o:gfxdata="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">
+                <v:group id="Grupo 24" o:spid="_x0000_s1032" style="position:absolute;top:6633;width:26954;height:23352" coordsize="26954,23351" o:gfxdata="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">
+                  <v:roundrect id="Rectángulo: esquinas redondeadas 18" o:spid="_x0000_s1033" style="position:absolute;top:2470;width:26954;height:20881;visibility:visible;mso-wrap-style:square;v-text-anchor:middle" arcsize="10923f" o:gfxdata="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" filled="f" strokecolor="#091723 [484]" strokeweight="1.5pt">
                     <v:stroke joinstyle="miter"/>
                     <v:textbox>
                       <w:txbxContent>
@@ -13776,10 +17014,10 @@
                     <v:path o:extrusionok="f" gradientshapeok="t" o:connecttype="rect"/>
                     <o:lock v:ext="edit" aspectratio="t"/>
                   </v:shapetype>
-                  <v:shape id="Gráfico 11" o:spid="_x0000_s1032" type="#_x0000_t75" alt="Base de datos con relleno sólido" style="position:absolute;left:10508;top:14958;width:5868;height:5867;visibility:visible;mso-wrap-style:square" o:gfxdata="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">
-                    <v:imagedata r:id="rId21" o:title="Base de datos con relleno sólido"/>
+                  <v:shape id="Gráfico 11" o:spid="_x0000_s1034" type="#_x0000_t75" alt="Base de datos con relleno sólido" style="position:absolute;left:10508;top:14958;width:5868;height:5867;visibility:visible;mso-wrap-style:square" o:gfxdata="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">
+                    <v:imagedata r:id="rId25" o:title="Base de datos con relleno sólido"/>
                   </v:shape>
-                  <v:roundrect id="Rectángulo: esquinas redondeadas 18" o:spid="_x0000_s1033" style="position:absolute;left:1091;top:4927;width:9758;height:4504;visibility:visible;mso-wrap-style:square;v-text-anchor:middle" arcsize="10923f" o:gfxdata="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" filled="f" strokecolor="#091723 [484]" strokeweight="1.5pt">
+                  <v:roundrect id="Rectángulo: esquinas redondeadas 18" o:spid="_x0000_s1035" style="position:absolute;left:1091;top:4927;width:9758;height:4504;visibility:visible;mso-wrap-style:square;v-text-anchor:middle" arcsize="10923f" o:gfxdata="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" filled="f" strokecolor="#091723 [484]" strokeweight="1.5pt">
                     <v:stroke joinstyle="miter"/>
                     <v:textbox>
                       <w:txbxContent>
@@ -13817,7 +17055,7 @@
                       </w:txbxContent>
                     </v:textbox>
                   </v:roundrect>
-                  <v:roundrect id="Rectángulo: esquinas redondeadas 18" o:spid="_x0000_s1034" style="position:absolute;left:15080;top:5063;width:10168;height:4163;visibility:visible;mso-wrap-style:square;v-text-anchor:middle" arcsize="10923f" o:gfxdata="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" filled="f" strokecolor="#091723 [484]" strokeweight="1.5pt">
+                  <v:roundrect id="Rectángulo: esquinas redondeadas 18" o:spid="_x0000_s1036" style="position:absolute;left:15080;top:5063;width:10168;height:4163;visibility:visible;mso-wrap-style:square;v-text-anchor:middle" arcsize="10923f" o:gfxdata="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" filled="f" strokecolor="#091723 [484]" strokeweight="1.5pt">
                     <v:stroke joinstyle="miter"/>
                     <v:textbox>
                       <w:txbxContent>
@@ -13879,17 +17117,13 @@
                     <v:path arrowok="t" fillok="f" o:connecttype="none"/>
                     <o:lock v:ext="edit" shapetype="t"/>
                   </v:shapetype>
-                  <v:shape id="Conector recto de flecha 19" o:spid="_x0000_s1035" type="#_x0000_t32" style="position:absolute;left:5663;top:10181;width:4092;height:4090;visibility:visible;mso-wrap-style:square" o:connectortype="straight" o:gfxdata="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" strokecolor="black [3200]" strokeweight="1.5pt">
+                  <v:shape id="Conector recto de flecha 19" o:spid="_x0000_s1037" type="#_x0000_t32" style="position:absolute;left:5663;top:10181;width:4092;height:4090;visibility:visible;mso-wrap-style:square" o:connectortype="straight" o:gfxdata="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" strokecolor="black [3200]" strokeweight="1.5pt">
                     <v:stroke endarrow="block" joinstyle="miter"/>
                   </v:shape>
-                  <v:shape id="Conector recto de flecha 19" o:spid="_x0000_s1036" type="#_x0000_t32" style="position:absolute;left:16348;top:9977;width:3655;height:4287;flip:x;visibility:visible;mso-wrap-style:square" o:connectortype="straight" o:gfxdata="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" strokecolor="black [3200]" strokeweight="1.5pt">
+                  <v:shape id="Conector recto de flecha 19" o:spid="_x0000_s1038" type="#_x0000_t32" style="position:absolute;left:16348;top:9977;width:3655;height:4287;flip:x;visibility:visible;mso-wrap-style:square" o:connectortype="straight" o:gfxdata="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" strokecolor="black [3200]" strokeweight="1.5pt">
                     <v:stroke endarrow="block" joinstyle="miter"/>
                   </v:shape>
-                  <v:shapetype id="_x0000_t202" coordsize="21600,21600" o:spt="202" path="m,l,21600r21600,l21600,xe">
-                    <v:stroke joinstyle="miter"/>
-                    <v:path gradientshapeok="t" o:connecttype="rect"/>
-                  </v:shapetype>
-                  <v:shape id="Cuadro de texto 20" o:spid="_x0000_s1037" type="#_x0000_t202" style="position:absolute;left:5786;width:16036;height:4230;visibility:visible;mso-wrap-style:square;v-text-anchor:top" o:gfxdata="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" fillcolor="white [3212]" strokeweight="1pt">
+                  <v:shape id="Cuadro de texto 20" o:spid="_x0000_s1039" type="#_x0000_t202" style="position:absolute;left:5786;width:16036;height:4230;visibility:visible;mso-wrap-style:square;v-text-anchor:top" o:gfxdata="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" fillcolor="white [3212]" strokeweight="1pt">
                     <v:textbox>
                       <w:txbxContent>
                         <w:p>
@@ -13929,8 +17163,8 @@
                     </v:textbox>
                   </v:shape>
                 </v:group>
-                <v:group id="Grupo 22" o:spid="_x0000_s1038" style="position:absolute;left:43120;width:26949;height:34747" coordsize="26949,34747" o:gfxdata="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">
-                  <v:roundrect id="Rectángulo: esquinas redondeadas 18" o:spid="_x0000_s1039" style="position:absolute;top:2743;width:26949;height:32004;visibility:visible;mso-wrap-style:square;v-text-anchor:middle" arcsize="10923f" o:gfxdata="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" filled="f" strokecolor="#091723 [484]" strokeweight="1.5pt">
+                <v:group id="Grupo 22" o:spid="_x0000_s1040" style="position:absolute;left:43120;width:26949;height:34747" coordsize="26949,34747" o:gfxdata="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">
+                  <v:roundrect id="Rectángulo: esquinas redondeadas 18" o:spid="_x0000_s1041" style="position:absolute;top:2743;width:26949;height:32004;visibility:visible;mso-wrap-style:square;v-text-anchor:middle" arcsize="10923f" o:gfxdata="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" filled="f" strokecolor="#091723 [484]" strokeweight="1.5pt">
                     <v:stroke joinstyle="miter"/>
                     <v:textbox>
                       <w:txbxContent>
@@ -13948,7 +17182,7 @@
                       </w:txbxContent>
                     </v:textbox>
                   </v:roundrect>
-                  <v:shape id="Cuadro de texto 20" o:spid="_x0000_s1040" type="#_x0000_t202" style="position:absolute;left:5990;width:16036;height:4230;visibility:visible;mso-wrap-style:square;v-text-anchor:top" o:gfxdata="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" fillcolor="white [3212]" strokeweight="1pt">
+                  <v:shape id="Cuadro de texto 20" o:spid="_x0000_s1042" type="#_x0000_t202" style="position:absolute;left:5990;width:16036;height:4230;visibility:visible;mso-wrap-style:square;v-text-anchor:top" o:gfxdata="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" fillcolor="white [3212]" strokeweight="1pt">
                     <v:textbox>
                       <w:txbxContent>
                         <w:p>
@@ -13970,7 +17204,7 @@
                       </w:txbxContent>
                     </v:textbox>
                   </v:shape>
-                  <v:roundrect id="Rectángulo: esquinas redondeadas 18" o:spid="_x0000_s1041" style="position:absolute;left:1160;top:8475;width:13101;height:4502;visibility:visible;mso-wrap-style:square;v-text-anchor:middle" arcsize="10923f" o:gfxdata="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" filled="f" strokecolor="#091723 [484]" strokeweight="1.5pt">
+                  <v:roundrect id="Rectángulo: esquinas redondeadas 18" o:spid="_x0000_s1043" style="position:absolute;left:1160;top:8475;width:13101;height:4502;visibility:visible;mso-wrap-style:square;v-text-anchor:middle" arcsize="10923f" o:gfxdata="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" filled="f" strokecolor="#091723 [484]" strokeweight="1.5pt">
                     <v:stroke joinstyle="miter"/>
                     <v:textbox>
                       <w:txbxContent>
@@ -14059,10 +17293,10 @@
                       </w:txbxContent>
                     </v:textbox>
                   </v:roundrect>
-                  <v:shape id="Gráfico 11" o:spid="_x0000_s1042" type="#_x0000_t75" alt="Base de datos con relleno sólido" style="position:absolute;left:10645;top:28333;width:5867;height:5867;visibility:visible;mso-wrap-style:square" o:gfxdata="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">
-                    <v:imagedata r:id="rId21" o:title="Base de datos con relleno sólido"/>
+                  <v:shape id="Gráfico 11" o:spid="_x0000_s1044" type="#_x0000_t75" alt="Base de datos con relleno sólido" style="position:absolute;left:10645;top:28333;width:5867;height:5867;visibility:visible;mso-wrap-style:square" o:gfxdata="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">
+                    <v:imagedata r:id="rId25" o:title="Base de datos con relleno sólido"/>
                   </v:shape>
-                  <v:roundrect id="Rectángulo: esquinas redondeadas 18" o:spid="_x0000_s1043" style="position:absolute;left:15831;top:8680;width:10166;height:4159;visibility:visible;mso-wrap-style:square;v-text-anchor:middle" arcsize="10923f" o:gfxdata="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" filled="f" strokecolor="#091723 [484]" strokeweight="1.5pt">
+                  <v:roundrect id="Rectángulo: esquinas redondeadas 18" o:spid="_x0000_s1045" style="position:absolute;left:15831;top:8680;width:10166;height:4159;visibility:visible;mso-wrap-style:square;v-text-anchor:middle" arcsize="10923f" o:gfxdata="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" filled="f" strokecolor="#091723 [484]" strokeweight="1.5pt">
                     <v:stroke joinstyle="miter"/>
                     <v:textbox>
                       <w:txbxContent>
@@ -14109,10 +17343,10 @@
                       </w:txbxContent>
                     </v:textbox>
                   </v:roundrect>
-                  <v:line id="Conector recto 21" o:spid="_x0000_s1044" style="position:absolute;visibility:visible;mso-wrap-style:square" from="1501,14890" to="25732,14958" o:connectortype="straight" o:gfxdata="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" strokecolor="black [3200]" strokeweight="1.5pt">
+                  <v:line id="Conector recto 21" o:spid="_x0000_s1046" style="position:absolute;visibility:visible;mso-wrap-style:square" from="1501,14890" to="25732,14958" o:connectortype="straight" o:gfxdata="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" strokecolor="black [3200]" strokeweight="1.5pt">
                     <v:stroke joinstyle="miter"/>
                   </v:line>
-                  <v:shape id="Cuadro de texto 20" o:spid="_x0000_s1045" type="#_x0000_t202" style="position:absolute;left:1487;top:5117;width:13457;height:1994;visibility:visible;mso-wrap-style:square;v-text-anchor:top" o:gfxdata="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" fillcolor="white [3212]" strokeweight="1pt">
+                  <v:shape id="Cuadro de texto 20" o:spid="_x0000_s1047" type="#_x0000_t202" style="position:absolute;left:1487;top:5117;width:13457;height:1994;visibility:visible;mso-wrap-style:square;v-text-anchor:top" o:gfxdata="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" fillcolor="white [3212]" strokeweight="1pt">
                     <v:textbox>
                       <w:txbxContent>
                         <w:p>
@@ -14142,7 +17376,7 @@
                       </w:txbxContent>
                     </v:textbox>
                   </v:shape>
-                  <v:shape id="Cuadro de texto 20" o:spid="_x0000_s1046" type="#_x0000_t202" style="position:absolute;left:1691;top:16513;width:13458;height:1993;visibility:visible;mso-wrap-style:square;v-text-anchor:top" o:gfxdata="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" fillcolor="white [3212]" strokeweight="1pt">
+                  <v:shape id="Cuadro de texto 20" o:spid="_x0000_s1048" type="#_x0000_t202" style="position:absolute;left:1691;top:16513;width:13458;height:1993;visibility:visible;mso-wrap-style:square;v-text-anchor:top" o:gfxdata="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" fillcolor="white [3212]" strokeweight="1pt">
                     <v:textbox>
                       <w:txbxContent>
                         <w:p>
@@ -14172,7 +17406,7 @@
                       </w:txbxContent>
                     </v:textbox>
                   </v:shape>
-                  <v:roundrect id="Rectángulo: esquinas redondeadas 18" o:spid="_x0000_s1047" style="position:absolute;left:8529;top:20485;width:13102;height:4503;visibility:visible;mso-wrap-style:square;v-text-anchor:middle" arcsize="10923f" o:gfxdata="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" filled="f" strokecolor="#091723 [484]" strokeweight="1.5pt">
+                  <v:roundrect id="Rectángulo: esquinas redondeadas 18" o:spid="_x0000_s1049" style="position:absolute;left:8529;top:20485;width:13102;height:4503;visibility:visible;mso-wrap-style:square;v-text-anchor:middle" arcsize="10923f" o:gfxdata="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" filled="f" strokecolor="#091723 [484]" strokeweight="1.5pt">
                     <v:stroke joinstyle="miter"/>
                     <v:textbox>
                       <w:txbxContent>
@@ -14215,7 +17449,7 @@
                   <v:stroke joinstyle="miter"/>
                   <v:path o:extrusionok="f" gradientshapeok="t" o:connecttype="rect" textboxrect="5400,5400,16200,16200"/>
                 </v:shapetype>
-                <v:shape id="Diagrama de flujo: ordenar 25" o:spid="_x0000_s1048" type="#_x0000_t126" style="position:absolute;left:32853;top:13987;width:4144;height:9771;rotation:90;visibility:visible;mso-wrap-style:square;v-text-anchor:middle" o:gfxdata="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" fillcolor="black [3213]" strokecolor="white [3212]" strokeweight="1pt"/>
+                <v:shape id="Diagrama de flujo: ordenar 25" o:spid="_x0000_s1050" type="#_x0000_t126" style="position:absolute;left:32853;top:13987;width:4144;height:9771;rotation:90;visibility:visible;mso-wrap-style:square;v-text-anchor:middle" o:gfxdata="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" fillcolor="black [3213]" strokecolor="white [3212]" strokeweight="1pt"/>
               </v:group>
             </w:pict>
           </mc:Fallback>
@@ -14244,7 +17478,7 @@
       </w:pPr>
     </w:p>
     <w:sectPr>
-      <w:headerReference w:type="default" r:id="rId22"/>
+      <w:headerReference w:type="default" r:id="rId26"/>
       <w:pgSz w:w="12240" w:h="15840"/>
       <w:pgMar w:top="1417" w:right="1701" w:bottom="1417" w:left="1701" w:header="708" w:footer="708" w:gutter="0"/>
       <w:cols w:space="708"/>
@@ -14292,6 +17526,11 @@
         <w:docPartUnique/>
       </w:docPartObj>
     </w:sdtPr>
+    <w:sdtEndPr>
+      <w:rPr>
+        <w:rStyle w:val="PageNumber"/>
+      </w:rPr>
+    </w:sdtEndPr>
     <w:sdtContent>
       <w:p>
         <w:pPr>
@@ -14350,6 +17589,11 @@
         <w:docPartUnique/>
       </w:docPartObj>
     </w:sdtPr>
+    <w:sdtEndPr>
+      <w:rPr>
+        <w:rStyle w:val="PageNumber"/>
+      </w:rPr>
+    </w:sdtEndPr>
     <w:sdtContent>
       <w:p>
         <w:pPr>
@@ -14490,6 +17734,11 @@
         <w:docPartUnique/>
       </w:docPartObj>
     </w:sdtPr>
+    <w:sdtEndPr>
+      <w:rPr>
+        <w:rStyle w:val="PageNumber"/>
+      </w:rPr>
+    </w:sdtEndPr>
     <w:sdtContent>
       <w:p>
         <w:pPr>
@@ -14621,6 +17870,11 @@
         <w:docPartUnique/>
       </w:docPartObj>
     </w:sdtPr>
+    <w:sdtEndPr>
+      <w:rPr>
+        <w:rStyle w:val="PageNumber"/>
+      </w:rPr>
+    </w:sdtEndPr>
     <w:sdtContent>
       <w:p>
         <w:pPr>
@@ -14736,7 +17990,7 @@
         <w:noProof/>
       </w:rPr>
       <w:drawing>
-        <wp:anchor distT="0" distB="0" distL="114300" distR="114300" simplePos="0" relativeHeight="251661313" behindDoc="0" locked="0" layoutInCell="1" allowOverlap="1" wp14:anchorId="3383C856" wp14:editId="61A94CF4">
+        <wp:anchor distT="0" distB="0" distL="114300" distR="114300" simplePos="0" relativeHeight="251658241" behindDoc="0" locked="0" layoutInCell="1" allowOverlap="1" wp14:anchorId="3383C856" wp14:editId="61A94CF4">
           <wp:simplePos x="0" y="0"/>
           <wp:positionH relativeFrom="column">
             <wp:posOffset>5760581</wp:posOffset>
@@ -14804,7 +18058,7 @@
         <w:noProof/>
       </w:rPr>
       <w:drawing>
-        <wp:anchor distT="0" distB="0" distL="114300" distR="114300" simplePos="0" relativeHeight="251660289" behindDoc="0" locked="0" layoutInCell="1" allowOverlap="1" wp14:anchorId="36FA11F2" wp14:editId="328F3A92">
+        <wp:anchor distT="0" distB="0" distL="114300" distR="114300" simplePos="0" relativeHeight="251658240" behindDoc="0" locked="0" layoutInCell="1" allowOverlap="1" wp14:anchorId="36FA11F2" wp14:editId="328F3A92">
           <wp:simplePos x="0" y="0"/>
           <wp:positionH relativeFrom="column">
             <wp:posOffset>-619203</wp:posOffset>
@@ -18287,6 +21541,7 @@
   <w:style w:type="character" w:default="1" w:styleId="DefaultParagraphFont">
     <w:name w:val="Default Paragraph Font"/>
     <w:uiPriority w:val="1"/>
+    <w:semiHidden/>
     <w:unhideWhenUsed/>
   </w:style>
   <w:style w:type="table" w:default="1" w:styleId="TableNormal">
@@ -19186,6 +22441,17 @@
     <w:unhideWhenUsed/>
     <w:rsid w:val="00F26F27"/>
   </w:style>
+  <w:style w:type="character" w:styleId="Emphasis">
+    <w:name w:val="Emphasis"/>
+    <w:basedOn w:val="DefaultParagraphFont"/>
+    <w:uiPriority w:val="20"/>
+    <w:qFormat/>
+    <w:rsid w:val="00E446F2"/>
+    <w:rPr>
+      <w:i/>
+      <w:iCs/>
+    </w:rPr>
+  </w:style>
 </w:styles>
 </file>
 

</xml_diff>